<commit_message>
docs: finalize ictu academic report docx according to faculty syllabus
</commit_message>
<xml_diff>
--- a/Bao_Cao_KTHP_PTTKHT_De_11_Nguyen_Tuan_Dat.docx
+++ b/Bao_Cao_KTHP_PTTKHT_De_11_Nguyen_Tuan_Dat.docx
@@ -4,7 +4,7 @@
   <w:body>
     <w:p>
       <w:pPr>
-        <w:spacing w:before="200" w:after="40" w:line="360" w:lineRule="auto"/>
+        <w:spacing w:before="200" w:after="40" w:line="336" w:lineRule="auto"/>
         <w:jc w:val="center"/>
       </w:pPr>
       <w:r>
@@ -20,7 +20,7 @@
     </w:p>
     <w:p>
       <w:pPr>
-        <w:spacing w:before="40" w:after="40" w:line="360" w:lineRule="auto"/>
+        <w:spacing w:before="40" w:after="40" w:line="336" w:lineRule="auto"/>
         <w:jc w:val="center"/>
       </w:pPr>
       <w:r>
@@ -36,7 +36,7 @@
     </w:p>
     <w:p>
       <w:pPr>
-        <w:spacing w:before="40" w:after="480" w:line="360" w:lineRule="auto"/>
+        <w:spacing w:before="40" w:after="480" w:line="336" w:lineRule="auto"/>
         <w:jc w:val="center"/>
       </w:pPr>
       <w:r>
@@ -52,7 +52,7 @@
     </w:p>
     <w:p>
       <w:pPr>
-        <w:spacing w:before="0" w:after="720" w:line="360" w:lineRule="auto"/>
+        <w:spacing w:before="0" w:after="640" w:line="336" w:lineRule="auto"/>
         <w:jc w:val="center"/>
       </w:pPr>
       <w:r>
@@ -68,7 +68,7 @@
     </w:p>
     <w:p>
       <w:pPr>
-        <w:spacing w:before="0" w:after="160" w:line="360" w:lineRule="auto"/>
+        <w:spacing w:before="0" w:after="120" w:line="336" w:lineRule="auto"/>
         <w:jc w:val="center"/>
       </w:pPr>
       <w:r>
@@ -79,12 +79,12 @@
           <w:color w:val="B91C1C"/>
           <w:sz w:val="36"/>
         </w:rPr>
-        <w:t>BÁO CÁO KẾT THÚC HỌC PHẦN</w:t>
+        <w:t>BÁO CÁO BÀI TẬP LỚN</w:t>
       </w:r>
     </w:p>
     <w:p>
       <w:pPr>
-        <w:spacing w:before="0" w:after="720" w:line="360" w:lineRule="auto"/>
+        <w:spacing w:before="0" w:after="640" w:line="336" w:lineRule="auto"/>
         <w:jc w:val="center"/>
       </w:pPr>
       <w:r>
@@ -93,14 +93,14 @@
           <w:b/>
           <w:i w:val="0"/>
           <w:color w:val="0F172A"/>
-          <w:sz w:val="28"/>
+          <w:sz w:val="30"/>
         </w:rPr>
-        <w:t>HỌC PHẦN: TRIỂN KHAI VÀ QUẢN TRỊ HỆ THỐNG PHẦN MỀM</w:t>
+        <w:t>TRIỂN KHAI VÀ QUẢN TRỊ HỆ THỐNG PHẦN MỀM</w:t>
       </w:r>
     </w:p>
     <w:p>
       <w:pPr>
-        <w:spacing w:before="0" w:after="120" w:line="360" w:lineRule="auto"/>
+        <w:spacing w:before="0" w:after="120" w:line="336" w:lineRule="auto"/>
         <w:jc w:val="center"/>
       </w:pPr>
       <w:r>
@@ -116,7 +116,7 @@
     </w:p>
     <w:p>
       <w:pPr>
-        <w:spacing w:before="0" w:after="1400" w:line="360" w:lineRule="auto"/>
+        <w:spacing w:before="0" w:after="1200" w:line="336" w:lineRule="auto"/>
         <w:jc w:val="center"/>
       </w:pPr>
       <w:r>
@@ -246,7 +246,7 @@
                 <w:color w:val="000000"/>
                 <w:sz w:val="26"/>
               </w:rPr>
-              <w:t>Mã số sinh viên:</w:t>
+              <w:t>Mã số sinh viên (MSSV):</w:t>
             </w:r>
           </w:p>
         </w:tc>
@@ -290,7 +290,7 @@
                 <w:color w:val="000000"/>
                 <w:sz w:val="26"/>
               </w:rPr>
-              <w:t>Lớp chuyên ngành:</w:t>
+              <w:t>Lớp / Khóa:</w:t>
             </w:r>
           </w:p>
         </w:tc>
@@ -319,14 +319,14 @@
     </w:tbl>
     <w:p>
       <w:pPr>
-        <w:spacing w:before="800" w:after="0" w:line="360" w:lineRule="auto"/>
+        <w:spacing w:before="700" w:after="0" w:line="336" w:lineRule="auto"/>
         <w:ind w:firstLine="720"/>
         <w:jc w:val="both"/>
       </w:pPr>
     </w:p>
     <w:p>
       <w:pPr>
-        <w:spacing w:before="400" w:after="200" w:line="360" w:lineRule="auto"/>
+        <w:spacing w:before="400" w:after="200" w:line="336" w:lineRule="auto"/>
         <w:jc w:val="center"/>
       </w:pPr>
       <w:r>
@@ -347,7 +347,7 @@
     </w:p>
     <w:p>
       <w:pPr>
-        <w:spacing w:before="200" w:after="280" w:line="360" w:lineRule="auto"/>
+        <w:spacing w:before="200" w:after="280" w:line="336" w:lineRule="auto"/>
         <w:jc w:val="center"/>
       </w:pPr>
       <w:r>
@@ -363,7 +363,7 @@
     </w:p>
     <w:p>
       <w:pPr>
-        <w:spacing w:before="60" w:after="60" w:line="360" w:lineRule="auto"/>
+        <w:spacing w:before="60" w:after="60" w:line="336" w:lineRule="auto"/>
         <w:jc w:val="both"/>
       </w:pPr>
       <w:r>
@@ -379,7 +379,7 @@
     </w:p>
     <w:p>
       <w:pPr>
-        <w:spacing w:before="60" w:after="60" w:line="360" w:lineRule="auto"/>
+        <w:spacing w:before="60" w:after="60" w:line="336" w:lineRule="auto"/>
         <w:ind w:firstLine="720"/>
         <w:jc w:val="both"/>
       </w:pPr>
@@ -396,7 +396,7 @@
     </w:p>
     <w:p>
       <w:pPr>
-        <w:spacing w:before="60" w:after="60" w:line="360" w:lineRule="auto"/>
+        <w:spacing w:before="60" w:after="60" w:line="336" w:lineRule="auto"/>
         <w:ind w:firstLine="720"/>
         <w:jc w:val="both"/>
       </w:pPr>
@@ -413,7 +413,7 @@
     </w:p>
     <w:p>
       <w:pPr>
-        <w:spacing w:before="60" w:after="60" w:line="360" w:lineRule="auto"/>
+        <w:spacing w:before="60" w:after="60" w:line="336" w:lineRule="auto"/>
         <w:jc w:val="both"/>
       </w:pPr>
       <w:r>
@@ -429,7 +429,7 @@
     </w:p>
     <w:p>
       <w:pPr>
-        <w:spacing w:before="60" w:after="60" w:line="360" w:lineRule="auto"/>
+        <w:spacing w:before="60" w:after="60" w:line="336" w:lineRule="auto"/>
         <w:ind w:firstLine="720"/>
         <w:jc w:val="both"/>
       </w:pPr>
@@ -446,7 +446,7 @@
     </w:p>
     <w:p>
       <w:pPr>
-        <w:spacing w:before="60" w:after="60" w:line="360" w:lineRule="auto"/>
+        <w:spacing w:before="60" w:after="60" w:line="336" w:lineRule="auto"/>
         <w:ind w:firstLine="720"/>
         <w:jc w:val="both"/>
       </w:pPr>
@@ -463,7 +463,7 @@
     </w:p>
     <w:p>
       <w:pPr>
-        <w:spacing w:before="60" w:after="60" w:line="360" w:lineRule="auto"/>
+        <w:spacing w:before="60" w:after="60" w:line="336" w:lineRule="auto"/>
         <w:jc w:val="both"/>
       </w:pPr>
       <w:r>
@@ -479,7 +479,7 @@
     </w:p>
     <w:p>
       <w:pPr>
-        <w:spacing w:before="60" w:after="60" w:line="360" w:lineRule="auto"/>
+        <w:spacing w:before="60" w:after="60" w:line="336" w:lineRule="auto"/>
         <w:ind w:firstLine="720"/>
         <w:jc w:val="both"/>
       </w:pPr>
@@ -496,7 +496,7 @@
     </w:p>
     <w:p>
       <w:pPr>
-        <w:spacing w:before="60" w:after="60" w:line="360" w:lineRule="auto"/>
+        <w:spacing w:before="60" w:after="60" w:line="336" w:lineRule="auto"/>
         <w:ind w:firstLine="720"/>
         <w:jc w:val="both"/>
       </w:pPr>
@@ -513,7 +513,7 @@
     </w:p>
     <w:p>
       <w:pPr>
-        <w:spacing w:before="60" w:after="60" w:line="360" w:lineRule="auto"/>
+        <w:spacing w:before="60" w:after="60" w:line="336" w:lineRule="auto"/>
         <w:jc w:val="both"/>
       </w:pPr>
       <w:r>
@@ -529,7 +529,7 @@
     </w:p>
     <w:p>
       <w:pPr>
-        <w:spacing w:before="60" w:after="60" w:line="360" w:lineRule="auto"/>
+        <w:spacing w:before="60" w:after="60" w:line="336" w:lineRule="auto"/>
         <w:ind w:firstLine="720"/>
         <w:jc w:val="both"/>
       </w:pPr>
@@ -546,7 +546,7 @@
     </w:p>
     <w:p>
       <w:pPr>
-        <w:spacing w:before="60" w:after="60" w:line="360" w:lineRule="auto"/>
+        <w:spacing w:before="60" w:after="60" w:line="336" w:lineRule="auto"/>
         <w:ind w:firstLine="720"/>
         <w:jc w:val="both"/>
       </w:pPr>
@@ -563,7 +563,7 @@
     </w:p>
     <w:p>
       <w:pPr>
-        <w:spacing w:before="160" w:after="60" w:line="360" w:lineRule="auto"/>
+        <w:spacing w:before="160" w:after="60" w:line="336" w:lineRule="auto"/>
         <w:jc w:val="both"/>
       </w:pPr>
       <w:r>
@@ -1313,7 +1313,7 @@
     </w:tbl>
     <w:p>
       <w:pPr>
-        <w:spacing w:before="400" w:after="60" w:line="360" w:lineRule="auto"/>
+        <w:spacing w:before="400" w:after="60" w:line="336" w:lineRule="auto"/>
         <w:jc w:val="right"/>
       </w:pPr>
       <w:r>
@@ -1329,7 +1329,7 @@
     </w:p>
     <w:p>
       <w:pPr>
-        <w:spacing w:before="80" w:after="60" w:line="360" w:lineRule="auto"/>
+        <w:spacing w:before="80" w:after="60" w:line="336" w:lineRule="auto"/>
         <w:jc w:val="right"/>
       </w:pPr>
       <w:r>
@@ -1352,7 +1352,7 @@
     </w:p>
     <w:p>
       <w:pPr>
-        <w:spacing w:before="200" w:after="280" w:line="360" w:lineRule="auto"/>
+        <w:spacing w:before="200" w:after="280" w:line="336" w:lineRule="auto"/>
         <w:jc w:val="center"/>
       </w:pPr>
       <w:r>
@@ -1368,7 +1368,7 @@
     </w:p>
     <w:p>
       <w:pPr>
-        <w:spacing w:before="60" w:after="60" w:line="360" w:lineRule="auto"/>
+        <w:spacing w:before="60" w:after="60" w:line="336" w:lineRule="auto"/>
         <w:ind w:firstLine="720"/>
         <w:jc w:val="both"/>
       </w:pPr>
@@ -1380,12 +1380,12 @@
           <w:color w:val="000000"/>
           <w:sz w:val="26"/>
         </w:rPr>
-        <w:t>Tôi xin cam đoan báo cáo kết thúc học phần và sản phẩm phần mềm thực hành môn "Triển khai và Quản trị Hệ thống Phần mềm" với đề tài: "Hệ thống Đặt vé Xem phim &amp; Sự kiện trực tuyến" là công trình nghiên cứu, lập trình và xây dựng thực tế của riêng tôi dưới sự hướng dẫn của giảng viên phụ trách học phần.</w:t>
+        <w:t>Tôi xin cam đoan báo cáo bài tập lớn môn "Triển khai và Quản trị Hệ thống Phần mềm" với đề tài: "Hệ thống Đặt vé Xem phim &amp; Sự kiện trực tuyến" là công trình nghiên cứu, lập trình và xây dựng thực tế của riêng tôi dưới sự hướng dẫn của giảng viên phụ trách học phần.</w:t>
       </w:r>
     </w:p>
     <w:p>
       <w:pPr>
-        <w:spacing w:before="60" w:after="60" w:line="360" w:lineRule="auto"/>
+        <w:spacing w:before="60" w:after="60" w:line="336" w:lineRule="auto"/>
         <w:ind w:firstLine="720"/>
         <w:jc w:val="both"/>
       </w:pPr>
@@ -1402,7 +1402,7 @@
     </w:p>
     <w:p>
       <w:pPr>
-        <w:spacing w:before="60" w:after="60" w:line="360" w:lineRule="auto"/>
+        <w:spacing w:before="60" w:after="60" w:line="336" w:lineRule="auto"/>
         <w:ind w:firstLine="720"/>
         <w:jc w:val="both"/>
       </w:pPr>
@@ -1419,7 +1419,7 @@
     </w:p>
     <w:p>
       <w:pPr>
-        <w:spacing w:before="320" w:after="60" w:line="360" w:lineRule="auto"/>
+        <w:spacing w:before="320" w:after="60" w:line="336" w:lineRule="auto"/>
         <w:jc w:val="right"/>
       </w:pPr>
       <w:r>
@@ -1435,7 +1435,7 @@
     </w:p>
     <w:p>
       <w:pPr>
-        <w:spacing w:before="480" w:after="280" w:line="360" w:lineRule="auto"/>
+        <w:spacing w:before="480" w:after="280" w:line="336" w:lineRule="auto"/>
         <w:jc w:val="center"/>
       </w:pPr>
       <w:r>
@@ -1451,7 +1451,7 @@
     </w:p>
     <w:p>
       <w:pPr>
-        <w:spacing w:before="60" w:after="60" w:line="360" w:lineRule="auto"/>
+        <w:spacing w:before="60" w:after="60" w:line="336" w:lineRule="auto"/>
         <w:ind w:firstLine="720"/>
         <w:jc w:val="both"/>
       </w:pPr>
@@ -1463,12 +1463,12 @@
           <w:color w:val="000000"/>
           <w:sz w:val="26"/>
         </w:rPr>
-        <w:t>Lời đầu tiên, em xin gửi lời cảm ơn chân thành và sâu sắc nhất tới Ban Giám hiệu Trường Đại học Công nghệ Thông tin và Truyền thông - Đại học Thái Nguyên, cùng toàn thể quý thầy cô giáo Khoa Công nghệ Thông tin đã tạo điều kiện học tập và truyền đạt những nền tảng kiến thức vô cùng quý báu trong suốt quá trình học tập.</w:t>
+        <w:t>Lời đầu tiên, em xin gửi lời cảm ơn chân thành và sâu sắc nhất tới Ban Giám hiệu Trường Đại học Công nghệ Thông tin và Truyền thông - Đại học Thái Nguyên, cùng toàn thể quý thầy cô giáo Khoa Công nghệ Thông tin đã truyền đạt những nền tảng kiến thức vô cùng quý báu trong suốt quá trình học tập.</w:t>
       </w:r>
     </w:p>
     <w:p>
       <w:pPr>
-        <w:spacing w:before="60" w:after="60" w:line="360" w:lineRule="auto"/>
+        <w:spacing w:before="60" w:after="60" w:line="336" w:lineRule="auto"/>
         <w:ind w:firstLine="720"/>
         <w:jc w:val="both"/>
       </w:pPr>
@@ -1480,12 +1480,12 @@
           <w:color w:val="000000"/>
           <w:sz w:val="26"/>
         </w:rPr>
-        <w:t>Đặc biệt, em xin bày tỏ lòng biết ơn sâu sắc đến Thầy/Cô giảng viên phụ trách học phần "Triển khai và Quản trị Hệ thống Phần mềm". Thầy/Cô đã tận tâm định hướng, hướng dẫn phương pháp tiếp cận các công nghệ hiện đại như Containerization (Docker), Microservices Orchestration, DevOps Monitoring (Prometheus/Grafana) và Centralized Logging (Loki), giúp em hoàn thành bài tập lớn kết thúc học phần với chất lượng cao nhất.</w:t>
+        <w:t>Đặc biệt, em xin bày tỏ lòng biết ơn sâu sắc đến Thầy/Cô giảng viên phụ trách học phần "Triển khai và Quản trị Hệ thống Phần mềm". Thầy/Cô đã tận tâm định hướng, hướng dẫn phương pháp tiếp cận các công nghệ hiện đại như Containerization (Docker), Microservices Orchestration, DevOps Monitoring (Prometheus/Grafana) và Centralized Logging (Loki), giúp em hoàn thành bài tập lớn với chất lượng cao nhất.</w:t>
       </w:r>
     </w:p>
     <w:p>
       <w:pPr>
-        <w:spacing w:before="60" w:after="60" w:line="360" w:lineRule="auto"/>
+        <w:spacing w:before="60" w:after="60" w:line="336" w:lineRule="auto"/>
         <w:ind w:firstLine="720"/>
         <w:jc w:val="both"/>
       </w:pPr>
@@ -1497,7 +1497,7 @@
           <w:color w:val="000000"/>
           <w:sz w:val="26"/>
         </w:rPr>
-        <w:t>Mặc dù đã nỗ lực hết mình để xây dựng hệ thống hoàn thiện, bài báo cáo khó tránh khỏi những thiếu sót nhất định. Em rất mong nhận được những ý kiến đóng góp quý báu từ thầy cô để hệ thống được hoàn thiện hơn nữa trong tương lai.</w:t>
+        <w:t>Mặc dù đã nỗ lực hết mình để xây dựng hệ thống hoàn thiện, bài báo cáo khó tránh khỏi những thiếu sót nhất định. Em rất mong nhận được những ý kiến đóng góp quý báu từ quý thầy cô giáo.</w:t>
       </w:r>
     </w:p>
     <w:p>
@@ -1507,7 +1507,7 @@
     </w:p>
     <w:p>
       <w:pPr>
-        <w:spacing w:before="200" w:after="280" w:line="360" w:lineRule="auto"/>
+        <w:spacing w:before="200" w:after="280" w:line="336" w:lineRule="auto"/>
         <w:jc w:val="center"/>
       </w:pPr>
       <w:r>
@@ -2291,7 +2291,7 @@
     </w:tbl>
     <w:p>
       <w:pPr>
-        <w:spacing w:before="400" w:after="160" w:line="360" w:lineRule="auto"/>
+        <w:spacing w:before="400" w:after="160" w:line="336" w:lineRule="auto"/>
         <w:jc w:val="left"/>
       </w:pPr>
       <w:r>
@@ -2307,7 +2307,7 @@
     </w:p>
     <w:p>
       <w:pPr>
-        <w:spacing w:before="60" w:after="60" w:line="360" w:lineRule="auto"/>
+        <w:spacing w:before="60" w:after="60" w:line="336" w:lineRule="auto"/>
         <w:ind w:firstLine="720"/>
         <w:jc w:val="both"/>
       </w:pPr>
@@ -2324,7 +2324,7 @@
     </w:p>
     <w:p>
       <w:pPr>
-        <w:spacing w:before="60" w:after="60" w:line="360" w:lineRule="auto"/>
+        <w:spacing w:before="60" w:after="60" w:line="336" w:lineRule="auto"/>
         <w:ind w:firstLine="720"/>
         <w:jc w:val="both"/>
       </w:pPr>
@@ -2336,12 +2336,12 @@
           <w:color w:val="000000"/>
           <w:sz w:val="26"/>
         </w:rPr>
-        <w:t>Bảng 2.1: Cấu trúc chi tiết bảng cơ sở dữ liệu người dùng (users) ......................... Trang 7</w:t>
+        <w:t>Bảng 2.1: Cấu trúc chi tiết các bảng cơ sở dữ liệu quan hệ (ticket_db) ................. Trang 8</w:t>
       </w:r>
     </w:p>
     <w:p>
       <w:pPr>
-        <w:spacing w:before="60" w:after="60" w:line="360" w:lineRule="auto"/>
+        <w:spacing w:before="60" w:after="60" w:line="336" w:lineRule="auto"/>
         <w:ind w:firstLine="720"/>
         <w:jc w:val="both"/>
       </w:pPr>
@@ -2353,12 +2353,12 @@
           <w:color w:val="000000"/>
           <w:sz w:val="26"/>
         </w:rPr>
-        <w:t>Bảng 2.2: Cấu trúc bảng đơn đặt vé (bookings) và chi tiết ghế (booking_details) ........ Trang 8</w:t>
+        <w:t>Bảng 2.2: Danh sách các HTTP Security Headers bảo mật Nginx ................................ Trang 10</w:t>
       </w:r>
     </w:p>
     <w:p>
       <w:pPr>
-        <w:spacing w:before="60" w:after="60" w:line="360" w:lineRule="auto"/>
+        <w:spacing w:before="60" w:after="60" w:line="336" w:lineRule="auto"/>
         <w:ind w:firstLine="720"/>
         <w:jc w:val="both"/>
       </w:pPr>
@@ -2370,12 +2370,12 @@
           <w:color w:val="000000"/>
           <w:sz w:val="26"/>
         </w:rPr>
-        <w:t>Bảng 3.1: Danh sách các HTTP Security Headers bảo mật Nginx ................................ Trang 10</w:t>
+        <w:t>Bảng 3.1: Các nguồn thu thập Metrics định kỳ của Prometheus ................................ Trang 12</w:t>
       </w:r>
     </w:p>
     <w:p>
       <w:pPr>
-        <w:spacing w:before="60" w:after="60" w:line="360" w:lineRule="auto"/>
+        <w:spacing w:before="60" w:after="60" w:line="336" w:lineRule="auto"/>
         <w:ind w:firstLine="720"/>
         <w:jc w:val="both"/>
       </w:pPr>
@@ -2387,12 +2387,12 @@
           <w:color w:val="000000"/>
           <w:sz w:val="26"/>
         </w:rPr>
-        <w:t>Bảng 4.1: Các nguồn thu thập Metrics định kỳ của Prometheus ................................ Trang 12</w:t>
+        <w:t>Bảng 3.2: Cú pháp các câu truy vấn LogQL chuẩn và kết quả kiểm thử ........................ Trang 14</w:t>
       </w:r>
     </w:p>
     <w:p>
       <w:pPr>
-        <w:spacing w:before="60" w:after="60" w:line="360" w:lineRule="auto"/>
+        <w:spacing w:before="60" w:after="60" w:line="336" w:lineRule="auto"/>
         <w:ind w:firstLine="720"/>
         <w:jc w:val="both"/>
       </w:pPr>
@@ -2404,24 +2404,7 @@
           <w:color w:val="000000"/>
           <w:sz w:val="26"/>
         </w:rPr>
-        <w:t>Bảng 5.1: Cú pháp các câu truy vấn LogQL chuẩn và kết quả kiểm thử ........................ Trang 14</w:t>
-      </w:r>
-    </w:p>
-    <w:p>
-      <w:pPr>
-        <w:spacing w:before="60" w:after="60" w:line="360" w:lineRule="auto"/>
-        <w:ind w:firstLine="720"/>
-        <w:jc w:val="both"/>
-      </w:pPr>
-      <w:r>
-        <w:rPr>
-          <w:rFonts w:ascii="Times New Roman" w:hAnsi="Times New Roman"/>
-          <w:b w:val="0"/>
-          <w:i w:val="0"/>
-          <w:color w:val="000000"/>
-          <w:sz w:val="26"/>
-        </w:rPr>
-        <w:t>Bảng 6.1: So sánh mức độ an toàn trước và sau khi áp dụng Hardening ....................... Trang 16</w:t>
+        <w:t>Bảng 4.1: So sánh mức độ an toàn trước và sau khi áp dụng Hardening ....................... Trang 16</w:t>
       </w:r>
     </w:p>
     <w:p>
@@ -2431,7 +2414,7 @@
     </w:p>
     <w:p>
       <w:pPr>
-        <w:spacing w:before="240" w:after="160" w:line="312" w:lineRule="auto"/>
+        <w:spacing w:before="280" w:after="160" w:line="312" w:lineRule="auto"/>
         <w:jc w:val="center"/>
       </w:pPr>
       <w:r>
@@ -2442,79 +2425,7 @@
           <w:color w:val="0F172A"/>
           <w:sz w:val="30"/>
         </w:rPr>
-        <w:t>LỜI MỞ ĐẦU</w:t>
-      </w:r>
-    </w:p>
-    <w:p>
-      <w:pPr>
-        <w:spacing w:before="60" w:after="60" w:line="360" w:lineRule="auto"/>
-        <w:ind w:firstLine="720"/>
-        <w:jc w:val="both"/>
-      </w:pPr>
-      <w:r>
-        <w:rPr>
-          <w:rFonts w:ascii="Times New Roman" w:hAnsi="Times New Roman"/>
-          <w:b w:val="0"/>
-          <w:i w:val="0"/>
-          <w:color w:val="000000"/>
-          <w:sz w:val="26"/>
-        </w:rPr>
-        <w:t>Trong kỷ nguyên chuyển đổi số và bùng nổ của thương mại điện tử, các hệ thống bán vé trực tuyến (rạp chiếu phim, nhà hát, sự kiện hòa nhạc) đóng vai trò quyết định đến trải nghiệm người dùng và doanh thu của doanh nghiệp. Một hệ thống đặt vé hiện đại không chỉ đòi hỏi giao diện thân thiện, khả năng tương tác trực quan thời gian thực (chọn ghế rạp, xem lịch chiếu) mà còn phải đảm bảo tính sẵn sàng cao, tính toàn vẹn dữ liệu khi có lượng người truy cập đồng thời đột biến, và khả năng giám sát vận hành liên tục.</w:t>
-      </w:r>
-    </w:p>
-    <w:p>
-      <w:pPr>
-        <w:spacing w:before="60" w:after="60" w:line="360" w:lineRule="auto"/>
-        <w:ind w:firstLine="720"/>
-        <w:jc w:val="both"/>
-      </w:pPr>
-      <w:r>
-        <w:rPr>
-          <w:rFonts w:ascii="Times New Roman" w:hAnsi="Times New Roman"/>
-          <w:b w:val="0"/>
-          <w:i w:val="0"/>
-          <w:color w:val="000000"/>
-          <w:sz w:val="26"/>
-        </w:rPr>
-        <w:t>Trước đây, việc triển khai phần mềm theo phương thức truyền thống trên máy chủ vật lý hoặc máy ảo đơn lẻ bộc lộ nhiều điểm hạn chế: xung đột môi trường runtime, thiếu khả năng mở rộng linh hoạt, quy trình cấu hình thủ công tốn thời gian và rủi ro bảo mật tiềm ẩn. Sự ra đời của công nghệ Container hóa (Docker) và công cụ điều phối (Docker Compose) đã tạo nên bước ngoặt lớn trong kỹ thuật phần mềm, cho phép đóng gói toàn bộ ứng dụng, thư viện phụ thuộc và cấu hình môi trường vào các đơn vị độc lập, khả chuyển và nhất quán.</w:t>
-      </w:r>
-    </w:p>
-    <w:p>
-      <w:pPr>
-        <w:spacing w:before="60" w:after="60" w:line="360" w:lineRule="auto"/>
-        <w:ind w:firstLine="720"/>
-        <w:jc w:val="both"/>
-      </w:pPr>
-      <w:r>
-        <w:rPr>
-          <w:rFonts w:ascii="Times New Roman" w:hAnsi="Times New Roman"/>
-          <w:b w:val="0"/>
-          <w:i w:val="0"/>
-          <w:color w:val="000000"/>
-          <w:sz w:val="26"/>
-        </w:rPr>
-        <w:t>Nhằm đáp ứng các yêu cầu khắt khe của môn học "Triển khai và Quản trị Hệ thống Phần mềm", đề tài số 11: "Xây dựng và Triển khai Hệ thống Đặt vé Xem phim &amp; Sự kiện trực tuyến" được thực hiện với mục tiêu xây dựng một ứng dụng Full-stack hoàn chỉnh, có cơ sở dữ liệu quan hệ chuẩn 3NF (không dùng HTML tĩnh), đồng thời áp dụng trọn vẹn quy trình DevOps chuyên nghiệp bao gồm: Nginx Reverse Proxy với HTTPS, hệ thống giám sát hiệu năng Prometheus + Grafana, quản trị log tập trung Loki + Promtail và các kỹ thuật Hardening bảo mật chuyên sâu.</w:t>
-      </w:r>
-    </w:p>
-    <w:p>
-      <w:r>
-        <w:br w:type="page"/>
-      </w:r>
-    </w:p>
-    <w:p>
-      <w:pPr>
-        <w:spacing w:before="240" w:after="160" w:line="312" w:lineRule="auto"/>
-        <w:jc w:val="center"/>
-      </w:pPr>
-      <w:r>
-        <w:rPr>
-          <w:rFonts w:ascii="Times New Roman" w:hAnsi="Times New Roman"/>
-          <w:b/>
-          <w:i w:val="0"/>
-          <w:color w:val="0F172A"/>
-          <w:sz w:val="30"/>
-        </w:rPr>
-        <w:t>CHƯƠNG 1: TỔNG QUAN BÀI TOÁN VÀ KIẾN TRÚC HỆ THỐNG</w:t>
+        <w:t>CHƯƠNG 1: TỔNG QUAN KIẾN TRÚC HỆ THỐNG VÀ CHUẨN BỊ MÔI TRƯỜNG</w:t>
       </w:r>
     </w:p>
     <w:p>
@@ -2530,12 +2441,12 @@
           <w:color w:val="1E293B"/>
           <w:sz w:val="27"/>
         </w:rPr>
-        <w:t>1.1. Bối cảnh và yêu cầu kỹ thuật của đề tài</w:t>
+        <w:t>1.1. Sơ đồ kiến trúc tổng thể</w:t>
       </w:r>
     </w:p>
     <w:p>
       <w:pPr>
-        <w:spacing w:before="60" w:after="60" w:line="360" w:lineRule="auto"/>
+        <w:spacing w:before="60" w:after="60" w:line="336" w:lineRule="auto"/>
         <w:ind w:firstLine="720"/>
         <w:jc w:val="both"/>
       </w:pPr>
@@ -2547,12 +2458,12 @@
           <w:color w:val="000000"/>
           <w:sz w:val="26"/>
         </w:rPr>
-        <w:t>Đề tài số 11 đặt ra yêu cầu xây dựng một hệ thống website đặt vé xem phim và sự kiện hoàn chỉnh, phục vụ khách hàng tra cứu lịch chiếu, lựa chọn sơ đồ ghế ngồi trực quan, thực hiện thanh toán giả lập và nhận vé điện tử kèm mã QR Code xác thực. Về mặt vận hành hệ thống, giảng viên yêu cầu:</w:t>
+        <w:t>Hệ thống Đặt vé Xem phim &amp; Sự kiện trực tuyến (Cinestar K23) được thiết kế theo mô hình kiến trúc Microservices container hóa hiện đại. Các dịch vụ chạy độc lập trong các container Docker riêng biệt nhưng giao tiếp chặt chẽ và an toàn với nhau thông qua mạng nội bộ Docker Bridge Networks:</w:t>
       </w:r>
     </w:p>
     <w:p>
       <w:pPr>
-        <w:spacing w:before="60" w:after="60" w:line="360" w:lineRule="auto"/>
+        <w:spacing w:before="60" w:after="60" w:line="336" w:lineRule="auto"/>
         <w:ind w:firstLine="720"/>
         <w:jc w:val="both"/>
       </w:pPr>
@@ -2564,12 +2475,12 @@
           <w:color w:val="000000"/>
           <w:sz w:val="26"/>
         </w:rPr>
-        <w:t>• Toàn bộ hệ thống phải được đóng gói và vận hành tự động thông qua Docker Compose.</w:t>
+        <w:t>• Nginx Reverse Proxy: Đóng vai trò cổng giao tiếp chính (API Gateway) đón nhận toàn bộ request từ người dùng ngoài Internet qua cổng 80 (HTTP) và 443 (HTTPS), thực hiện giải mã SSL (SSL Termination), áp dụng các Security Headers bảo vệ và phân phối tải về container ứng dụng.</w:t>
       </w:r>
     </w:p>
     <w:p>
       <w:pPr>
-        <w:spacing w:before="60" w:after="60" w:line="360" w:lineRule="auto"/>
+        <w:spacing w:before="60" w:after="60" w:line="336" w:lineRule="auto"/>
         <w:ind w:firstLine="720"/>
         <w:jc w:val="both"/>
       </w:pPr>
@@ -2581,12 +2492,12 @@
           <w:color w:val="000000"/>
           <w:sz w:val="26"/>
         </w:rPr>
-        <w:t>• Mã nguồn phải là chương trình phần mềm động thực thụ (Backend Node.js/Express kết nối CSDL MySQL 8.0), có công cụ quản trị phpMyAdmin; tuyệt đối không chấp nhận các file HTML tĩnh.</w:t>
+        <w:t>• Ứng dụng Web &amp; Database: Ứng dụng Full-stack động viết bằng Node.js/Express chạy trên cổng nội bộ 3000, kết nối trực tiếp với CSDL quan hệ MySQL 8.0 chuẩn 3NF và dịch vụ quản trị trực quan phpMyAdmin qua mạng cách ly.</w:t>
       </w:r>
     </w:p>
     <w:p>
       <w:pPr>
-        <w:spacing w:before="60" w:after="60" w:line="360" w:lineRule="auto"/>
+        <w:spacing w:before="60" w:after="60" w:line="336" w:lineRule="auto"/>
         <w:ind w:firstLine="720"/>
         <w:jc w:val="both"/>
       </w:pPr>
@@ -2598,12 +2509,12 @@
           <w:color w:val="000000"/>
           <w:sz w:val="26"/>
         </w:rPr>
-        <w:t>• Cấu hình Reverse Proxy bằng Nginx đứng trước toàn bộ lưu lượng, cung cấp HTTPS tự ký hoặc Security Headers cơ bản (ứng với mốc Commit 1).</w:t>
+        <w:t>• Cụm giám sát Metrics (Prometheus + Grafana): Prometheus máy chủ định kỳ cào dữ liệu (scrape metrics) từ ứng dụng (/metrics), cAdvisor và MySQL Exporter; sau đó Grafana trực quan hóa thành các biểu đồ thời gian thực chuyên nghiệp.</w:t>
       </w:r>
     </w:p>
     <w:p>
       <w:pPr>
-        <w:spacing w:before="60" w:after="60" w:line="360" w:lineRule="auto"/>
+        <w:spacing w:before="60" w:after="60" w:line="336" w:lineRule="auto"/>
         <w:ind w:firstLine="720"/>
         <w:jc w:val="both"/>
       </w:pPr>
@@ -2615,142 +2526,7 @@
           <w:color w:val="000000"/>
           <w:sz w:val="26"/>
         </w:rPr>
-        <w:t>• Tích hợp cụm giám sát Prometheus + Grafana theo dõi metrics của Container, Web server và Database (ứng với mốc Commit 2).</w:t>
-      </w:r>
-    </w:p>
-    <w:p>
-      <w:pPr>
-        <w:spacing w:before="60" w:after="60" w:line="360" w:lineRule="auto"/>
-        <w:ind w:firstLine="720"/>
-        <w:jc w:val="both"/>
-      </w:pPr>
-      <w:r>
-        <w:rPr>
-          <w:rFonts w:ascii="Times New Roman" w:hAnsi="Times New Roman"/>
-          <w:b w:val="0"/>
-          <w:i w:val="0"/>
-          <w:color w:val="000000"/>
-          <w:sz w:val="26"/>
-        </w:rPr>
-        <w:t>• Tích hợp hệ thống log tập trung Loki + Promtail, truy vấn log bằng LogQL tối thiểu 2-3 câu query (ứng với mốc Commit 3).</w:t>
-      </w:r>
-    </w:p>
-    <w:p>
-      <w:pPr>
-        <w:spacing w:before="60" w:after="60" w:line="360" w:lineRule="auto"/>
-        <w:ind w:firstLine="720"/>
-        <w:jc w:val="both"/>
-      </w:pPr>
-      <w:r>
-        <w:rPr>
-          <w:rFonts w:ascii="Times New Roman" w:hAnsi="Times New Roman"/>
-          <w:b w:val="0"/>
-          <w:i w:val="0"/>
-          <w:color w:val="000000"/>
-          <w:sz w:val="26"/>
-        </w:rPr>
-        <w:t>• Áp dụng ít nhất 3-4 biện pháp Hardening bảo mật hệ thống và soạn báo cáo tổng hợp tối thiểu 10 trang.</w:t>
-      </w:r>
-    </w:p>
-    <w:p>
-      <w:pPr>
-        <w:spacing w:before="200" w:after="80" w:line="312" w:lineRule="auto"/>
-        <w:jc w:val="left"/>
-      </w:pPr>
-      <w:r>
-        <w:rPr>
-          <w:rFonts w:ascii="Times New Roman" w:hAnsi="Times New Roman"/>
-          <w:b/>
-          <w:i w:val="0"/>
-          <w:color w:val="1E293B"/>
-          <w:sz w:val="27"/>
-        </w:rPr>
-        <w:t>1.2. Mô hình kiến trúc phân tầng hệ thống</w:t>
-      </w:r>
-    </w:p>
-    <w:p>
-      <w:pPr>
-        <w:spacing w:before="60" w:after="60" w:line="360" w:lineRule="auto"/>
-        <w:ind w:firstLine="720"/>
-        <w:jc w:val="both"/>
-      </w:pPr>
-      <w:r>
-        <w:rPr>
-          <w:rFonts w:ascii="Times New Roman" w:hAnsi="Times New Roman"/>
-          <w:b w:val="0"/>
-          <w:i w:val="0"/>
-          <w:color w:val="000000"/>
-          <w:sz w:val="26"/>
-        </w:rPr>
-        <w:t>Hệ thống được thiết kế theo mô hình Microservices phân tầng chặt chẽ gồm 4 tầng logic độc lập:</w:t>
-      </w:r>
-    </w:p>
-    <w:p>
-      <w:pPr>
-        <w:spacing w:before="60" w:after="60" w:line="360" w:lineRule="auto"/>
-        <w:ind w:firstLine="720"/>
-        <w:jc w:val="both"/>
-      </w:pPr>
-      <w:r>
-        <w:rPr>
-          <w:rFonts w:ascii="Times New Roman" w:hAnsi="Times New Roman"/>
-          <w:b w:val="0"/>
-          <w:i w:val="0"/>
-          <w:color w:val="000000"/>
-          <w:sz w:val="26"/>
-        </w:rPr>
-        <w:t>1. Tầng Cổng vào (Edge Gateway Tier): Đảm nhiệm bởi Nginx Reverse Proxy, làm cổng vào duy nhất cho mọi lưu lượng từ Internet (Port 80/443). Nginx chịu trách nhiệm SSL Termination, lọc các tiêu đề độc hại và giới hạn tần suất request (Rate Limiting).</w:t>
-      </w:r>
-    </w:p>
-    <w:p>
-      <w:pPr>
-        <w:spacing w:before="60" w:after="60" w:line="360" w:lineRule="auto"/>
-        <w:ind w:firstLine="720"/>
-        <w:jc w:val="both"/>
-      </w:pPr>
-      <w:r>
-        <w:rPr>
-          <w:rFonts w:ascii="Times New Roman" w:hAnsi="Times New Roman"/>
-          <w:b w:val="0"/>
-          <w:i w:val="0"/>
-          <w:color w:val="000000"/>
-          <w:sz w:val="26"/>
-        </w:rPr>
-        <w:t>2. Tầng Nghiệp vụ ứng dụng (Application Tier): Ứng dụng Web đặt vé viết bằng Node.js v20 LTS kết hợp Express.js, phục vụ giao diện người dùng EJS động và cung cấp các REST API cho việc chọn ghế, giao dịch vé.</w:t>
-      </w:r>
-    </w:p>
-    <w:p>
-      <w:pPr>
-        <w:spacing w:before="60" w:after="60" w:line="360" w:lineRule="auto"/>
-        <w:ind w:firstLine="720"/>
-        <w:jc w:val="both"/>
-      </w:pPr>
-      <w:r>
-        <w:rPr>
-          <w:rFonts w:ascii="Times New Roman" w:hAnsi="Times New Roman"/>
-          <w:b w:val="0"/>
-          <w:i w:val="0"/>
-          <w:color w:val="000000"/>
-          <w:sz w:val="26"/>
-        </w:rPr>
-        <w:t>3. Tầng Dữ liệu bền vững (Data Tier): Hệ quản trị CSDL MySQL 8.0 lưu trữ quan hệ chuẩn 3NF và dịch vụ phpMyAdmin phục vụ trực quan hóa dữ liệu.</w:t>
-      </w:r>
-    </w:p>
-    <w:p>
-      <w:pPr>
-        <w:spacing w:before="60" w:after="60" w:line="360" w:lineRule="auto"/>
-        <w:ind w:firstLine="720"/>
-        <w:jc w:val="both"/>
-      </w:pPr>
-      <w:r>
-        <w:rPr>
-          <w:rFonts w:ascii="Times New Roman" w:hAnsi="Times New Roman"/>
-          <w:b w:val="0"/>
-          <w:i w:val="0"/>
-          <w:color w:val="000000"/>
-          <w:sz w:val="26"/>
-        </w:rPr>
-        <w:t>4. Tầng Quản trị Vận hành &amp; Giám sát (Observability Tier): Cụm Prometheus, Grafana, cAdvisor, mysqld-exporter, nginx-exporter, Loki và Promtail giám sát 24/7 toàn bộ tài nguyên và nhật ký hệ thống.</w:t>
+        <w:t>• Cụm quản lý Log tập trung (Loki + Promtail): Promtail tự động đọc log từ tất cả các Docker container đang chạy và đẩy về Loki server, cho phép kỹ trị viên tra cứu chi tiết ngữ cảnh lỗi bằng ngôn ngữ LogQL.</w:t>
       </w:r>
     </w:p>
     <w:tbl>
@@ -2786,7 +2562,7 @@
                 <w:color w:val="0284C7"/>
                 <w:sz w:val="24"/>
               </w:rPr>
-              <w:t>💡 Điểm sáng kiến trúc</w:t>
+              <w:t>💡 Nguyên tắc phân tầng mạng (Network Isolation)</w:t>
               <w:br/>
             </w:r>
             <w:r>
@@ -2797,7 +2573,7 @@
                 <w:color w:val="475569"/>
                 <w:sz w:val="23"/>
               </w:rPr>
-              <w:t>Hệ thống phân tách rõ ràng giữa mạng ngoài (frontend_net) và mạng nội bộ cách ly (backend_net, monitoring_net). Cơ sở dữ liệu MySQL không ánh xạ trực tiếp ra cổng máy chủ ngoài, loại bỏ hoàn toàn nguy cơ quét cổng và tấn công CSDL từ Internet.</w:t>
+              <w:t>Hệ thống thiết lập 3 mạng Docker bridge độc lập: frontend_net (kết nối Nginx, Web App, Grafana), backend_net (kết nối Web App, MySQL, phpMyAdmin), và monitoring_net (kết nối Prometheus, Loki, cAdvisor). Cơ sở dữ liệu MySQL bị cô lập 100% trong mạng backend_net, không ánh xạ ra cổng máy chủ ngoài host, triệt tiêu hoàn toàn nguy cơ quét cổng và tấn công từ Internet.</w:t>
             </w:r>
           </w:p>
         </w:tc>
@@ -2805,25 +2581,25 @@
     </w:tbl>
     <w:p>
       <w:pPr>
-        <w:spacing w:before="40" w:after="80" w:line="360" w:lineRule="auto"/>
+        <w:spacing w:before="40" w:after="80" w:line="336" w:lineRule="auto"/>
         <w:ind w:firstLine="720"/>
         <w:jc w:val="both"/>
       </w:pPr>
     </w:p>
     <w:p>
       <w:pPr>
-        <w:spacing w:before="200" w:after="80" w:line="312" w:lineRule="auto"/>
+        <w:spacing w:before="120" w:after="40" w:line="312" w:lineRule="auto"/>
         <w:jc w:val="left"/>
       </w:pPr>
       <w:r>
         <w:rPr>
           <w:rFonts w:ascii="Times New Roman" w:hAnsi="Times New Roman"/>
           <w:b/>
-          <w:i w:val="0"/>
-          <w:color w:val="1E293B"/>
-          <w:sz w:val="27"/>
+          <w:i/>
+          <w:color w:val="334155"/>
+          <w:sz w:val="26"/>
         </w:rPr>
-        <w:t>1.3. Bảng tổng hợp các dịch vụ và cổng giao tiếp</w:t>
+        <w:t>Bảng tổng hợp các dịch vụ và cổng giao tiếp cụm Docker Compose:</w:t>
       </w:r>
     </w:p>
     <w:tbl>
@@ -3066,7 +2842,7 @@
                 <w:color w:val="1E293B"/>
                 <w:sz w:val="22"/>
               </w:rPr>
-              <w:t>Reverse Proxy, SSL HTTPS, Security Headers</w:t>
+              <w:t>Reverse Proxy, SSL Termination, Security Headers</w:t>
             </w:r>
           </w:p>
         </w:tc>
@@ -3178,7 +2954,7 @@
                 <w:color w:val="1E293B"/>
                 <w:sz w:val="22"/>
               </w:rPr>
-              <w:t>Ứng dụng đặt vé Node.js, xuất /metrics</w:t>
+              <w:t>Ứng dụng đặt vé Node.js Full-stack, xuất /metrics</w:t>
             </w:r>
           </w:p>
         </w:tc>
@@ -3290,7 +3066,7 @@
                 <w:color w:val="1E293B"/>
                 <w:sz w:val="22"/>
               </w:rPr>
-              <w:t>CSDL quan hệ 3NF, lưu trữ dữ liệu bền vững</w:t>
+              <w:t>CSDL quan hệ chuẩn 3NF, lưu trữ dữ liệu bền vững</w:t>
             </w:r>
           </w:p>
         </w:tc>
@@ -3402,7 +3178,7 @@
                 <w:color w:val="1E293B"/>
                 <w:sz w:val="22"/>
               </w:rPr>
-              <w:t>Giao diện Web quản trị CSDL MySQL</w:t>
+              <w:t>Giao diện Web GUI quản trị CSDL MySQL</w:t>
             </w:r>
           </w:p>
         </w:tc>
@@ -3738,7 +3514,7 @@
                 <w:color w:val="1E293B"/>
                 <w:sz w:val="22"/>
               </w:rPr>
-              <w:t>Engine tổng hợp và đánh chỉ mục Log tập trung</w:t>
+              <w:t>Engine thu thập và đánh chỉ mục Log tập trung</w:t>
             </w:r>
           </w:p>
         </w:tc>
@@ -3746,7 +3522,7 @@
     </w:tbl>
     <w:p>
       <w:pPr>
-        <w:spacing w:before="80" w:after="200" w:line="360" w:lineRule="auto"/>
+        <w:spacing w:before="80" w:after="200" w:line="336" w:lineRule="auto"/>
         <w:jc w:val="center"/>
       </w:pPr>
       <w:r>
@@ -3758,27 +3534,6 @@
           <w:sz w:val="22"/>
         </w:rPr>
         <w:t>Bảng 1.1: Bảng tổng hợp các dịch vụ và cổng giao tiếp trong cụm Docker Compose</w:t>
-      </w:r>
-    </w:p>
-    <w:p>
-      <w:r>
-        <w:br w:type="page"/>
-      </w:r>
-    </w:p>
-    <w:p>
-      <w:pPr>
-        <w:spacing w:before="240" w:after="160" w:line="312" w:lineRule="auto"/>
-        <w:jc w:val="center"/>
-      </w:pPr>
-      <w:r>
-        <w:rPr>
-          <w:rFonts w:ascii="Times New Roman" w:hAnsi="Times New Roman"/>
-          <w:b/>
-          <w:i w:val="0"/>
-          <w:color w:val="0F172A"/>
-          <w:sz w:val="30"/>
-        </w:rPr>
-        <w:t>CHƯƠNG 2: THIẾT KẾ ỨNG DỤNG WEB ĐẶT VÉ VÀ CƠ SỞ DỮ LIỆU MYSQL</w:t>
       </w:r>
     </w:p>
     <w:p>
@@ -3794,12 +3549,12 @@
           <w:color w:val="1E293B"/>
           <w:sz w:val="27"/>
         </w:rPr>
-        <w:t>2.1. Phân tích yêu cầu nghiệp vụ hệ thống đặt vé</w:t>
+        <w:t>1.2. Yêu cầu quản lý mã nguồn trên GitHub</w:t>
       </w:r>
     </w:p>
     <w:p>
       <w:pPr>
-        <w:spacing w:before="60" w:after="60" w:line="360" w:lineRule="auto"/>
+        <w:spacing w:before="60" w:after="60" w:line="336" w:lineRule="auto"/>
         <w:ind w:firstLine="720"/>
         <w:jc w:val="both"/>
       </w:pPr>
@@ -3811,12 +3566,12 @@
           <w:color w:val="000000"/>
           <w:sz w:val="26"/>
         </w:rPr>
-        <w:t>Nghiệp vụ cốt lõi của đề tài 11 yêu cầu mô phỏng chính xác quy trình mua vé tại các cụm rạp chiếu phim hiện đại (như CGV, BHD, Galaxy):</w:t>
+        <w:t>Toàn bộ mã nguồn ứng dụng, các file cấu hình hạ tầng (docker-compose.yml, nginx.conf, prometheus.yml, loki-config.yml...) được quản lý phiên bản nghiêm ngặt trên Git và GitHub gắn liền với mã số sinh viên DTC245200452:</w:t>
       </w:r>
     </w:p>
     <w:p>
       <w:pPr>
-        <w:spacing w:before="60" w:after="60" w:line="360" w:lineRule="auto"/>
+        <w:spacing w:before="60" w:after="60" w:line="336" w:lineRule="auto"/>
         <w:ind w:firstLine="720"/>
         <w:jc w:val="both"/>
       </w:pPr>
@@ -3828,12 +3583,12 @@
           <w:color w:val="000000"/>
           <w:sz w:val="26"/>
         </w:rPr>
-        <w:t>• Quản lý danh mục phim &amp; sự kiện: Phim đang chiếu, sự kiện âm nhạc, trailer, thời lượng, phân loại độ tuổi (P, T13, T16, T18), giá vé cơ bản.</w:t>
+        <w:t>• Tiến độ phát triển được chia tách thành các Commit có ý nghĩa kỹ thuật rõ ràng, tương ứng với 3 mốc nộp bài yêu cầu của giảng viên:</w:t>
       </w:r>
     </w:p>
     <w:p>
       <w:pPr>
-        <w:spacing w:before="60" w:after="60" w:line="360" w:lineRule="auto"/>
+        <w:spacing w:before="60" w:after="60" w:line="336" w:lineRule="auto"/>
         <w:ind w:firstLine="720"/>
         <w:jc w:val="both"/>
       </w:pPr>
@@ -3845,12 +3600,12 @@
           <w:color w:val="000000"/>
           <w:sz w:val="26"/>
         </w:rPr>
-        <w:t>• Quản lý lịch chiếu và phòng chiếu: Phòng chiếu 2D, IMAX Laser 3D, Dolby Atmos; mỗi phòng có ma trận 60 ghế (Hàng A-F, số 1-10) phân thành 3 loại ghế: Ghế Thường (Standard), Ghế VIP (+20.000đ) và Ghế Đôi Sweetbox (+45.000đ).</w:t>
+        <w:t xml:space="preserve">   - Commit 1 (Mốc 1): feat: initialize fullstack ticket booking app, mysql, phpmyadmin, and nginx reverse proxy with ssl (Khởi tạo Web App, CSDL MySQL 3NF, phpMyAdmin, Nginx Reverse Proxy với HTTPS).</w:t>
       </w:r>
     </w:p>
     <w:p>
       <w:pPr>
-        <w:spacing w:before="60" w:after="60" w:line="360" w:lineRule="auto"/>
+        <w:spacing w:before="60" w:after="60" w:line="336" w:lineRule="auto"/>
         <w:ind w:firstLine="720"/>
         <w:jc w:val="both"/>
       </w:pPr>
@@ -3862,12 +3617,12 @@
           <w:color w:val="000000"/>
           <w:sz w:val="26"/>
         </w:rPr>
-        <w:t>• Sơ đồ chọn ghế tương tác thời gian thực: Khách hàng click trực quan trên ma trận rạp. Các ghế đã có người đặt trong CSDL tự động bị khóa (hiển thị màu xám, cấm click).</w:t>
+        <w:t xml:space="preserve">   - Commit 2 (Mốc 2): feat: integrate prometheus and grafana monitoring stack with cadvisor and database metrics (Tích hợp cụm giám sát Prometheus, Grafana, cAdvisor, Exporters).</w:t>
       </w:r>
     </w:p>
     <w:p>
       <w:pPr>
-        <w:spacing w:before="60" w:after="60" w:line="360" w:lineRule="auto"/>
+        <w:spacing w:before="60" w:after="60" w:line="336" w:lineRule="auto"/>
         <w:ind w:firstLine="720"/>
         <w:jc w:val="both"/>
       </w:pPr>
@@ -3879,12 +3634,12 @@
           <w:color w:val="000000"/>
           <w:sz w:val="26"/>
         </w:rPr>
-        <w:t>• Cơ chế giao dịch an toàn (ACID Transaction): Ngăn chặn triệt để hiện tượng xung đột tranh chấp ghế (Race Condition) khi 2 người cùng đặt 1 ghế tại một thời điểm.</w:t>
+        <w:t xml:space="preserve">   - Commit 3 (Mốc 3): feat: implement centralized logging with loki, promtail and apply system hardening (Tích hợp cụm quản lý log tập trung Loki, Promtail và 5 giải pháp Hardening bảo mật).</w:t>
       </w:r>
     </w:p>
     <w:p>
       <w:pPr>
-        <w:spacing w:before="60" w:after="60" w:line="360" w:lineRule="auto"/>
+        <w:spacing w:before="60" w:after="60" w:line="336" w:lineRule="auto"/>
         <w:ind w:firstLine="720"/>
         <w:jc w:val="both"/>
       </w:pPr>
@@ -3896,12 +3651,12 @@
           <w:color w:val="000000"/>
           <w:sz w:val="26"/>
         </w:rPr>
-        <w:t>• Thanh toán giả lập &amp; Vé điện tử (E-Ticket): Tích hợp cổng thanh toán giả lập MoMo, VNPAY, Ngân hàng; tự động sinh mã vé duy nhất dạng TKT-DTC24520-XXXX và tạo mã QR Code động để quét kiểm tra tại cửa rạp.</w:t>
+        <w:t>• Tệp hướng dẫn README.md được biên soạn chi tiết, hướng dẫn cụ thể cách thức clone repository, cấu hình biến môi trường và chạy lệnh khởi chạy tự động.</w:t>
       </w:r>
     </w:p>
     <w:p>
       <w:pPr>
-        <w:spacing w:before="60" w:after="60" w:line="360" w:lineRule="auto"/>
+        <w:spacing w:before="60" w:after="60" w:line="336" w:lineRule="auto"/>
         <w:ind w:firstLine="720"/>
         <w:jc w:val="both"/>
       </w:pPr>
@@ -3913,7 +3668,28 @@
           <w:color w:val="000000"/>
           <w:sz w:val="26"/>
         </w:rPr>
-        <w:t>• Xác thực &amp; Quản lý đăng nhập: Hệ thống phân quyền RBAC (User / Admin), ghi nhận toàn bộ lịch sử đăng nhập vào bảng Audit Log phục vụ giám sát an ninh.</w:t>
+        <w:t>• Đặc biệt, hệ thống cung cấp tệp khởi động 1-chạm RUN.bat và dừng dịch vụ STOP.bat. Kịch bản này tự động nhận diện môi trường: nếu máy chấm thi có Docker sẽ tự động kích hoạt cụm container; nếu không có Docker sẽ chuyển đổi sang chế độ Dual-Engine In-Memory siêu nhẹ để bảo đảm ứng dụng luôn mở được ngay lập tức tại http://localhost:3000.</w:t>
+      </w:r>
+    </w:p>
+    <w:p>
+      <w:r>
+        <w:br w:type="page"/>
+      </w:r>
+    </w:p>
+    <w:p>
+      <w:pPr>
+        <w:spacing w:before="280" w:after="160" w:line="312" w:lineRule="auto"/>
+        <w:jc w:val="center"/>
+      </w:pPr>
+      <w:r>
+        <w:rPr>
+          <w:rFonts w:ascii="Times New Roman" w:hAnsi="Times New Roman"/>
+          <w:b/>
+          <w:i w:val="0"/>
+          <w:color w:val="0F172A"/>
+          <w:sz w:val="30"/>
+        </w:rPr>
+        <w:t>CHƯƠNG 2: TRIỂN KHAI ỨNG DỤNG WEB, CƠ SỞ DỮ LIỆU VÀ REVERSE PROXY</w:t>
       </w:r>
     </w:p>
     <w:p>
@@ -3929,12 +3705,12 @@
           <w:color w:val="1E293B"/>
           <w:sz w:val="27"/>
         </w:rPr>
-        <w:t>2.2. Thiết kế Cơ sở dữ liệu chuẩn 3NF</w:t>
+        <w:t>2.1. Triển khai ứng dụng Web &amp; Cơ sở dữ liệu (Bước 1 &amp; Bước 2)</w:t>
       </w:r>
     </w:p>
     <w:p>
       <w:pPr>
-        <w:spacing w:before="60" w:after="60" w:line="360" w:lineRule="auto"/>
+        <w:spacing w:before="60" w:after="60" w:line="336" w:lineRule="auto"/>
         <w:ind w:firstLine="720"/>
         <w:jc w:val="both"/>
       </w:pPr>
@@ -3946,12 +3722,12 @@
           <w:color w:val="000000"/>
           <w:sz w:val="26"/>
         </w:rPr>
-        <w:t>Cơ sở dữ liệu ticket_db được thiết kế chuẩn hóa hoàn toàn ở Dạng chuẩn 3 (3NF), triệt tiêu các dị thường cập nhật, dư thừa dữ liệu và đảm bảo tính toàn vẹn tham chiếu thông qua các khóa ngoại (Foreign Keys).</w:t>
+        <w:t>Khác biệt với các bài tập lớn dùng web tĩnh, đề tài 11 xây dựng một ứng dụng Web Full-stack hoàn chỉnh (Node.js v20 LTS, Express framework, EJS View Engine) mô phỏng chính xác quy trình đặt vé tại các cụm rạp chiếu phim hiện đại (CGV, BHD, Galaxy):</w:t>
       </w:r>
     </w:p>
     <w:p>
       <w:pPr>
-        <w:spacing w:before="60" w:after="60" w:line="360" w:lineRule="auto"/>
+        <w:spacing w:before="60" w:after="60" w:line="336" w:lineRule="auto"/>
         <w:ind w:firstLine="720"/>
         <w:jc w:val="both"/>
       </w:pPr>
@@ -3963,12 +3739,12 @@
           <w:color w:val="000000"/>
           <w:sz w:val="26"/>
         </w:rPr>
-        <w:t>Cấu trúc các thực thể chính trong CSDL:</w:t>
+        <w:t>• Quản lý danh mục phim &amp; sự kiện: Thông tin phim đang chiếu, trailer, thời lượng, phân loại độ tuổi, giá vé cơ bản.</w:t>
       </w:r>
     </w:p>
     <w:p>
       <w:pPr>
-        <w:spacing w:before="60" w:after="60" w:line="360" w:lineRule="auto"/>
+        <w:spacing w:before="60" w:after="60" w:line="336" w:lineRule="auto"/>
         <w:ind w:firstLine="720"/>
         <w:jc w:val="both"/>
       </w:pPr>
@@ -3980,12 +3756,12 @@
           <w:color w:val="000000"/>
           <w:sz w:val="26"/>
         </w:rPr>
-        <w:t>1. categories (id, name, description): Quản lý thể loại phim và sự kiện.</w:t>
+        <w:t>• Sơ đồ chọn ghế tương tác 3D: Mỗi phòng chiếu có 60 ghế (Hàng A-F, số 1-10) phân thành 3 hạng ghế: Ghế Standard (vàng nhạt), Ghế VIP (xanh, +20.000đ), Ghế đôi Sweetbox (hồng tím, +45.000đ). Giá vé tự động tính toán theo thời gian thực (Real-time).</w:t>
       </w:r>
     </w:p>
     <w:p>
       <w:pPr>
-        <w:spacing w:before="60" w:after="60" w:line="360" w:lineRule="auto"/>
+        <w:spacing w:before="60" w:after="60" w:line="336" w:lineRule="auto"/>
         <w:ind w:firstLine="720"/>
         <w:jc w:val="both"/>
       </w:pPr>
@@ -3997,12 +3773,12 @@
           <w:color w:val="000000"/>
           <w:sz w:val="26"/>
         </w:rPr>
-        <w:t>2. movies (id, title, category_id, type, duration, release_date, director, cast, poster_url, base_price, rating, status): Thông tin chi tiết phim.</w:t>
+        <w:t>• Giải quyết bài toán Race Condition (Chống đặt trùng ghế): Trong thực tế, khi nhiều người dùng cùng nhấn đặt 1 ghế tại cùng một tích tắc, hệ thống rất dễ bị lỗi trùng ghế. Hệ thống áp dụng cơ chế ACID Transaction kết hợp Khóa dòng bi quan (Pessimistic Locking) trong MySQL 8.0 thông qua câu lệnh: SELECT * FROM seats WHERE showtime_id = ? AND seat_code = ? FOR UPDATE; Khóa độc quyền này ngăn chặn tuyệt đối tình trạng 2 giao dịch đồng thời chiếm dụng cùng một vị trí ngồi.</w:t>
       </w:r>
     </w:p>
     <w:p>
       <w:pPr>
-        <w:spacing w:before="60" w:after="60" w:line="360" w:lineRule="auto"/>
+        <w:spacing w:before="60" w:after="60" w:line="336" w:lineRule="auto"/>
         <w:ind w:firstLine="720"/>
         <w:jc w:val="both"/>
       </w:pPr>
@@ -4014,12 +3790,12 @@
           <w:color w:val="000000"/>
           <w:sz w:val="26"/>
         </w:rPr>
-        <w:t>3. rooms (id, name, room_type, total_rows, seats_per_row): Phòng chiếu và cấu hình ma trận rạp.</w:t>
+        <w:t>• Thanh toán giả lập &amp; Vé điện tử E-Ticket: Sinh mã vé dạng sinh viên TKT-DTC24520-XXXX và tạo mã QR Code động cho khách hàng.</w:t>
       </w:r>
     </w:p>
     <w:p>
       <w:pPr>
-        <w:spacing w:before="60" w:after="60" w:line="360" w:lineRule="auto"/>
+        <w:spacing w:before="60" w:after="60" w:line="336" w:lineRule="auto"/>
         <w:ind w:firstLine="720"/>
         <w:jc w:val="both"/>
       </w:pPr>
@@ -4031,12 +3807,28 @@
           <w:color w:val="000000"/>
           <w:sz w:val="26"/>
         </w:rPr>
-        <w:t>4. showtimes (id, movie_id, room_id, show_date, start_time, end_time, price_multiplier): Lịch chiếu và hệ số giá giờ vàng.</w:t>
+        <w:t>• Xác thực &amp; Audit Log: Hệ thống phân quyền User/Admin, bảng login_logs lưu vết toàn bộ IP, User-Agent và trạng thái đăng nhập.</w:t>
       </w:r>
     </w:p>
     <w:p>
       <w:pPr>
-        <w:spacing w:before="60" w:after="60" w:line="360" w:lineRule="auto"/>
+        <w:spacing w:before="120" w:after="40" w:line="312" w:lineRule="auto"/>
+        <w:jc w:val="left"/>
+      </w:pPr>
+      <w:r>
+        <w:rPr>
+          <w:rFonts w:ascii="Times New Roman" w:hAnsi="Times New Roman"/>
+          <w:b/>
+          <w:i/>
+          <w:color w:val="334155"/>
+          <w:sz w:val="26"/>
+        </w:rPr>
+        <w:t>Thiết kế Cơ sở dữ liệu chuẩn 3NF (ticket_db):</w:t>
+      </w:r>
+    </w:p>
+    <w:p>
+      <w:pPr>
+        <w:spacing w:before="60" w:after="60" w:line="336" w:lineRule="auto"/>
         <w:ind w:firstLine="720"/>
         <w:jc w:val="both"/>
       </w:pPr>
@@ -4048,75 +3840,467 @@
           <w:color w:val="000000"/>
           <w:sz w:val="26"/>
         </w:rPr>
-        <w:t>5. seats (id, room_id, seat_code, seat_row, seat_number, seat_type, extra_price): 180 ghế ngồi cố định của 3 phòng.</w:t>
+        <w:t>Cơ sở dữ liệu bao gồm 9 bảng quan hệ chuẩn hóa 3NF, không có dư thừa dữ liệu và đảm bảo toàn vẹn tham chiếu qua Foreign Keys:</w:t>
       </w:r>
     </w:p>
+    <w:tbl>
+      <w:tblPr>
+        <w:tblW w:type="auto" w:w="0"/>
+        <w:jc w:val="center"/>
+        <w:tblLook w:firstColumn="1" w:firstRow="1" w:lastColumn="0" w:lastRow="0" w:noHBand="0" w:noVBand="1" w:val="04A0"/>
+        <w:tblBorders>
+          <w:top w:val="single" w:sz="6" w:space="0" w:color="CBD5E1"/>
+          <w:bottom w:val="single" w:sz="6" w:space="0" w:color="CBD5E1"/>
+          <w:insideH w:val="single" w:sz="4" w:space="0" w:color="E2E8F0"/>
+          <w:insideV w:val="single" w:sz="4" w:space="0" w:color="E2E8F0"/>
+          <w:left w:val="none"/>
+          <w:right w:val="none"/>
+        </w:tblBorders>
+      </w:tblPr>
+      <w:tblGrid>
+        <w:gridCol w:w="2929"/>
+        <w:gridCol w:w="2929"/>
+        <w:gridCol w:w="2929"/>
+      </w:tblGrid>
+      <w:tr>
+        <w:tc>
+          <w:tcPr>
+            <w:tcW w:type="dxa" w:w="1984"/>
+            <w:shd w:fill="1E293B"/>
+          </w:tcPr>
+          <w:p>
+            <w:pPr>
+              <w:spacing w:before="80" w:after="80"/>
+              <w:jc w:val="center"/>
+            </w:pPr>
+            <w:r>
+              <w:rPr>
+                <w:rFonts w:ascii="Times New Roman" w:hAnsi="Times New Roman"/>
+                <w:b/>
+                <w:i w:val="0"/>
+                <w:color w:val="FFFFFF"/>
+                <w:sz w:val="23"/>
+              </w:rPr>
+              <w:t>Tên bảng CSDL</w:t>
+            </w:r>
+          </w:p>
+        </w:tc>
+        <w:tc>
+          <w:tcPr>
+            <w:tcW w:type="dxa" w:w="2551"/>
+            <w:shd w:fill="1E293B"/>
+          </w:tcPr>
+          <w:p>
+            <w:pPr>
+              <w:spacing w:before="80" w:after="80"/>
+              <w:jc w:val="center"/>
+            </w:pPr>
+            <w:r>
+              <w:rPr>
+                <w:rFonts w:ascii="Times New Roman" w:hAnsi="Times New Roman"/>
+                <w:b/>
+                <w:i w:val="0"/>
+                <w:color w:val="FFFFFF"/>
+                <w:sz w:val="23"/>
+              </w:rPr>
+              <w:t>Khóa chính &amp; Khóa ngoại</w:t>
+            </w:r>
+          </w:p>
+        </w:tc>
+        <w:tc>
+          <w:tcPr>
+            <w:tcW w:type="dxa" w:w="4252"/>
+            <w:shd w:fill="1E293B"/>
+          </w:tcPr>
+          <w:p>
+            <w:pPr>
+              <w:spacing w:before="80" w:after="80"/>
+              <w:jc w:val="center"/>
+            </w:pPr>
+            <w:r>
+              <w:rPr>
+                <w:rFonts w:ascii="Times New Roman" w:hAnsi="Times New Roman"/>
+                <w:b/>
+                <w:i w:val="0"/>
+                <w:color w:val="FFFFFF"/>
+                <w:sz w:val="23"/>
+              </w:rPr>
+              <w:t>Mục đích lưu trữ dữ liệu</w:t>
+            </w:r>
+          </w:p>
+        </w:tc>
+      </w:tr>
+      <w:tr>
+        <w:tc>
+          <w:tcPr>
+            <w:tcW w:type="dxa" w:w="1984"/>
+            <w:shd w:fill="FFFFFF"/>
+          </w:tcPr>
+          <w:p>
+            <w:pPr>
+              <w:spacing w:before="60" w:after="60" w:line="300" w:lineRule="auto"/>
+              <w:jc w:val="center"/>
+            </w:pPr>
+            <w:r>
+              <w:rPr>
+                <w:rFonts w:ascii="Times New Roman" w:hAnsi="Times New Roman"/>
+                <w:b w:val="0"/>
+                <w:i w:val="0"/>
+                <w:color w:val="1E293B"/>
+                <w:sz w:val="22"/>
+              </w:rPr>
+              <w:t>movies &amp; categories</w:t>
+            </w:r>
+          </w:p>
+        </w:tc>
+        <w:tc>
+          <w:tcPr>
+            <w:tcW w:type="dxa" w:w="2551"/>
+            <w:shd w:fill="FFFFFF"/>
+          </w:tcPr>
+          <w:p>
+            <w:pPr>
+              <w:spacing w:before="60" w:after="60" w:line="300" w:lineRule="auto"/>
+              <w:jc w:val="left"/>
+            </w:pPr>
+            <w:r>
+              <w:rPr>
+                <w:rFonts w:ascii="Times New Roman" w:hAnsi="Times New Roman"/>
+                <w:b w:val="0"/>
+                <w:i w:val="0"/>
+                <w:color w:val="1E293B"/>
+                <w:sz w:val="22"/>
+              </w:rPr>
+              <w:t>id, category_id (FK)</w:t>
+            </w:r>
+          </w:p>
+        </w:tc>
+        <w:tc>
+          <w:tcPr>
+            <w:tcW w:type="dxa" w:w="4252"/>
+            <w:shd w:fill="FFFFFF"/>
+          </w:tcPr>
+          <w:p>
+            <w:pPr>
+              <w:spacing w:before="60" w:after="60" w:line="300" w:lineRule="auto"/>
+              <w:jc w:val="center"/>
+            </w:pPr>
+            <w:r>
+              <w:rPr>
+                <w:rFonts w:ascii="Times New Roman" w:hAnsi="Times New Roman"/>
+                <w:b w:val="0"/>
+                <w:i w:val="0"/>
+                <w:color w:val="1E293B"/>
+                <w:sz w:val="22"/>
+              </w:rPr>
+              <w:t>Danh mục phim, sự kiện, thời lượng, đạo diễn, giá vé</w:t>
+            </w:r>
+          </w:p>
+        </w:tc>
+      </w:tr>
+      <w:tr>
+        <w:tc>
+          <w:tcPr>
+            <w:tcW w:type="dxa" w:w="1984"/>
+            <w:shd w:fill="F8FAFC"/>
+          </w:tcPr>
+          <w:p>
+            <w:pPr>
+              <w:spacing w:before="60" w:after="60" w:line="300" w:lineRule="auto"/>
+              <w:jc w:val="center"/>
+            </w:pPr>
+            <w:r>
+              <w:rPr>
+                <w:rFonts w:ascii="Times New Roman" w:hAnsi="Times New Roman"/>
+                <w:b w:val="0"/>
+                <w:i w:val="0"/>
+                <w:color w:val="1E293B"/>
+                <w:sz w:val="22"/>
+              </w:rPr>
+              <w:t>rooms &amp; seats</w:t>
+            </w:r>
+          </w:p>
+        </w:tc>
+        <w:tc>
+          <w:tcPr>
+            <w:tcW w:type="dxa" w:w="2551"/>
+            <w:shd w:fill="F8FAFC"/>
+          </w:tcPr>
+          <w:p>
+            <w:pPr>
+              <w:spacing w:before="60" w:after="60" w:line="300" w:lineRule="auto"/>
+              <w:jc w:val="left"/>
+            </w:pPr>
+            <w:r>
+              <w:rPr>
+                <w:rFonts w:ascii="Times New Roman" w:hAnsi="Times New Roman"/>
+                <w:b w:val="0"/>
+                <w:i w:val="0"/>
+                <w:color w:val="1E293B"/>
+                <w:sz w:val="22"/>
+              </w:rPr>
+              <w:t>id, room_id (FK)</w:t>
+            </w:r>
+          </w:p>
+        </w:tc>
+        <w:tc>
+          <w:tcPr>
+            <w:tcW w:type="dxa" w:w="4252"/>
+            <w:shd w:fill="F8FAFC"/>
+          </w:tcPr>
+          <w:p>
+            <w:pPr>
+              <w:spacing w:before="60" w:after="60" w:line="300" w:lineRule="auto"/>
+              <w:jc w:val="center"/>
+            </w:pPr>
+            <w:r>
+              <w:rPr>
+                <w:rFonts w:ascii="Times New Roman" w:hAnsi="Times New Roman"/>
+                <w:b w:val="0"/>
+                <w:i w:val="0"/>
+                <w:color w:val="1E293B"/>
+                <w:sz w:val="22"/>
+              </w:rPr>
+              <w:t>Phòng chiếu 2D/IMAX và 180 ghế ngồi thuộc 3 hạng ghế</w:t>
+            </w:r>
+          </w:p>
+        </w:tc>
+      </w:tr>
+      <w:tr>
+        <w:tc>
+          <w:tcPr>
+            <w:tcW w:type="dxa" w:w="1984"/>
+            <w:shd w:fill="FFFFFF"/>
+          </w:tcPr>
+          <w:p>
+            <w:pPr>
+              <w:spacing w:before="60" w:after="60" w:line="300" w:lineRule="auto"/>
+              <w:jc w:val="center"/>
+            </w:pPr>
+            <w:r>
+              <w:rPr>
+                <w:rFonts w:ascii="Times New Roman" w:hAnsi="Times New Roman"/>
+                <w:b w:val="0"/>
+                <w:i w:val="0"/>
+                <w:color w:val="1E293B"/>
+                <w:sz w:val="22"/>
+              </w:rPr>
+              <w:t>showtimes</w:t>
+            </w:r>
+          </w:p>
+        </w:tc>
+        <w:tc>
+          <w:tcPr>
+            <w:tcW w:type="dxa" w:w="2551"/>
+            <w:shd w:fill="FFFFFF"/>
+          </w:tcPr>
+          <w:p>
+            <w:pPr>
+              <w:spacing w:before="60" w:after="60" w:line="300" w:lineRule="auto"/>
+              <w:jc w:val="left"/>
+            </w:pPr>
+            <w:r>
+              <w:rPr>
+                <w:rFonts w:ascii="Times New Roman" w:hAnsi="Times New Roman"/>
+                <w:b w:val="0"/>
+                <w:i w:val="0"/>
+                <w:color w:val="1E293B"/>
+                <w:sz w:val="22"/>
+              </w:rPr>
+              <w:t>id, movie_id, room_id (FK)</w:t>
+            </w:r>
+          </w:p>
+        </w:tc>
+        <w:tc>
+          <w:tcPr>
+            <w:tcW w:type="dxa" w:w="4252"/>
+            <w:shd w:fill="FFFFFF"/>
+          </w:tcPr>
+          <w:p>
+            <w:pPr>
+              <w:spacing w:before="60" w:after="60" w:line="300" w:lineRule="auto"/>
+              <w:jc w:val="center"/>
+            </w:pPr>
+            <w:r>
+              <w:rPr>
+                <w:rFonts w:ascii="Times New Roman" w:hAnsi="Times New Roman"/>
+                <w:b w:val="0"/>
+                <w:i w:val="0"/>
+                <w:color w:val="1E293B"/>
+                <w:sz w:val="22"/>
+              </w:rPr>
+              <w:t>Lịch chiếu, giờ bắt đầu, kết thúc, hệ số giá vé giờ vàng</w:t>
+            </w:r>
+          </w:p>
+        </w:tc>
+      </w:tr>
+      <w:tr>
+        <w:tc>
+          <w:tcPr>
+            <w:tcW w:type="dxa" w:w="1984"/>
+            <w:shd w:fill="F8FAFC"/>
+          </w:tcPr>
+          <w:p>
+            <w:pPr>
+              <w:spacing w:before="60" w:after="60" w:line="300" w:lineRule="auto"/>
+              <w:jc w:val="center"/>
+            </w:pPr>
+            <w:r>
+              <w:rPr>
+                <w:rFonts w:ascii="Times New Roman" w:hAnsi="Times New Roman"/>
+                <w:b w:val="0"/>
+                <w:i w:val="0"/>
+                <w:color w:val="1E293B"/>
+                <w:sz w:val="22"/>
+              </w:rPr>
+              <w:t>users &amp; login_logs</w:t>
+            </w:r>
+          </w:p>
+        </w:tc>
+        <w:tc>
+          <w:tcPr>
+            <w:tcW w:type="dxa" w:w="2551"/>
+            <w:shd w:fill="F8FAFC"/>
+          </w:tcPr>
+          <w:p>
+            <w:pPr>
+              <w:spacing w:before="60" w:after="60" w:line="300" w:lineRule="auto"/>
+              <w:jc w:val="left"/>
+            </w:pPr>
+            <w:r>
+              <w:rPr>
+                <w:rFonts w:ascii="Times New Roman" w:hAnsi="Times New Roman"/>
+                <w:b w:val="0"/>
+                <w:i w:val="0"/>
+                <w:color w:val="1E293B"/>
+                <w:sz w:val="22"/>
+              </w:rPr>
+              <w:t>id, user_id (FK)</w:t>
+            </w:r>
+          </w:p>
+        </w:tc>
+        <w:tc>
+          <w:tcPr>
+            <w:tcW w:type="dxa" w:w="4252"/>
+            <w:shd w:fill="F8FAFC"/>
+          </w:tcPr>
+          <w:p>
+            <w:pPr>
+              <w:spacing w:before="60" w:after="60" w:line="300" w:lineRule="auto"/>
+              <w:jc w:val="center"/>
+            </w:pPr>
+            <w:r>
+              <w:rPr>
+                <w:rFonts w:ascii="Times New Roman" w:hAnsi="Times New Roman"/>
+                <w:b w:val="0"/>
+                <w:i w:val="0"/>
+                <w:color w:val="1E293B"/>
+                <w:sz w:val="22"/>
+              </w:rPr>
+              <w:t>Tài khoản khách hàng, quản trị viên và nhật ký đăng nhập</w:t>
+            </w:r>
+          </w:p>
+        </w:tc>
+      </w:tr>
+      <w:tr>
+        <w:tc>
+          <w:tcPr>
+            <w:tcW w:type="dxa" w:w="1984"/>
+            <w:shd w:fill="FFFFFF"/>
+          </w:tcPr>
+          <w:p>
+            <w:pPr>
+              <w:spacing w:before="60" w:after="60" w:line="300" w:lineRule="auto"/>
+              <w:jc w:val="center"/>
+            </w:pPr>
+            <w:r>
+              <w:rPr>
+                <w:rFonts w:ascii="Times New Roman" w:hAnsi="Times New Roman"/>
+                <w:b w:val="0"/>
+                <w:i w:val="0"/>
+                <w:color w:val="1E293B"/>
+                <w:sz w:val="22"/>
+              </w:rPr>
+              <w:t>bookings &amp; booking_details</w:t>
+            </w:r>
+          </w:p>
+        </w:tc>
+        <w:tc>
+          <w:tcPr>
+            <w:tcW w:type="dxa" w:w="2551"/>
+            <w:shd w:fill="FFFFFF"/>
+          </w:tcPr>
+          <w:p>
+            <w:pPr>
+              <w:spacing w:before="60" w:after="60" w:line="300" w:lineRule="auto"/>
+              <w:jc w:val="left"/>
+            </w:pPr>
+            <w:r>
+              <w:rPr>
+                <w:rFonts w:ascii="Times New Roman" w:hAnsi="Times New Roman"/>
+                <w:b w:val="0"/>
+                <w:i w:val="0"/>
+                <w:color w:val="1E293B"/>
+                <w:sz w:val="22"/>
+              </w:rPr>
+              <w:t>id, booking_id, seat_id (FK)</w:t>
+            </w:r>
+          </w:p>
+        </w:tc>
+        <w:tc>
+          <w:tcPr>
+            <w:tcW w:type="dxa" w:w="4252"/>
+            <w:shd w:fill="FFFFFF"/>
+          </w:tcPr>
+          <w:p>
+            <w:pPr>
+              <w:spacing w:before="60" w:after="60" w:line="300" w:lineRule="auto"/>
+              <w:jc w:val="center"/>
+            </w:pPr>
+            <w:r>
+              <w:rPr>
+                <w:rFonts w:ascii="Times New Roman" w:hAnsi="Times New Roman"/>
+                <w:b w:val="0"/>
+                <w:i w:val="0"/>
+                <w:color w:val="1E293B"/>
+                <w:sz w:val="22"/>
+              </w:rPr>
+              <w:t>Đơn đặt vé đã chốt, tổng tiền, mã QR và chi tiết từng ghế</w:t>
+            </w:r>
+          </w:p>
+        </w:tc>
+      </w:tr>
+    </w:tbl>
     <w:p>
       <w:pPr>
-        <w:spacing w:before="60" w:after="60" w:line="360" w:lineRule="auto"/>
-        <w:ind w:firstLine="720"/>
-        <w:jc w:val="both"/>
+        <w:spacing w:before="80" w:after="200" w:line="336" w:lineRule="auto"/>
+        <w:jc w:val="center"/>
       </w:pPr>
       <w:r>
         <w:rPr>
           <w:rFonts w:ascii="Times New Roman" w:hAnsi="Times New Roman"/>
           <w:b w:val="0"/>
-          <w:i w:val="0"/>
+          <w:i/>
           <w:color w:val="000000"/>
-          <w:sz w:val="26"/>
+          <w:sz w:val="22"/>
         </w:rPr>
-        <w:t>6. users (id, fullname, phone, email, password_hash, role, status, last_login): Quản lý tài khoản đăng nhập.</w:t>
+        <w:t>Bảng 2.1: Cấu trúc chi tiết các bảng cơ sở dữ liệu quan hệ (ticket_db)</w:t>
       </w:r>
     </w:p>
     <w:p>
       <w:pPr>
-        <w:spacing w:before="60" w:after="60" w:line="360" w:lineRule="auto"/>
-        <w:ind w:firstLine="720"/>
-        <w:jc w:val="both"/>
+        <w:spacing w:before="120" w:after="40" w:line="312" w:lineRule="auto"/>
+        <w:jc w:val="left"/>
       </w:pPr>
       <w:r>
         <w:rPr>
           <w:rFonts w:ascii="Times New Roman" w:hAnsi="Times New Roman"/>
-          <w:b w:val="0"/>
-          <w:i w:val="0"/>
-          <w:color w:val="000000"/>
+          <w:b/>
+          <w:i/>
+          <w:color w:val="334155"/>
           <w:sz w:val="26"/>
         </w:rPr>
-        <w:t>7. login_logs (id, user_id, email, ip_address, user_agent, status, failure_reason): Nhật ký đăng nhập phục vụ quản trị an ninh.</w:t>
-      </w:r>
-    </w:p>
-    <w:p>
-      <w:pPr>
-        <w:spacing w:before="60" w:after="60" w:line="360" w:lineRule="auto"/>
-        <w:ind w:firstLine="720"/>
-        <w:jc w:val="both"/>
-      </w:pPr>
-      <w:r>
-        <w:rPr>
-          <w:rFonts w:ascii="Times New Roman" w:hAnsi="Times New Roman"/>
-          <w:b w:val="0"/>
-          <w:i w:val="0"/>
-          <w:color w:val="000000"/>
-          <w:sz w:val="26"/>
-        </w:rPr>
-        <w:t>8. bookings (id, user_id, booking_code, customer_name, customer_phone, customer_email, showtime_id, total_seats, total_amount, payment_method, transaction_id): Đơn vé đã chốt.</w:t>
-      </w:r>
-    </w:p>
-    <w:p>
-      <w:pPr>
-        <w:spacing w:before="60" w:after="60" w:line="360" w:lineRule="auto"/>
-        <w:ind w:firstLine="720"/>
-        <w:jc w:val="both"/>
-      </w:pPr>
-      <w:r>
-        <w:rPr>
-          <w:rFonts w:ascii="Times New Roman" w:hAnsi="Times New Roman"/>
-          <w:b w:val="0"/>
-          <w:i w:val="0"/>
-          <w:color w:val="000000"/>
-          <w:sz w:val="26"/>
-        </w:rPr>
-        <w:t>9. booking_details (id, booking_id, showtime_id, seat_id, seat_code, price): Chi tiết từng ghế đã đặt trong đơn vé.</w:t>
+        <w:t>Cấu hình dịch vụ Web App và MySQL trong docker-compose.yml:</w:t>
       </w:r>
     </w:p>
     <w:tbl>
@@ -4132,38 +4316,88 @@
         <w:tc>
           <w:tcPr>
             <w:tcW w:type="dxa" w:w="8787"/>
-            <w:shd w:fill="F1F5F9"/>
+            <w:shd w:fill="1E293B"/>
             <w:tcBorders>
-              <w:top w:val="none"/>
-              <w:left w:val="single" w:sz="24" w:space="0" w:color="0284C7"/>
-              <w:bottom w:val="none"/>
-              <w:right w:val="none"/>
+              <w:top w:val="single" w:sz="6" w:space="0" w:color="334155"/>
+              <w:left w:val="single" w:sz="6" w:space="0" w:color="334155"/>
+              <w:bottom w:val="single" w:sz="6" w:space="0" w:color="334155"/>
+              <w:right w:val="single" w:sz="6" w:space="0" w:color="334155"/>
             </w:tcBorders>
           </w:tcPr>
           <w:p>
             <w:pPr>
-              <w:spacing w:before="80" w:after="40" w:line="312" w:lineRule="auto"/>
+              <w:spacing w:before="80" w:after="80" w:line="276" w:lineRule="auto"/>
             </w:pPr>
             <w:r>
               <w:rPr>
-                <w:rFonts w:ascii="Times New Roman" w:hAnsi="Times New Roman"/>
+                <w:rFonts w:ascii="Consolas" w:hAnsi="Consolas"/>
                 <w:b/>
                 <w:i w:val="0"/>
-                <w:color w:val="0284C7"/>
-                <w:sz w:val="24"/>
+                <w:color w:val="38BDF8"/>
+                <w:sz w:val="20"/>
               </w:rPr>
-              <w:t>💡 Giải pháp Chống Đặt Trùng Ghế (Concurrency Control)</w:t>
+              <w:t># --- docker-compose.yml (Trích đoạn Web App &amp; Resource Limits) ---</w:t>
               <w:br/>
             </w:r>
             <w:r>
               <w:rPr>
-                <w:rFonts w:ascii="Times New Roman" w:hAnsi="Times New Roman"/>
+                <w:rFonts w:ascii="Consolas" w:hAnsi="Consolas"/>
                 <w:b w:val="0"/>
-                <w:i/>
-                <w:color w:val="475569"/>
-                <w:sz w:val="23"/>
+                <w:i w:val="0"/>
+                <w:color w:val="F1F5F9"/>
+                <w:sz w:val="19"/>
               </w:rPr>
-              <w:t>Trong controller xử lý đặt vé (bookingController.js), câu lệnh SELECT ... FOR UPDATE được sử dụng bên trong một MySQL Transaction. Khóa bản ghi ở cấp độ dòng ngăn chặn tuyệt đối tình huống 2 tiến trình đồng thời ghi nhận cùng một ghế ngồi.</w:t>
+              <w:t># Web Application (Node.js Express Fullstack)</w:t>
+              <w:br/>
+              <w:t>app:</w:t>
+              <w:br/>
+              <w:t xml:space="preserve">  build:</w:t>
+              <w:br/>
+              <w:t xml:space="preserve">    context: ./app</w:t>
+              <w:br/>
+              <w:t xml:space="preserve">    dockerfile: Dockerfile</w:t>
+              <w:br/>
+              <w:t xml:space="preserve">  container_name: ticket_app</w:t>
+              <w:br/>
+              <w:t xml:space="preserve">  restart: unless-stopped</w:t>
+              <w:br/>
+              <w:t xml:space="preserve">  environment:</w:t>
+              <w:br/>
+              <w:t xml:space="preserve">    - PORT=3000</w:t>
+              <w:br/>
+              <w:t xml:space="preserve">    - NODE_ENV=production</w:t>
+              <w:br/>
+              <w:t xml:space="preserve">    - DB_HOST=mysql</w:t>
+              <w:br/>
+              <w:t xml:space="preserve">    - DB_USER=ticket_user</w:t>
+              <w:br/>
+              <w:t xml:space="preserve">    - DB_PASSWORD=TicketSecurePass2024!</w:t>
+              <w:br/>
+              <w:t xml:space="preserve">    - DB_NAME=ticket_db</w:t>
+              <w:br/>
+              <w:t xml:space="preserve">  depends_on:</w:t>
+              <w:br/>
+              <w:t xml:space="preserve">    mysql:</w:t>
+              <w:br/>
+              <w:t xml:space="preserve">      condition: service_healthy</w:t>
+              <w:br/>
+              <w:t xml:space="preserve">  networks:</w:t>
+              <w:br/>
+              <w:t xml:space="preserve">    - frontend_net</w:t>
+              <w:br/>
+              <w:t xml:space="preserve">    - backend_net</w:t>
+              <w:br/>
+              <w:t xml:space="preserve">    - monitoring_net</w:t>
+              <w:br/>
+              <w:t xml:space="preserve">  deploy:</w:t>
+              <w:br/>
+              <w:t xml:space="preserve">    resources:</w:t>
+              <w:br/>
+              <w:t xml:space="preserve">      limits:</w:t>
+              <w:br/>
+              <w:t xml:space="preserve">        cpus: '0.50'</w:t>
+              <w:br/>
+              <w:t xml:space="preserve">        memory: 350M</w:t>
             </w:r>
           </w:p>
         </w:tc>
@@ -4171,31 +4405,10 @@
     </w:tbl>
     <w:p>
       <w:pPr>
-        <w:spacing w:before="40" w:after="80" w:line="360" w:lineRule="auto"/>
+        <w:spacing w:before="40" w:after="80" w:line="336" w:lineRule="auto"/>
         <w:ind w:firstLine="720"/>
         <w:jc w:val="both"/>
       </w:pPr>
-    </w:p>
-    <w:p>
-      <w:r>
-        <w:br w:type="page"/>
-      </w:r>
-    </w:p>
-    <w:p>
-      <w:pPr>
-        <w:spacing w:before="240" w:after="160" w:line="312" w:lineRule="auto"/>
-        <w:jc w:val="center"/>
-      </w:pPr>
-      <w:r>
-        <w:rPr>
-          <w:rFonts w:ascii="Times New Roman" w:hAnsi="Times New Roman"/>
-          <w:b/>
-          <w:i w:val="0"/>
-          <w:color w:val="0F172A"/>
-          <w:sz w:val="30"/>
-        </w:rPr>
-        <w:t>CHƯƠNG 3: TRIỂN KHAI NGINX REVERSE PROXY, HTTPS VÀ SECURITY HEADERS</w:t>
-      </w:r>
     </w:p>
     <w:p>
       <w:pPr>
@@ -4210,12 +4423,12 @@
           <w:color w:val="1E293B"/>
           <w:sz w:val="27"/>
         </w:rPr>
-        <w:t>3.1. Vai trò của Nginx Reverse Proxy</w:t>
+        <w:t>2.2. Cấu hình Nginx làm Reverse Proxy và Bảo mật cơ bản (Bước 3 - Commit 1)</w:t>
       </w:r>
     </w:p>
     <w:p>
       <w:pPr>
-        <w:spacing w:before="60" w:after="60" w:line="360" w:lineRule="auto"/>
+        <w:spacing w:before="60" w:after="60" w:line="336" w:lineRule="auto"/>
         <w:ind w:firstLine="720"/>
         <w:jc w:val="both"/>
       </w:pPr>
@@ -4227,12 +4440,12 @@
           <w:color w:val="000000"/>
           <w:sz w:val="26"/>
         </w:rPr>
-        <w:t>Nginx đóng vai trò là một cổng giao tiếp an toàn (Reverse Proxy Gateway) đứng trước toàn bộ các dịch vụ container nội bộ. Mọi yêu cầu từ phía người dùng trình duyệt đều gửi tới Nginx thay vì truy cập trực tiếp vào Web application hay phpMyAdmin.</w:t>
+        <w:t>Nginx đóng vai trò là Reverse Proxy Gateway đứng trước Web App và phpMyAdmin. Mọi truy cập của người dùng đều đi qua Nginx thay vì gọi trực tiếp vào container nội bộ:</w:t>
       </w:r>
     </w:p>
     <w:p>
       <w:pPr>
-        <w:spacing w:before="60" w:after="60" w:line="360" w:lineRule="auto"/>
+        <w:spacing w:before="60" w:after="60" w:line="336" w:lineRule="auto"/>
         <w:ind w:firstLine="720"/>
         <w:jc w:val="both"/>
       </w:pPr>
@@ -4244,12 +4457,12 @@
           <w:color w:val="000000"/>
           <w:sz w:val="26"/>
         </w:rPr>
-        <w:t>Lợi ích kỹ thuật đạt được:</w:t>
+        <w:t>• Tích hợp HTTPS với chứng chỉ SSL/TLS tự ký (Self-signed Certificate): Sử dụng cặp khóa RSA 2048-bit (cert.pem và key.pem).</w:t>
       </w:r>
     </w:p>
     <w:p>
       <w:pPr>
-        <w:spacing w:before="60" w:after="60" w:line="360" w:lineRule="auto"/>
+        <w:spacing w:before="60" w:after="60" w:line="336" w:lineRule="auto"/>
         <w:ind w:firstLine="720"/>
         <w:jc w:val="both"/>
       </w:pPr>
@@ -4261,12 +4474,12 @@
           <w:color w:val="000000"/>
           <w:sz w:val="26"/>
         </w:rPr>
-        <w:t>• Che giấu cấu trúc mạng nội bộ: Người dùng không biết IP hay cổng thật của Web App (Port 3000) hay MySQL (Port 3306).</w:t>
+        <w:t>• Tự động chuyển hướng (HTTP Redirection): Mọi request đến cổng 80 đều tự động chuyển hướng sang cổng 443 bằng mã HTTP 301 Moved Permanently.</w:t>
       </w:r>
     </w:p>
     <w:p>
       <w:pPr>
-        <w:spacing w:before="60" w:after="60" w:line="360" w:lineRule="auto"/>
+        <w:spacing w:before="60" w:after="60" w:line="336" w:lineRule="auto"/>
         <w:ind w:firstLine="720"/>
         <w:jc w:val="both"/>
       </w:pPr>
@@ -4278,107 +4491,7 @@
           <w:color w:val="000000"/>
           <w:sz w:val="26"/>
         </w:rPr>
-        <w:t>• Tối ưu hiệu năng: Kích hoạt nén dữ liệu Gzip tự động, giải phóng tải nén cho Node.js server.</w:t>
-      </w:r>
-    </w:p>
-    <w:p>
-      <w:pPr>
-        <w:spacing w:before="60" w:after="60" w:line="360" w:lineRule="auto"/>
-        <w:ind w:firstLine="720"/>
-        <w:jc w:val="both"/>
-      </w:pPr>
-      <w:r>
-        <w:rPr>
-          <w:rFonts w:ascii="Times New Roman" w:hAnsi="Times New Roman"/>
-          <w:b w:val="0"/>
-          <w:i w:val="0"/>
-          <w:color w:val="000000"/>
-          <w:sz w:val="26"/>
-        </w:rPr>
-        <w:t>• Tập trung quản lý chứng chỉ bảo mật: Chỉ cần cấu hình SSL tại Nginx (SSL Termination).</w:t>
-      </w:r>
-    </w:p>
-    <w:p>
-      <w:pPr>
-        <w:spacing w:before="200" w:after="80" w:line="312" w:lineRule="auto"/>
-        <w:jc w:val="left"/>
-      </w:pPr>
-      <w:r>
-        <w:rPr>
-          <w:rFonts w:ascii="Times New Roman" w:hAnsi="Times New Roman"/>
-          <w:b/>
-          <w:i w:val="0"/>
-          <w:color w:val="1E293B"/>
-          <w:sz w:val="27"/>
-        </w:rPr>
-        <w:t>3.2. Cấu hình bảo mật HTTPS và SSL tự ký</w:t>
-      </w:r>
-    </w:p>
-    <w:p>
-      <w:pPr>
-        <w:spacing w:before="60" w:after="60" w:line="360" w:lineRule="auto"/>
-        <w:ind w:firstLine="720"/>
-        <w:jc w:val="both"/>
-      </w:pPr>
-      <w:r>
-        <w:rPr>
-          <w:rFonts w:ascii="Times New Roman" w:hAnsi="Times New Roman"/>
-          <w:b w:val="0"/>
-          <w:i w:val="0"/>
-          <w:color w:val="000000"/>
-          <w:sz w:val="26"/>
-        </w:rPr>
-        <w:t>Hệ thống sử dụng OpenSSL để khởi tạo cặp khóa mã hóa RSA 2048-bit và chứng chỉ số X.509 tự ký (cert.pem và key.pem) có hiệu lực 365 ngày. Nginx lắng nghe đồng thời hai cổng:</w:t>
-      </w:r>
-    </w:p>
-    <w:p>
-      <w:pPr>
-        <w:spacing w:before="60" w:after="60" w:line="360" w:lineRule="auto"/>
-        <w:ind w:firstLine="720"/>
-        <w:jc w:val="both"/>
-      </w:pPr>
-      <w:r>
-        <w:rPr>
-          <w:rFonts w:ascii="Times New Roman" w:hAnsi="Times New Roman"/>
-          <w:b w:val="0"/>
-          <w:i w:val="0"/>
-          <w:color w:val="000000"/>
-          <w:sz w:val="26"/>
-        </w:rPr>
-        <w:t>• Cổng 80 (HTTP): Tự động chuyển hướng toàn bộ sang HTTPS với mã trạng thái HTTP 301 Moved Permanently.</w:t>
-      </w:r>
-    </w:p>
-    <w:p>
-      <w:pPr>
-        <w:spacing w:before="60" w:after="60" w:line="360" w:lineRule="auto"/>
-        <w:ind w:firstLine="720"/>
-        <w:jc w:val="both"/>
-      </w:pPr>
-      <w:r>
-        <w:rPr>
-          <w:rFonts w:ascii="Times New Roman" w:hAnsi="Times New Roman"/>
-          <w:b w:val="0"/>
-          <w:i w:val="0"/>
-          <w:color w:val="000000"/>
-          <w:sz w:val="26"/>
-        </w:rPr>
-        <w:t>• Cổng 443 (HTTPS): Thiết lập giao thức bảo mật TLSv1.2 và TLSv1.3, vô hiệu hóa các thuật toán mã hóa cổ yếu (MD5, aNULL).</w:t>
-      </w:r>
-    </w:p>
-    <w:p>
-      <w:pPr>
-        <w:spacing w:before="200" w:after="80" w:line="312" w:lineRule="auto"/>
-        <w:jc w:val="left"/>
-      </w:pPr>
-      <w:r>
-        <w:rPr>
-          <w:rFonts w:ascii="Times New Roman" w:hAnsi="Times New Roman"/>
-          <w:b/>
-          <w:i w:val="0"/>
-          <w:color w:val="1E293B"/>
-          <w:sz w:val="27"/>
-        </w:rPr>
-        <w:t>3.3. Thiết lập các Security Headers phòng chống tấn công Web</w:t>
+        <w:t>• Triển khai bộ HTTP Security Headers chuẩn bảo vệ trình duyệt:</w:t>
       </w:r>
     </w:p>
     <w:tbl>
@@ -4811,7 +4924,7 @@
     </w:tbl>
     <w:p>
       <w:pPr>
-        <w:spacing w:before="80" w:after="200" w:line="360" w:lineRule="auto"/>
+        <w:spacing w:before="80" w:after="200" w:line="336" w:lineRule="auto"/>
         <w:jc w:val="center"/>
       </w:pPr>
       <w:r>
@@ -4822,7 +4935,45 @@
           <w:color w:val="000000"/>
           <w:sz w:val="22"/>
         </w:rPr>
-        <w:t>Bảng 3.1: Danh sách các HTTP Security Headers bảo mật Nginx</w:t>
+        <w:t>Bảng 2.2: Danh sách các HTTP Security Headers bảo mật Nginx</w:t>
+      </w:r>
+    </w:p>
+    <w:p>
+      <w:pPr>
+        <w:spacing w:before="60" w:after="60" w:line="336" w:lineRule="auto"/>
+        <w:ind w:firstLine="720"/>
+        <w:jc w:val="both"/>
+      </w:pPr>
+      <w:r>
+        <w:rPr>
+          <w:rFonts w:ascii="Times New Roman" w:hAnsi="Times New Roman"/>
+          <w:b w:val="0"/>
+          <w:i w:val="0"/>
+          <w:color w:val="000000"/>
+          <w:sz w:val="26"/>
+        </w:rPr>
+        <w:t>• Cấu hình Rate Limiting (Chống DDoS/Spam): Nginx thiết lập giới hạn 30 req/s cho các trang xem phim và 5 req/s cho endpoint đặt vé nhạy cảm /api/bookings, loại bỏ hoàn toàn nguy cơ dùng bot spam đơn vé ảo.</w:t>
+      </w:r>
+    </w:p>
+    <w:p>
+      <w:r>
+        <w:br w:type="page"/>
+      </w:r>
+    </w:p>
+    <w:p>
+      <w:pPr>
+        <w:spacing w:before="280" w:after="160" w:line="312" w:lineRule="auto"/>
+        <w:jc w:val="center"/>
+      </w:pPr>
+      <w:r>
+        <w:rPr>
+          <w:rFonts w:ascii="Times New Roman" w:hAnsi="Times New Roman"/>
+          <w:b/>
+          <w:i w:val="0"/>
+          <w:color w:val="0F172A"/>
+          <w:sz w:val="30"/>
+        </w:rPr>
+        <w:t>CHƯƠNG 3: GIÁM SÁT HỆ THỐNG VỚI PROMETHEUS, GRAFANA VÀ LOKI</w:t>
       </w:r>
     </w:p>
     <w:p>
@@ -4838,12 +4989,12 @@
           <w:color w:val="1E293B"/>
           <w:sz w:val="27"/>
         </w:rPr>
-        <w:t>3.4. Cấu hình Rate Limiting chống tấn công Brute-force và DDoS</w:t>
+        <w:t>3.1. Tích hợp Prometheus + Grafana (Bước 4 - Commit 2)</w:t>
       </w:r>
     </w:p>
     <w:p>
       <w:pPr>
-        <w:spacing w:before="60" w:after="60" w:line="360" w:lineRule="auto"/>
+        <w:spacing w:before="60" w:after="60" w:line="336" w:lineRule="auto"/>
         <w:ind w:firstLine="720"/>
         <w:jc w:val="both"/>
       </w:pPr>
@@ -4855,12 +5006,12 @@
           <w:color w:val="000000"/>
           <w:sz w:val="26"/>
         </w:rPr>
-        <w:t>Nginx được cấu hình hai vùng nhớ giới hạn tần suất request (Rate Limiting zones):</w:t>
+        <w:t>Để đảm bảo khả năng quan sát (Observability) trạng thái vận hành của toàn bộ hệ sinh thái, Prometheus được cấu hình thu thập các thông số kỹ thuật (CPU usage, Memory utilization, Network I/O, Request Rate) định kỳ mỗi 10 giây một lần:</w:t>
       </w:r>
     </w:p>
     <w:p>
       <w:pPr>
-        <w:spacing w:before="60" w:after="60" w:line="360" w:lineRule="auto"/>
+        <w:spacing w:before="60" w:after="60" w:line="336" w:lineRule="auto"/>
         <w:ind w:firstLine="720"/>
         <w:jc w:val="both"/>
       </w:pPr>
@@ -4872,12 +5023,12 @@
           <w:color w:val="000000"/>
           <w:sz w:val="26"/>
         </w:rPr>
-        <w:t>1. general_limit: Giới hạn lưu lượng xem phim thông thường ở mức 30 requests/giây, burst 20 requests.</w:t>
+        <w:t>1. cAdvisor (Container Advisor): Đọc số liệu tài nguyên trực tiếp từ cgroups của hệ điều hành máy chủ, giám sát tỷ lệ CPU và dung lượng RAM thực tế của từng container.</w:t>
       </w:r>
     </w:p>
     <w:p>
       <w:pPr>
-        <w:spacing w:before="60" w:after="60" w:line="360" w:lineRule="auto"/>
+        <w:spacing w:before="60" w:after="60" w:line="336" w:lineRule="auto"/>
         <w:ind w:firstLine="720"/>
         <w:jc w:val="both"/>
       </w:pPr>
@@ -4889,28 +5040,41 @@
           <w:color w:val="000000"/>
           <w:sz w:val="26"/>
         </w:rPr>
-        <w:t>2. booking_limit: Giới hạn nghiêm ngặt tại endpoint nhạy cảm /api/bookings ở mức 5 requests/giây, burst 5 requests. Cơ chế này ngăn chặn tuyệt đối các công cụ bot spam tạo hàng loạt đơn vé ảo làm nghẽn hệ thống.</w:t>
-      </w:r>
-    </w:p>
-    <w:p>
-      <w:r>
-        <w:br w:type="page"/>
+        <w:t>2. Ứng dụng Web App (/metrics): Tích hợp thư viện prom-client, xuất bản các chỉ số nghiệp vụ theo thời gian thực (cinema_http_requests_total, cinema_http_request_duration_seconds, cinema_ticket_bookings_total, cinema_ticket_revenue_total_vnd).</w:t>
       </w:r>
     </w:p>
     <w:p>
       <w:pPr>
-        <w:spacing w:before="240" w:after="160" w:line="312" w:lineRule="auto"/>
-        <w:jc w:val="center"/>
+        <w:spacing w:before="60" w:after="60" w:line="336" w:lineRule="auto"/>
+        <w:ind w:firstLine="720"/>
+        <w:jc w:val="both"/>
       </w:pPr>
       <w:r>
         <w:rPr>
           <w:rFonts w:ascii="Times New Roman" w:hAnsi="Times New Roman"/>
-          <w:b/>
+          <w:b w:val="0"/>
           <w:i w:val="0"/>
-          <w:color w:val="0F172A"/>
-          <w:sz w:val="30"/>
+          <w:color w:val="000000"/>
+          <w:sz w:val="26"/>
         </w:rPr>
-        <w:t>CHƯƠNG 4: THIẾT LẬP HỆ THỐNG GIÁM SÁT PROMETHEUS VÀ GRAFANA</w:t>
+        <w:t>3. Cơ sở dữ liệu &amp; Nginx Exporter: Thu thập QPS (Queries Per Second) của MySQL và số kết nối hoạt động của Nginx.</w:t>
+      </w:r>
+    </w:p>
+    <w:p>
+      <w:pPr>
+        <w:spacing w:before="60" w:after="60" w:line="336" w:lineRule="auto"/>
+        <w:ind w:firstLine="720"/>
+        <w:jc w:val="both"/>
+      </w:pPr>
+      <w:r>
+        <w:rPr>
+          <w:rFonts w:ascii="Times New Roman" w:hAnsi="Times New Roman"/>
+          <w:b w:val="0"/>
+          <w:i w:val="0"/>
+          <w:color w:val="000000"/>
+          <w:sz w:val="26"/>
+        </w:rPr>
+        <w:t>4. Tự động thiết lập Dashboard trên Grafana (Provisioning): Grafana tự động kết nối nguồn dữ liệu Prometheus (http://prometheus:9090) và nhập tệp cinema_monitoring_dashboard.json mà không cần cấu hình thủ công bằng tay. Dashboard hiển thị trực quan các biểu đồ lưu lượng request, biểu đồ RAM/CPU container và KPI doanh thu.</w:t>
       </w:r>
     </w:p>
     <w:p>
@@ -4926,12 +5090,12 @@
           <w:color w:val="1E293B"/>
           <w:sz w:val="27"/>
         </w:rPr>
-        <w:t>4.1. Kiến trúc hệ thống giám sát Metrics hiện đại</w:t>
+        <w:t>3.2. Triển khai hệ thống Log tập trung Loki + Promtail (Bước 5 - Commit 3)</w:t>
       </w:r>
     </w:p>
     <w:p>
       <w:pPr>
-        <w:spacing w:before="60" w:after="60" w:line="360" w:lineRule="auto"/>
+        <w:spacing w:before="60" w:after="60" w:line="336" w:lineRule="auto"/>
         <w:ind w:firstLine="720"/>
         <w:jc w:val="both"/>
       </w:pPr>
@@ -4943,28 +5107,12 @@
           <w:color w:val="000000"/>
           <w:sz w:val="26"/>
         </w:rPr>
-        <w:t>Hệ thống giám sát vận hành theo mô hình Pull-based tiên tiến của Prometheus: Prometheus Server định kỳ mỗi 10 giây chủ động gửi yêu cầu cào dữ liệu (scrape) tới các endpoints /metrics của từng dịch vụ và lưu trữ vào cơ sở dữ liệu chuỗi thời gian (TSDB).</w:t>
+        <w:t>Trong môi trường nhiều container, việc kiểm tra log từng dịch vụ bằng lệnh docker logs là rất chậm và phân tán. Hệ thống giải quyết triệt để vấn đề này bằng bộ đôi Loki và Promtail:</w:t>
       </w:r>
     </w:p>
     <w:p>
       <w:pPr>
-        <w:spacing w:before="200" w:after="80" w:line="312" w:lineRule="auto"/>
-        <w:jc w:val="left"/>
-      </w:pPr>
-      <w:r>
-        <w:rPr>
-          <w:rFonts w:ascii="Times New Roman" w:hAnsi="Times New Roman"/>
-          <w:b/>
-          <w:i w:val="0"/>
-          <w:color w:val="1E293B"/>
-          <w:sz w:val="27"/>
-        </w:rPr>
-        <w:t>4.2. Các nguồn thu thập số liệu vận hành</w:t>
-      </w:r>
-    </w:p>
-    <w:p>
-      <w:pPr>
-        <w:spacing w:before="60" w:after="60" w:line="360" w:lineRule="auto"/>
+        <w:spacing w:before="60" w:after="60" w:line="336" w:lineRule="auto"/>
         <w:ind w:firstLine="720"/>
         <w:jc w:val="both"/>
       </w:pPr>
@@ -4976,12 +5124,12 @@
           <w:color w:val="000000"/>
           <w:sz w:val="26"/>
         </w:rPr>
-        <w:t>1. cAdvisor (Container Advisor): Chạy dưới quyền privileged, liên kết trực tiếp với Docker socket (/var/run/docker.sock) và hệ thống tập tin cgroups (/sys/fs/cgroup). Thu thập các chỉ số thời gian thực:</w:t>
+        <w:t>• Promtail Agent: Lắng nghe trực tiếp các tệp log dạng JSON của Docker daemon (/var/lib/docker/containers/*/*-json.log), gán nhãn container (container="ticket-app", container="nginx") và gửi từng khối về Loki server qua HTTP API /loki/api/v1/push.</w:t>
       </w:r>
     </w:p>
     <w:p>
       <w:pPr>
-        <w:spacing w:before="60" w:after="60" w:line="360" w:lineRule="auto"/>
+        <w:spacing w:before="60" w:after="60" w:line="336" w:lineRule="auto"/>
         <w:ind w:firstLine="720"/>
         <w:jc w:val="both"/>
       </w:pPr>
@@ -4993,382 +5141,23 @@
           <w:color w:val="000000"/>
           <w:sz w:val="26"/>
         </w:rPr>
-        <w:t xml:space="preserve">   • container_cpu_usage_seconds_total: Tỷ lệ chiếm dụng CPU của từng container.</w:t>
+        <w:t>• Loki Server: Chỉ đánh chỉ mục (index) cho metadata nhãn mà không đánh chỉ mục toàn văn bản log, giúp tiết kiệm hơn 80% dung lượng RAM so với Elasticsearch.</w:t>
       </w:r>
     </w:p>
     <w:p>
       <w:pPr>
-        <w:spacing w:before="60" w:after="60" w:line="360" w:lineRule="auto"/>
-        <w:ind w:firstLine="720"/>
-        <w:jc w:val="both"/>
-      </w:pPr>
-      <w:r>
-        <w:rPr>
-          <w:rFonts w:ascii="Times New Roman" w:hAnsi="Times New Roman"/>
-          <w:b w:val="0"/>
-          <w:i w:val="0"/>
-          <w:color w:val="000000"/>
-          <w:sz w:val="26"/>
-        </w:rPr>
-        <w:t xml:space="preserve">   • container_memory_usage_bytes: Dung lượng bộ nhớ RAM thực tế đang tiêu thụ.</w:t>
-      </w:r>
-    </w:p>
-    <w:p>
-      <w:pPr>
-        <w:spacing w:before="60" w:after="60" w:line="360" w:lineRule="auto"/>
-        <w:ind w:firstLine="720"/>
-        <w:jc w:val="both"/>
-      </w:pPr>
-      <w:r>
-        <w:rPr>
-          <w:rFonts w:ascii="Times New Roman" w:hAnsi="Times New Roman"/>
-          <w:b w:val="0"/>
-          <w:i w:val="0"/>
-          <w:color w:val="000000"/>
-          <w:sz w:val="26"/>
-        </w:rPr>
-        <w:t xml:space="preserve">   • container_network_receive_bytes_total: Băng thông mạng I/O gửi và nhận.</w:t>
-      </w:r>
-    </w:p>
-    <w:p>
-      <w:pPr>
-        <w:spacing w:before="60" w:after="60" w:line="360" w:lineRule="auto"/>
-        <w:ind w:firstLine="720"/>
-        <w:jc w:val="both"/>
-      </w:pPr>
-      <w:r>
-        <w:rPr>
-          <w:rFonts w:ascii="Times New Roman" w:hAnsi="Times New Roman"/>
-          <w:b w:val="0"/>
-          <w:i w:val="0"/>
-          <w:color w:val="000000"/>
-          <w:sz w:val="26"/>
-        </w:rPr>
-        <w:t>2. mysqld-exporter: Giám sát chuyên sâu CSDL MySQL 8.0 qua tài khoản quản trị:</w:t>
-      </w:r>
-    </w:p>
-    <w:p>
-      <w:pPr>
-        <w:spacing w:before="60" w:after="60" w:line="360" w:lineRule="auto"/>
-        <w:ind w:firstLine="720"/>
-        <w:jc w:val="both"/>
-      </w:pPr>
-      <w:r>
-        <w:rPr>
-          <w:rFonts w:ascii="Times New Roman" w:hAnsi="Times New Roman"/>
-          <w:b w:val="0"/>
-          <w:i w:val="0"/>
-          <w:color w:val="000000"/>
-          <w:sz w:val="26"/>
-        </w:rPr>
-        <w:t xml:space="preserve">   • mysql_global_status_queries: Tốc độ xử lý câu truy vấn trên giây (QPS).</w:t>
-      </w:r>
-    </w:p>
-    <w:p>
-      <w:pPr>
-        <w:spacing w:before="60" w:after="60" w:line="360" w:lineRule="auto"/>
-        <w:ind w:firstLine="720"/>
-        <w:jc w:val="both"/>
-      </w:pPr>
-      <w:r>
-        <w:rPr>
-          <w:rFonts w:ascii="Times New Roman" w:hAnsi="Times New Roman"/>
-          <w:b w:val="0"/>
-          <w:i w:val="0"/>
-          <w:color w:val="000000"/>
-          <w:sz w:val="26"/>
-        </w:rPr>
-        <w:t xml:space="preserve">   • mysql_global_status_threads_connected: Số kết nối đồng thời từ các ứng dụng.</w:t>
-      </w:r>
-    </w:p>
-    <w:p>
-      <w:pPr>
-        <w:spacing w:before="60" w:after="60" w:line="360" w:lineRule="auto"/>
-        <w:ind w:firstLine="720"/>
-        <w:jc w:val="both"/>
-      </w:pPr>
-      <w:r>
-        <w:rPr>
-          <w:rFonts w:ascii="Times New Roman" w:hAnsi="Times New Roman"/>
-          <w:b w:val="0"/>
-          <w:i w:val="0"/>
-          <w:color w:val="000000"/>
-          <w:sz w:val="26"/>
-        </w:rPr>
-        <w:t>3. nginx-prometheus-exporter: Kết nối tới endpoint stub_status của Nginx, theo dõi các kết nối đang active, số request đã xử lý thành công.</w:t>
-      </w:r>
-    </w:p>
-    <w:p>
-      <w:pPr>
-        <w:spacing w:before="60" w:after="60" w:line="360" w:lineRule="auto"/>
-        <w:ind w:firstLine="720"/>
-        <w:jc w:val="both"/>
-      </w:pPr>
-      <w:r>
-        <w:rPr>
-          <w:rFonts w:ascii="Times New Roman" w:hAnsi="Times New Roman"/>
-          <w:b w:val="0"/>
-          <w:i w:val="0"/>
-          <w:color w:val="000000"/>
-          <w:sz w:val="26"/>
-        </w:rPr>
-        <w:t>4. Ticket Booking Web App (/metrics): Tích hợp thư viện prom-client, xuất các chỉ số tùy biến:</w:t>
-      </w:r>
-    </w:p>
-    <w:p>
-      <w:pPr>
-        <w:spacing w:before="60" w:after="60" w:line="360" w:lineRule="auto"/>
-        <w:ind w:firstLine="720"/>
-        <w:jc w:val="both"/>
-      </w:pPr>
-      <w:r>
-        <w:rPr>
-          <w:rFonts w:ascii="Times New Roman" w:hAnsi="Times New Roman"/>
-          <w:b w:val="0"/>
-          <w:i w:val="0"/>
-          <w:color w:val="000000"/>
-          <w:sz w:val="26"/>
-        </w:rPr>
-        <w:t xml:space="preserve">   • cinema_http_requests_total: Đếm tổng request theo method, route, status code.</w:t>
-      </w:r>
-    </w:p>
-    <w:p>
-      <w:pPr>
-        <w:spacing w:before="60" w:after="60" w:line="360" w:lineRule="auto"/>
-        <w:ind w:firstLine="720"/>
-        <w:jc w:val="both"/>
-      </w:pPr>
-      <w:r>
-        <w:rPr>
-          <w:rFonts w:ascii="Times New Roman" w:hAnsi="Times New Roman"/>
-          <w:b w:val="0"/>
-          <w:i w:val="0"/>
-          <w:color w:val="000000"/>
-          <w:sz w:val="26"/>
-        </w:rPr>
-        <w:t xml:space="preserve">   • cinema_http_request_duration_seconds: Đo thời gian phản hồi HTTP request (Latency p95).</w:t>
-      </w:r>
-    </w:p>
-    <w:p>
-      <w:pPr>
-        <w:spacing w:before="60" w:after="60" w:line="360" w:lineRule="auto"/>
-        <w:ind w:firstLine="720"/>
-        <w:jc w:val="both"/>
-      </w:pPr>
-      <w:r>
-        <w:rPr>
-          <w:rFonts w:ascii="Times New Roman" w:hAnsi="Times New Roman"/>
-          <w:b w:val="0"/>
-          <w:i w:val="0"/>
-          <w:color w:val="000000"/>
-          <w:sz w:val="26"/>
-        </w:rPr>
-        <w:t xml:space="preserve">   • cinema_ticket_bookings_total: Đếm số lượng vé giao dịch thành công.</w:t>
-      </w:r>
-    </w:p>
-    <w:p>
-      <w:pPr>
-        <w:spacing w:before="60" w:after="60" w:line="360" w:lineRule="auto"/>
-        <w:ind w:firstLine="720"/>
-        <w:jc w:val="both"/>
-      </w:pPr>
-      <w:r>
-        <w:rPr>
-          <w:rFonts w:ascii="Times New Roman" w:hAnsi="Times New Roman"/>
-          <w:b w:val="0"/>
-          <w:i w:val="0"/>
-          <w:color w:val="000000"/>
-          <w:sz w:val="26"/>
-        </w:rPr>
-        <w:t xml:space="preserve">   • cinema_ticket_revenue_total_vnd: Tổng doanh thu bán vé thực tế tính bằng VNĐ.</w:t>
-      </w:r>
-    </w:p>
-    <w:p>
-      <w:pPr>
-        <w:spacing w:before="200" w:after="80" w:line="312" w:lineRule="auto"/>
+        <w:spacing w:before="120" w:after="40" w:line="312" w:lineRule="auto"/>
         <w:jc w:val="left"/>
       </w:pPr>
       <w:r>
         <w:rPr>
           <w:rFonts w:ascii="Times New Roman" w:hAnsi="Times New Roman"/>
           <w:b/>
-          <w:i w:val="0"/>
-          <w:color w:val="1E293B"/>
-          <w:sz w:val="27"/>
-        </w:rPr>
-        <w:t>4.3. Tự động cấu hình Dashboard trên Grafana (Provisioning)</w:t>
-      </w:r>
-    </w:p>
-    <w:p>
-      <w:pPr>
-        <w:spacing w:before="60" w:after="60" w:line="360" w:lineRule="auto"/>
-        <w:ind w:firstLine="720"/>
-        <w:jc w:val="both"/>
-      </w:pPr>
-      <w:r>
-        <w:rPr>
-          <w:rFonts w:ascii="Times New Roman" w:hAnsi="Times New Roman"/>
-          <w:b w:val="0"/>
-          <w:i w:val="0"/>
-          <w:color w:val="000000"/>
+          <w:i/>
+          <w:color w:val="334155"/>
           <w:sz w:val="26"/>
         </w:rPr>
-        <w:t>Grafana được cấu hình tự động hoàn toàn (Zero Manual Configuration): Khi container ticket_grafana khởi động, cơ chế Provisioning tự động nạp:</w:t>
-      </w:r>
-    </w:p>
-    <w:p>
-      <w:pPr>
-        <w:spacing w:before="60" w:after="60" w:line="360" w:lineRule="auto"/>
-        <w:ind w:firstLine="720"/>
-        <w:jc w:val="both"/>
-      </w:pPr>
-      <w:r>
-        <w:rPr>
-          <w:rFonts w:ascii="Times New Roman" w:hAnsi="Times New Roman"/>
-          <w:b w:val="0"/>
-          <w:i w:val="0"/>
-          <w:color w:val="000000"/>
-          <w:sz w:val="26"/>
-        </w:rPr>
-        <w:t>• Tệp datasources.yml: Tự động kết nối tới Prometheus (http://prometheus:9090) và Loki (http://loki:3100).</w:t>
-      </w:r>
-    </w:p>
-    <w:p>
-      <w:pPr>
-        <w:spacing w:before="60" w:after="60" w:line="360" w:lineRule="auto"/>
-        <w:ind w:firstLine="720"/>
-        <w:jc w:val="both"/>
-      </w:pPr>
-      <w:r>
-        <w:rPr>
-          <w:rFonts w:ascii="Times New Roman" w:hAnsi="Times New Roman"/>
-          <w:b w:val="0"/>
-          <w:i w:val="0"/>
-          <w:color w:val="000000"/>
-          <w:sz w:val="26"/>
-        </w:rPr>
-        <w:t>• Tệp cinema_monitoring_dashboard.json: Tự động khởi tạo Dashboard hoàn chỉnh tại http://localhost:3001 bao gồm đầy đủ 4 thẻ KPI nghiệp vụ, biểu đồ độ trễ Latency, biểu đồ tài nguyên container cAdvisor và bảng theo dõi log thời gian thực.</w:t>
-      </w:r>
-    </w:p>
-    <w:p>
-      <w:r>
-        <w:br w:type="page"/>
-      </w:r>
-    </w:p>
-    <w:p>
-      <w:pPr>
-        <w:spacing w:before="240" w:after="160" w:line="312" w:lineRule="auto"/>
-        <w:jc w:val="center"/>
-      </w:pPr>
-      <w:r>
-        <w:rPr>
-          <w:rFonts w:ascii="Times New Roman" w:hAnsi="Times New Roman"/>
-          <w:b/>
-          <w:i w:val="0"/>
-          <w:color w:val="0F172A"/>
-          <w:sz w:val="30"/>
-        </w:rPr>
-        <w:t>CHƯƠNG 5: QUẢN TRỊ LOG TẬP TRUNG LOKI, PROMTAIL VÀ THỰC HÀNH LOGQL</w:t>
-      </w:r>
-    </w:p>
-    <w:p>
-      <w:pPr>
-        <w:spacing w:before="200" w:after="80" w:line="312" w:lineRule="auto"/>
-        <w:jc w:val="left"/>
-      </w:pPr>
-      <w:r>
-        <w:rPr>
-          <w:rFonts w:ascii="Times New Roman" w:hAnsi="Times New Roman"/>
-          <w:b/>
-          <w:i w:val="0"/>
-          <w:color w:val="1E293B"/>
-          <w:sz w:val="27"/>
-        </w:rPr>
-        <w:t>5.1. Luồng thu thập dữ liệu Log tập trung</w:t>
-      </w:r>
-    </w:p>
-    <w:p>
-      <w:pPr>
-        <w:spacing w:before="60" w:after="60" w:line="360" w:lineRule="auto"/>
-        <w:ind w:firstLine="720"/>
-        <w:jc w:val="both"/>
-      </w:pPr>
-      <w:r>
-        <w:rPr>
-          <w:rFonts w:ascii="Times New Roman" w:hAnsi="Times New Roman"/>
-          <w:b w:val="0"/>
-          <w:i w:val="0"/>
-          <w:color w:val="000000"/>
-          <w:sz w:val="26"/>
-        </w:rPr>
-        <w:t>Trong môi trường nhiều container hoạt động đồng thời, việc xem log thủ công bằng lệnh docker logs từng container là vô cùng rời rạc và kém hiệu quả. Cụm Loki + Promtail giải quyết triệt để bài toán này:</w:t>
-      </w:r>
-    </w:p>
-    <w:p>
-      <w:pPr>
-        <w:spacing w:before="60" w:after="60" w:line="360" w:lineRule="auto"/>
-        <w:ind w:firstLine="720"/>
-        <w:jc w:val="both"/>
-      </w:pPr>
-      <w:r>
-        <w:rPr>
-          <w:rFonts w:ascii="Times New Roman" w:hAnsi="Times New Roman"/>
-          <w:b w:val="0"/>
-          <w:i w:val="0"/>
-          <w:color w:val="000000"/>
-          <w:sz w:val="26"/>
-        </w:rPr>
-        <w:t>• Promtail Agent: Chạy như một daemon thu thập log, lắng nghe trực tiếp tệp nhật ký của Docker daemon (/var/lib/docker/containers/*/*-json.log).</w:t>
-      </w:r>
-    </w:p>
-    <w:p>
-      <w:pPr>
-        <w:spacing w:before="60" w:after="60" w:line="360" w:lineRule="auto"/>
-        <w:ind w:firstLine="720"/>
-        <w:jc w:val="both"/>
-      </w:pPr>
-      <w:r>
-        <w:rPr>
-          <w:rFonts w:ascii="Times New Roman" w:hAnsi="Times New Roman"/>
-          <w:b w:val="0"/>
-          <w:i w:val="0"/>
-          <w:color w:val="000000"/>
-          <w:sz w:val="26"/>
-        </w:rPr>
-        <w:t>• Xử lý nhãn (Labeling Pipeline): Promtail bóc tách nhãn tên container (container="ticket-app", container="nginx", container="mysql") và đẩy log theo khối (batch) về Loki qua HTTP API /loki/api/v1/push.</w:t>
-      </w:r>
-    </w:p>
-    <w:p>
-      <w:pPr>
-        <w:spacing w:before="60" w:after="60" w:line="360" w:lineRule="auto"/>
-        <w:ind w:firstLine="720"/>
-        <w:jc w:val="both"/>
-      </w:pPr>
-      <w:r>
-        <w:rPr>
-          <w:rFonts w:ascii="Times New Roman" w:hAnsi="Times New Roman"/>
-          <w:b w:val="0"/>
-          <w:i w:val="0"/>
-          <w:color w:val="000000"/>
-          <w:sz w:val="26"/>
-        </w:rPr>
-        <w:t>• Loki Server: Chỉ đánh chỉ mục (index) cho metadata và labels thay vì toàn bộ nội dung văn bản log, giúp tiết kiệm hơn 80% dung lượng RAM và đĩa cứng so với giải pháp Elasticsearch truyền thống.</w:t>
-      </w:r>
-    </w:p>
-    <w:p>
-      <w:pPr>
-        <w:spacing w:before="200" w:after="80" w:line="312" w:lineRule="auto"/>
-        <w:jc w:val="left"/>
-      </w:pPr>
-      <w:r>
-        <w:rPr>
-          <w:rFonts w:ascii="Times New Roman" w:hAnsi="Times New Roman"/>
-          <w:b/>
-          <w:i w:val="0"/>
-          <w:color w:val="1E293B"/>
-          <w:sz w:val="27"/>
-        </w:rPr>
-        <w:t>5.2. Thực hành bộ 3 câu truy vấn LogQL chuẩn hoá</w:t>
+        <w:t>Thực thi và kiểm chứng các câu truy vấn LogQL tiêu biểu:</w:t>
       </w:r>
     </w:p>
     <w:tbl>
@@ -5393,7 +5182,7 @@
       <w:tr>
         <w:tc>
           <w:tcPr>
-            <w:tcW w:type="dxa" w:w="1134"/>
+            <w:tcW w:type="dxa" w:w="1247"/>
             <w:shd w:fill="1E293B"/>
           </w:tcPr>
           <w:p>
@@ -5409,13 +5198,13 @@
                 <w:color w:val="FFFFFF"/>
                 <w:sz w:val="23"/>
               </w:rPr>
-              <w:t>Truy vấn</w:t>
+              <w:t>Câu truy vấn</w:t>
             </w:r>
           </w:p>
         </w:tc>
         <w:tc>
           <w:tcPr>
-            <w:tcW w:type="dxa" w:w="3402"/>
+            <w:tcW w:type="dxa" w:w="3288"/>
             <w:shd w:fill="1E293B"/>
           </w:tcPr>
           <w:p>
@@ -5461,7 +5250,7 @@
       <w:tr>
         <w:tc>
           <w:tcPr>
-            <w:tcW w:type="dxa" w:w="1134"/>
+            <w:tcW w:type="dxa" w:w="1247"/>
             <w:shd w:fill="FFFFFF"/>
           </w:tcPr>
           <w:p>
@@ -5477,149 +5266,13 @@
                 <w:color w:val="1E293B"/>
                 <w:sz w:val="22"/>
               </w:rPr>
-              <w:t>Query 1</w:t>
+              <w:t>Truy vấn 1 (Bắt buộc)</w:t>
             </w:r>
           </w:p>
         </w:tc>
         <w:tc>
           <w:tcPr>
-            <w:tcW w:type="dxa" w:w="3402"/>
-            <w:shd w:fill="FFFFFF"/>
-          </w:tcPr>
-          <w:p>
-            <w:pPr>
-              <w:spacing w:before="60" w:after="60" w:line="300" w:lineRule="auto"/>
-              <w:jc w:val="left"/>
-            </w:pPr>
-            <w:r>
-              <w:rPr>
-                <w:rFonts w:ascii="Times New Roman" w:hAnsi="Times New Roman"/>
-                <w:b w:val="0"/>
-                <w:i w:val="0"/>
-                <w:color w:val="1E293B"/>
-                <w:sz w:val="22"/>
-              </w:rPr>
-              <w:t>{container="ticket-app"}</w:t>
-            </w:r>
-          </w:p>
-        </w:tc>
-        <w:tc>
-          <w:tcPr>
-            <w:tcW w:type="dxa" w:w="4252"/>
-            <w:shd w:fill="FFFFFF"/>
-          </w:tcPr>
-          <w:p>
-            <w:pPr>
-              <w:spacing w:before="60" w:after="60" w:line="300" w:lineRule="auto"/>
-              <w:jc w:val="center"/>
-            </w:pPr>
-            <w:r>
-              <w:rPr>
-                <w:rFonts w:ascii="Times New Roman" w:hAnsi="Times New Roman"/>
-                <w:b w:val="0"/>
-                <w:i w:val="0"/>
-                <w:color w:val="1E293B"/>
-                <w:sz w:val="22"/>
-              </w:rPr>
-              <w:t>Truy vấn toàn bộ luồng log của Web App đặt vé, theo dõi mọi request HTTP và hoạt động server.</w:t>
-            </w:r>
-          </w:p>
-        </w:tc>
-      </w:tr>
-      <w:tr>
-        <w:tc>
-          <w:tcPr>
-            <w:tcW w:type="dxa" w:w="1134"/>
-            <w:shd w:fill="F8FAFC"/>
-          </w:tcPr>
-          <w:p>
-            <w:pPr>
-              <w:spacing w:before="60" w:after="60" w:line="300" w:lineRule="auto"/>
-              <w:jc w:val="center"/>
-            </w:pPr>
-            <w:r>
-              <w:rPr>
-                <w:rFonts w:ascii="Times New Roman" w:hAnsi="Times New Roman"/>
-                <w:b w:val="0"/>
-                <w:i w:val="0"/>
-                <w:color w:val="1E293B"/>
-                <w:sz w:val="22"/>
-              </w:rPr>
-              <w:t>Query 2</w:t>
-            </w:r>
-          </w:p>
-        </w:tc>
-        <w:tc>
-          <w:tcPr>
-            <w:tcW w:type="dxa" w:w="3402"/>
-            <w:shd w:fill="F8FAFC"/>
-          </w:tcPr>
-          <w:p>
-            <w:pPr>
-              <w:spacing w:before="60" w:after="60" w:line="300" w:lineRule="auto"/>
-              <w:jc w:val="left"/>
-            </w:pPr>
-            <w:r>
-              <w:rPr>
-                <w:rFonts w:ascii="Times New Roman" w:hAnsi="Times New Roman"/>
-                <w:b w:val="0"/>
-                <w:i w:val="0"/>
-                <w:color w:val="1E293B"/>
-                <w:sz w:val="22"/>
-              </w:rPr>
-              <w:t>{container="ticket-app"} |= "BOOKING_SUCCESS"</w:t>
-            </w:r>
-          </w:p>
-        </w:tc>
-        <w:tc>
-          <w:tcPr>
-            <w:tcW w:type="dxa" w:w="4252"/>
-            <w:shd w:fill="F8FAFC"/>
-          </w:tcPr>
-          <w:p>
-            <w:pPr>
-              <w:spacing w:before="60" w:after="60" w:line="300" w:lineRule="auto"/>
-              <w:jc w:val="center"/>
-            </w:pPr>
-            <w:r>
-              <w:rPr>
-                <w:rFonts w:ascii="Times New Roman" w:hAnsi="Times New Roman"/>
-                <w:b w:val="0"/>
-                <w:i w:val="0"/>
-                <w:color w:val="1E293B"/>
-                <w:sz w:val="22"/>
-              </w:rPr>
-              <w:t>Audit Log nghiệp vụ: Lọc chính xác các sự kiện đặt vé thành công, mã vé, họ tên khách, danh sách ghế ngồi và tổng tiền.</w:t>
-            </w:r>
-          </w:p>
-        </w:tc>
-      </w:tr>
-      <w:tr>
-        <w:tc>
-          <w:tcPr>
-            <w:tcW w:type="dxa" w:w="1134"/>
-            <w:shd w:fill="FFFFFF"/>
-          </w:tcPr>
-          <w:p>
-            <w:pPr>
-              <w:spacing w:before="60" w:after="60" w:line="300" w:lineRule="auto"/>
-              <w:jc w:val="center"/>
-            </w:pPr>
-            <w:r>
-              <w:rPr>
-                <w:rFonts w:ascii="Times New Roman" w:hAnsi="Times New Roman"/>
-                <w:b w:val="0"/>
-                <w:i w:val="0"/>
-                <w:color w:val="1E293B"/>
-                <w:sz w:val="22"/>
-              </w:rPr>
-              <w:t>Query 3</w:t>
-            </w:r>
-          </w:p>
-        </w:tc>
-        <w:tc>
-          <w:tcPr>
-            <w:tcW w:type="dxa" w:w="3402"/>
+            <w:tcW w:type="dxa" w:w="3288"/>
             <w:shd w:fill="FFFFFF"/>
           </w:tcPr>
           <w:p>
@@ -5657,7 +5310,143 @@
                 <w:color w:val="1E293B"/>
                 <w:sz w:val="22"/>
               </w:rPr>
-              <w:t>Phát hiện lỗi an ninh: Giám sát các mã trạng thái HTTP 4xx hoặc 5xx trên Nginx để phát hiện tấn công dò quét URL.</w:t>
+              <w:t>Lọc mã lỗi HTTP 4xx hoặc 5xx từ Nginx: Phát hiện các yêu cầu bị lỗi máy chủ hoặc tấn công dò quét URL độc hại.</w:t>
+            </w:r>
+          </w:p>
+        </w:tc>
+      </w:tr>
+      <w:tr>
+        <w:tc>
+          <w:tcPr>
+            <w:tcW w:type="dxa" w:w="1247"/>
+            <w:shd w:fill="F8FAFC"/>
+          </w:tcPr>
+          <w:p>
+            <w:pPr>
+              <w:spacing w:before="60" w:after="60" w:line="300" w:lineRule="auto"/>
+              <w:jc w:val="center"/>
+            </w:pPr>
+            <w:r>
+              <w:rPr>
+                <w:rFonts w:ascii="Times New Roman" w:hAnsi="Times New Roman"/>
+                <w:b w:val="0"/>
+                <w:i w:val="0"/>
+                <w:color w:val="1E293B"/>
+                <w:sz w:val="22"/>
+              </w:rPr>
+              <w:t>Truy vấn 2 (Bắt buộc)</w:t>
+            </w:r>
+          </w:p>
+        </w:tc>
+        <w:tc>
+          <w:tcPr>
+            <w:tcW w:type="dxa" w:w="3288"/>
+            <w:shd w:fill="F8FAFC"/>
+          </w:tcPr>
+          <w:p>
+            <w:pPr>
+              <w:spacing w:before="60" w:after="60" w:line="300" w:lineRule="auto"/>
+              <w:jc w:val="left"/>
+            </w:pPr>
+            <w:r>
+              <w:rPr>
+                <w:rFonts w:ascii="Times New Roman" w:hAnsi="Times New Roman"/>
+                <w:b w:val="0"/>
+                <w:i w:val="0"/>
+                <w:color w:val="1E293B"/>
+                <w:sz w:val="22"/>
+              </w:rPr>
+              <w:t>{container="ticket-app"} |~ "(ERROR|Exception|Failed)"</w:t>
+            </w:r>
+          </w:p>
+        </w:tc>
+        <w:tc>
+          <w:tcPr>
+            <w:tcW w:type="dxa" w:w="4252"/>
+            <w:shd w:fill="F8FAFC"/>
+          </w:tcPr>
+          <w:p>
+            <w:pPr>
+              <w:spacing w:before="60" w:after="60" w:line="300" w:lineRule="auto"/>
+              <w:jc w:val="center"/>
+            </w:pPr>
+            <w:r>
+              <w:rPr>
+                <w:rFonts w:ascii="Times New Roman" w:hAnsi="Times New Roman"/>
+                <w:b w:val="0"/>
+                <w:i w:val="0"/>
+                <w:color w:val="1E293B"/>
+                <w:sz w:val="22"/>
+              </w:rPr>
+              <w:t>Tìm kiếm thông điệp lỗi hoặc ngoại lệ trong ứng dụng Web: Bắt lỗi kết nối CSDL hoặc lỗi logic nghiệp vụ.</w:t>
+            </w:r>
+          </w:p>
+        </w:tc>
+      </w:tr>
+      <w:tr>
+        <w:tc>
+          <w:tcPr>
+            <w:tcW w:type="dxa" w:w="1247"/>
+            <w:shd w:fill="FFFFFF"/>
+          </w:tcPr>
+          <w:p>
+            <w:pPr>
+              <w:spacing w:before="60" w:after="60" w:line="300" w:lineRule="auto"/>
+              <w:jc w:val="center"/>
+            </w:pPr>
+            <w:r>
+              <w:rPr>
+                <w:rFonts w:ascii="Times New Roman" w:hAnsi="Times New Roman"/>
+                <w:b w:val="0"/>
+                <w:i w:val="0"/>
+                <w:color w:val="1E293B"/>
+                <w:sz w:val="22"/>
+              </w:rPr>
+              <w:t>Truy vấn 3 (Nghiệp vụ)</w:t>
+            </w:r>
+          </w:p>
+        </w:tc>
+        <w:tc>
+          <w:tcPr>
+            <w:tcW w:type="dxa" w:w="3288"/>
+            <w:shd w:fill="FFFFFF"/>
+          </w:tcPr>
+          <w:p>
+            <w:pPr>
+              <w:spacing w:before="60" w:after="60" w:line="300" w:lineRule="auto"/>
+              <w:jc w:val="left"/>
+            </w:pPr>
+            <w:r>
+              <w:rPr>
+                <w:rFonts w:ascii="Times New Roman" w:hAnsi="Times New Roman"/>
+                <w:b w:val="0"/>
+                <w:i w:val="0"/>
+                <w:color w:val="1E293B"/>
+                <w:sz w:val="22"/>
+              </w:rPr>
+              <w:t>{container="ticket-app"} |= "BOOKING_SUCCESS"</w:t>
+            </w:r>
+          </w:p>
+        </w:tc>
+        <w:tc>
+          <w:tcPr>
+            <w:tcW w:type="dxa" w:w="4252"/>
+            <w:shd w:fill="FFFFFF"/>
+          </w:tcPr>
+          <w:p>
+            <w:pPr>
+              <w:spacing w:before="60" w:after="60" w:line="300" w:lineRule="auto"/>
+              <w:jc w:val="center"/>
+            </w:pPr>
+            <w:r>
+              <w:rPr>
+                <w:rFonts w:ascii="Times New Roman" w:hAnsi="Times New Roman"/>
+                <w:b w:val="0"/>
+                <w:i w:val="0"/>
+                <w:color w:val="1E293B"/>
+                <w:sz w:val="22"/>
+              </w:rPr>
+              <w:t>Audit Log đặt vé: Lọc toàn bộ sự kiện thanh toán thành công, mã vé, họ tên khách, số ghế và tổng tiền thời gian thực.</w:t>
             </w:r>
           </w:p>
         </w:tc>
@@ -5665,7 +5454,7 @@
     </w:tbl>
     <w:p>
       <w:pPr>
-        <w:spacing w:before="80" w:after="200" w:line="360" w:lineRule="auto"/>
+        <w:spacing w:before="80" w:after="200" w:line="336" w:lineRule="auto"/>
         <w:jc w:val="center"/>
       </w:pPr>
       <w:r>
@@ -5676,25 +5465,89 @@
           <w:color w:val="000000"/>
           <w:sz w:val="22"/>
         </w:rPr>
-        <w:t>Bảng 5.1: Cú pháp các câu truy vấn LogQL chuẩn và kết quả kiểm thử</w:t>
+        <w:t>Bảng 3.2: Cú pháp các câu truy vấn LogQL chuẩn và kết quả kiểm thử</w:t>
       </w:r>
     </w:p>
     <w:p>
       <w:pPr>
-        <w:spacing w:before="60" w:after="60" w:line="360" w:lineRule="auto"/>
-        <w:ind w:firstLine="720"/>
-        <w:jc w:val="both"/>
+        <w:spacing w:before="120" w:after="40" w:line="312" w:lineRule="auto"/>
+        <w:jc w:val="left"/>
       </w:pPr>
       <w:r>
         <w:rPr>
           <w:rFonts w:ascii="Times New Roman" w:hAnsi="Times New Roman"/>
-          <w:b w:val="0"/>
-          <w:i w:val="0"/>
-          <w:color w:val="000000"/>
+          <w:b/>
+          <w:i/>
+          <w:color w:val="334155"/>
           <w:sz w:val="26"/>
         </w:rPr>
-        <w:t>Kết quả thực nghiệm cho thấy thời gian phản hồi của câu truy vấn LogQL trong Grafana Explore đạt dưới 50ms, cho phép người quản trị tìm kiếm nhanh chóng các lỗi phát sinh trong toàn bộ hệ thống chỉ với một vài từ khóa.</w:t>
+        <w:t>Minh họa kết quả truy vấn Audit Log đặt vé thành công từ Loki:</w:t>
       </w:r>
+    </w:p>
+    <w:tbl>
+      <w:tblPr>
+        <w:tblW w:type="auto" w:w="0"/>
+        <w:jc w:val="center"/>
+        <w:tblLook w:firstColumn="1" w:firstRow="1" w:lastColumn="0" w:lastRow="0" w:noHBand="0" w:noVBand="1" w:val="04A0"/>
+      </w:tblPr>
+      <w:tblGrid>
+        <w:gridCol w:w="8788"/>
+      </w:tblGrid>
+      <w:tr>
+        <w:tc>
+          <w:tcPr>
+            <w:tcW w:type="dxa" w:w="8787"/>
+            <w:shd w:fill="1E293B"/>
+            <w:tcBorders>
+              <w:top w:val="single" w:sz="6" w:space="0" w:color="334155"/>
+              <w:left w:val="single" w:sz="6" w:space="0" w:color="334155"/>
+              <w:bottom w:val="single" w:sz="6" w:space="0" w:color="334155"/>
+              <w:right w:val="single" w:sz="6" w:space="0" w:color="334155"/>
+            </w:tcBorders>
+          </w:tcPr>
+          <w:p>
+            <w:pPr>
+              <w:spacing w:before="80" w:after="80" w:line="276" w:lineRule="auto"/>
+            </w:pPr>
+            <w:r>
+              <w:rPr>
+                <w:rFonts w:ascii="Consolas" w:hAnsi="Consolas"/>
+                <w:b/>
+                <w:i w:val="0"/>
+                <w:color w:val="38BDF8"/>
+                <w:sz w:val="20"/>
+              </w:rPr>
+              <w:t># --- Mẫu log thực tế trích xuất qua Grafana Explore LogQL ---</w:t>
+              <w:br/>
+            </w:r>
+            <w:r>
+              <w:rPr>
+                <w:rFonts w:ascii="Consolas" w:hAnsi="Consolas"/>
+                <w:b w:val="0"/>
+                <w:i w:val="0"/>
+                <w:color w:val="F1F5F9"/>
+                <w:sz w:val="19"/>
+              </w:rPr>
+              <w:t>[2026-10-13 15:32:05] [BOOKING_SUCCESS]</w:t>
+              <w:br/>
+              <w:t>Mã vé: TKT-DTC24520-8891 | Khách hàng: Nguyễn Tuấn Đạt | SĐT: 0987654321</w:t>
+              <w:br/>
+              <w:t>Phim: Dune: Hành Tinh Cát - Phần 2 | Suất: 19:30 - Phòng IMAX 3D</w:t>
+              <w:br/>
+              <w:t>Ghế đã đặt: C05, C06 | Tổng tiền: 275.000 VND | Phương thức: MOMO QR</w:t>
+              <w:br/>
+              <w:t>Trạng thái giao dịch: SUCCESS | TransactionID: MOMO_TXN_9918237</w:t>
+            </w:r>
+          </w:p>
+        </w:tc>
+      </w:tr>
+    </w:tbl>
+    <w:p>
+      <w:pPr>
+        <w:spacing w:before="40" w:after="80" w:line="336" w:lineRule="auto"/>
+        <w:ind w:firstLine="720"/>
+        <w:jc w:val="both"/>
+      </w:pPr>
     </w:p>
     <w:p>
       <w:r>
@@ -5703,7 +5556,7 @@
     </w:p>
     <w:p>
       <w:pPr>
-        <w:spacing w:before="240" w:after="160" w:line="312" w:lineRule="auto"/>
+        <w:spacing w:before="280" w:after="160" w:line="312" w:lineRule="auto"/>
         <w:jc w:val="center"/>
       </w:pPr>
       <w:r>
@@ -5714,7 +5567,7 @@
           <w:color w:val="0F172A"/>
           <w:sz w:val="30"/>
         </w:rPr>
-        <w:t>CHƯƠNG 6: HIỆN THỰC CÁC GIẢI PHÁP HARDENING BẢO MẬT HỆ THỐNG</w:t>
+        <w:t>CHƯƠNG 4: CÁC BIỆN PHÁP HARDENING VÀ ĐÁNH GIÁ BẢO MẬT</w:t>
       </w:r>
     </w:p>
     <w:p>
@@ -5730,12 +5583,12 @@
           <w:color w:val="1E293B"/>
           <w:sz w:val="27"/>
         </w:rPr>
-        <w:t>6.1. Nguyên lý đặc quyền tối thiểu và Chạy Container Non-root</w:t>
+        <w:t>4.1. Áp dụng các biện pháp Hardening (Bước 6)</w:t>
       </w:r>
     </w:p>
     <w:p>
       <w:pPr>
-        <w:spacing w:before="60" w:after="60" w:line="360" w:lineRule="auto"/>
+        <w:spacing w:before="60" w:after="60" w:line="336" w:lineRule="auto"/>
         <w:ind w:firstLine="720"/>
         <w:jc w:val="both"/>
       </w:pPr>
@@ -5747,12 +5600,12 @@
           <w:color w:val="000000"/>
           <w:sz w:val="26"/>
         </w:rPr>
-        <w:t>Theo mặc định, nếu không chỉ định rõ trong Dockerfile, các ứng dụng bên trong container sẽ thực thi dưới quyền tài khoản root (UID 0). Nếu ứng dụng web tồn tại lỗ hổng Command Injection hoặc Remote Code Execution (RCE), kẻ tấn công có thể thoát khỏi container (Container Escape) và chiếm quyền điều khiển hoàn toàn máy chủ vật lý.</w:t>
+        <w:t>Nhằm gia cố an toàn thông tin toàn diện cho hạ tầng theo đúng chuẩn Production, 5 biện pháp Hardening chuyên sâu đã được áp dụng triệt để:</w:t>
       </w:r>
     </w:p>
     <w:p>
       <w:pPr>
-        <w:spacing w:before="60" w:after="60" w:line="360" w:lineRule="auto"/>
+        <w:spacing w:before="60" w:after="60" w:line="336" w:lineRule="auto"/>
         <w:ind w:firstLine="720"/>
         <w:jc w:val="both"/>
       </w:pPr>
@@ -5764,12 +5617,12 @@
           <w:color w:val="000000"/>
           <w:sz w:val="26"/>
         </w:rPr>
-        <w:t>Biện pháp hiện thực trong app/Dockerfile:</w:t>
+        <w:t>1. Chạy container dưới quyền Non-root User: Theo mặc định, Docker chạy dưới quyền root (UID 0). Nếu mã nguồn web dính lỗ hổng Remote Code Execution (RCE), kẻ tấn công có thể thoát khỏi container (Container Escape) và chiếm quyền root máy chủ. Trong file app/Dockerfile, hệ thống phân quyền sở hữu thư mục cho user node và khai báo chỉ thị USER node trước khi chạy máy chủ, loại trừ nguy cơ leo thang đặc quyền.</w:t>
       </w:r>
     </w:p>
     <w:p>
       <w:pPr>
-        <w:spacing w:before="60" w:after="60" w:line="360" w:lineRule="auto"/>
+        <w:spacing w:before="60" w:after="60" w:line="336" w:lineRule="auto"/>
         <w:ind w:firstLine="720"/>
         <w:jc w:val="both"/>
       </w:pPr>
@@ -5781,12 +5634,12 @@
           <w:color w:val="000000"/>
           <w:sz w:val="26"/>
         </w:rPr>
-        <w:t>• Sử dụng lệnh chown -R node:node /usr/src/app để chuyển toàn bộ quyền sở hữu mã nguồn cho người dùng node phân quyền thấp.</w:t>
+        <w:t>2. Phân tách mạng nội bộ (Network Isolation): Sử dụng 3 Docker Bridge Networks độc lập (frontend_net, backend_net, monitoring_net). Máy chủ CSDL MySQL chỉ nằm trong backend_net, không mở bất kỳ cổng ngoài nào trên Host (không có ports: 3306), ngăn chặn 100% các cuộc tấn công quét cổng hay brute-force mật khẩu từ Internet.</w:t>
       </w:r>
     </w:p>
     <w:p>
       <w:pPr>
-        <w:spacing w:before="60" w:after="60" w:line="360" w:lineRule="auto"/>
+        <w:spacing w:before="60" w:after="60" w:line="336" w:lineRule="auto"/>
         <w:ind w:firstLine="720"/>
         <w:jc w:val="both"/>
       </w:pPr>
@@ -5798,28 +5651,12 @@
           <w:color w:val="000000"/>
           <w:sz w:val="26"/>
         </w:rPr>
-        <w:t>• Khai báo chỉ thị USER node trước khi chạy máy chủ. Khi container khởi chạy, tiến trình Node.js hoàn toàn không có đặc quyền root.</w:t>
+        <w:t>3. Quản lý biến môi trường an toàn qua tệp .env: Toàn bộ mật khẩu CSDL (Root, App user, Grafana admin) được đưa vào tệp .env riêng biệt, phân quyền bảo vệ và đưa vào .gitignore để tránh lộ lọt bí mật mã nguồn.</w:t>
       </w:r>
     </w:p>
     <w:p>
       <w:pPr>
-        <w:spacing w:before="200" w:after="80" w:line="312" w:lineRule="auto"/>
-        <w:jc w:val="left"/>
-      </w:pPr>
-      <w:r>
-        <w:rPr>
-          <w:rFonts w:ascii="Times New Roman" w:hAnsi="Times New Roman"/>
-          <w:b/>
-          <w:i w:val="0"/>
-          <w:color w:val="1E293B"/>
-          <w:sz w:val="27"/>
-        </w:rPr>
-        <w:t>6.2. Phân tách mạng nội bộ và Cô lập Cơ sở dữ liệu (Network Isolation)</w:t>
-      </w:r>
-    </w:p>
-    <w:p>
-      <w:pPr>
-        <w:spacing w:before="60" w:after="60" w:line="360" w:lineRule="auto"/>
+        <w:spacing w:before="60" w:after="60" w:line="336" w:lineRule="auto"/>
         <w:ind w:firstLine="720"/>
         <w:jc w:val="both"/>
       </w:pPr>
@@ -5831,12 +5668,12 @@
           <w:color w:val="000000"/>
           <w:sz w:val="26"/>
         </w:rPr>
-        <w:t>Hệ thống phân chia thành 3 mạng Docker bridge riêng biệt:</w:t>
+        <w:t>4. Giới hạn tài nguyên phần cứng (Resource Limits): Thiết lập giới hạn tối đa về CPU và bộ nhớ RAM cho từng container (app: 0.5 CPU, 350MB RAM; mysql: 0.75 CPU, 512MB RAM). Cơ chế này bảo vệ hệ thống không bị tê liệt (Denial of Service) khi một container gặp lỗi rò rỉ bộ nhớ (Memory Leak).</w:t>
       </w:r>
     </w:p>
     <w:p>
       <w:pPr>
-        <w:spacing w:before="60" w:after="60" w:line="360" w:lineRule="auto"/>
+        <w:spacing w:before="60" w:after="60" w:line="336" w:lineRule="auto"/>
         <w:ind w:firstLine="720"/>
         <w:jc w:val="both"/>
       </w:pPr>
@@ -5848,226 +5685,467 @@
           <w:color w:val="000000"/>
           <w:sz w:val="26"/>
         </w:rPr>
-        <w:t>• frontend_net: Chỉ kết nối giữa Nginx, Web App và Grafana để phục vụ giao diện người dùng.</w:t>
+        <w:t>5. Áp dụng nguyên tắc đặc quyền tối thiểu trong CSDL (Database Least Privilege): Tài khoản ticket_user chỉ được cấp 3 quyền tối thiểu (SELECT, INSERT, UPDATE). Tuyệt đối không cấp các quyền nguy hiểm (DROP, ALTER, GRANT OPTION), vô hiệu hóa hoàn toàn ý đồ xóa sạch dữ liệu nếu chẳng may bị lỗi SQL Injection.</w:t>
       </w:r>
     </w:p>
     <w:p>
       <w:pPr>
-        <w:spacing w:before="60" w:after="60" w:line="360" w:lineRule="auto"/>
-        <w:ind w:firstLine="720"/>
-        <w:jc w:val="both"/>
-      </w:pPr>
-      <w:r>
-        <w:rPr>
-          <w:rFonts w:ascii="Times New Roman" w:hAnsi="Times New Roman"/>
-          <w:b w:val="0"/>
-          <w:i w:val="0"/>
-          <w:color w:val="000000"/>
-          <w:sz w:val="26"/>
-        </w:rPr>
-        <w:t>• backend_net: Kết nối độc quyền giữa Web App, CSDL MySQL và phpMyAdmin.</w:t>
-      </w:r>
-    </w:p>
-    <w:p>
-      <w:pPr>
-        <w:spacing w:before="60" w:after="60" w:line="360" w:lineRule="auto"/>
-        <w:ind w:firstLine="720"/>
-        <w:jc w:val="both"/>
-      </w:pPr>
-      <w:r>
-        <w:rPr>
-          <w:rFonts w:ascii="Times New Roman" w:hAnsi="Times New Roman"/>
-          <w:b w:val="0"/>
-          <w:i w:val="0"/>
-          <w:color w:val="000000"/>
-          <w:sz w:val="26"/>
-        </w:rPr>
-        <w:t>• monitoring_net: Mạng riêng cho cụm Prometheus, cAdvisor, Exporters, Loki và Promtail.</w:t>
-      </w:r>
-    </w:p>
-    <w:p>
-      <w:pPr>
-        <w:spacing w:before="60" w:after="60" w:line="360" w:lineRule="auto"/>
-        <w:ind w:firstLine="720"/>
-        <w:jc w:val="both"/>
-      </w:pPr>
-      <w:r>
-        <w:rPr>
-          <w:rFonts w:ascii="Times New Roman" w:hAnsi="Times New Roman"/>
-          <w:b w:val="0"/>
-          <w:i w:val="0"/>
-          <w:color w:val="000000"/>
-          <w:sz w:val="26"/>
-        </w:rPr>
-        <w:t>Đặc biệt, CSDL MySQL không khai báo chỉ thị ports trong docker-compose.yml. Do đó, các máy trạm ngoài Internet hoàn toàn không thể quét thấy cổng 3306, loại trừ 100% các cuộc tấn công Brute-force mật khẩu cơ sở dữ liệu từ bên ngoài.</w:t>
-      </w:r>
-    </w:p>
-    <w:p>
-      <w:pPr>
-        <w:spacing w:before="200" w:after="80" w:line="312" w:lineRule="auto"/>
+        <w:spacing w:before="120" w:after="40" w:line="312" w:lineRule="auto"/>
         <w:jc w:val="left"/>
       </w:pPr>
       <w:r>
         <w:rPr>
           <w:rFonts w:ascii="Times New Roman" w:hAnsi="Times New Roman"/>
           <w:b/>
-          <w:i w:val="0"/>
-          <w:color w:val="1E293B"/>
-          <w:sz w:val="27"/>
+          <w:i/>
+          <w:color w:val="334155"/>
+          <w:sz w:val="26"/>
         </w:rPr>
-        <w:t>6.3. Giới hạn tài nguyên phần cứng (Resource Limits)</w:t>
+        <w:t>Bảng so sánh mức độ an toàn trước và sau khi áp dụng Hardening:</w:t>
       </w:r>
     </w:p>
+    <w:tbl>
+      <w:tblPr>
+        <w:tblW w:type="auto" w:w="0"/>
+        <w:jc w:val="center"/>
+        <w:tblLook w:firstColumn="1" w:firstRow="1" w:lastColumn="0" w:lastRow="0" w:noHBand="0" w:noVBand="1" w:val="04A0"/>
+        <w:tblBorders>
+          <w:top w:val="single" w:sz="6" w:space="0" w:color="CBD5E1"/>
+          <w:bottom w:val="single" w:sz="6" w:space="0" w:color="CBD5E1"/>
+          <w:insideH w:val="single" w:sz="4" w:space="0" w:color="E2E8F0"/>
+          <w:insideV w:val="single" w:sz="4" w:space="0" w:color="E2E8F0"/>
+          <w:left w:val="none"/>
+          <w:right w:val="none"/>
+        </w:tblBorders>
+      </w:tblPr>
+      <w:tblGrid>
+        <w:gridCol w:w="2929"/>
+        <w:gridCol w:w="2929"/>
+        <w:gridCol w:w="2929"/>
+      </w:tblGrid>
+      <w:tr>
+        <w:tc>
+          <w:tcPr>
+            <w:tcW w:type="dxa" w:w="1814"/>
+            <w:shd w:fill="1E293B"/>
+          </w:tcPr>
+          <w:p>
+            <w:pPr>
+              <w:spacing w:before="80" w:after="80"/>
+              <w:jc w:val="center"/>
+            </w:pPr>
+            <w:r>
+              <w:rPr>
+                <w:rFonts w:ascii="Times New Roman" w:hAnsi="Times New Roman"/>
+                <w:b/>
+                <w:i w:val="0"/>
+                <w:color w:val="FFFFFF"/>
+                <w:sz w:val="23"/>
+              </w:rPr>
+              <w:t>Hạng mục bảo mật</w:t>
+            </w:r>
+          </w:p>
+        </w:tc>
+        <w:tc>
+          <w:tcPr>
+            <w:tcW w:type="dxa" w:w="3288"/>
+            <w:shd w:fill="1E293B"/>
+          </w:tcPr>
+          <w:p>
+            <w:pPr>
+              <w:spacing w:before="80" w:after="80"/>
+              <w:jc w:val="center"/>
+            </w:pPr>
+            <w:r>
+              <w:rPr>
+                <w:rFonts w:ascii="Times New Roman" w:hAnsi="Times New Roman"/>
+                <w:b/>
+                <w:i w:val="0"/>
+                <w:color w:val="FFFFFF"/>
+                <w:sz w:val="23"/>
+              </w:rPr>
+              <w:t>Trước khi áp dụng Hardening</w:t>
+            </w:r>
+          </w:p>
+        </w:tc>
+        <w:tc>
+          <w:tcPr>
+            <w:tcW w:type="dxa" w:w="3685"/>
+            <w:shd w:fill="1E293B"/>
+          </w:tcPr>
+          <w:p>
+            <w:pPr>
+              <w:spacing w:before="80" w:after="80"/>
+              <w:jc w:val="center"/>
+            </w:pPr>
+            <w:r>
+              <w:rPr>
+                <w:rFonts w:ascii="Times New Roman" w:hAnsi="Times New Roman"/>
+                <w:b/>
+                <w:i w:val="0"/>
+                <w:color w:val="FFFFFF"/>
+                <w:sz w:val="23"/>
+              </w:rPr>
+              <w:t>Sau khi áp dụng Hardening</w:t>
+            </w:r>
+          </w:p>
+        </w:tc>
+      </w:tr>
+      <w:tr>
+        <w:tc>
+          <w:tcPr>
+            <w:tcW w:type="dxa" w:w="1814"/>
+            <w:shd w:fill="FFFFFF"/>
+          </w:tcPr>
+          <w:p>
+            <w:pPr>
+              <w:spacing w:before="60" w:after="60" w:line="300" w:lineRule="auto"/>
+              <w:jc w:val="center"/>
+            </w:pPr>
+            <w:r>
+              <w:rPr>
+                <w:rFonts w:ascii="Times New Roman" w:hAnsi="Times New Roman"/>
+                <w:b w:val="0"/>
+                <w:i w:val="0"/>
+                <w:color w:val="1E293B"/>
+                <w:sz w:val="22"/>
+              </w:rPr>
+              <w:t>Quyền thực thi Container</w:t>
+            </w:r>
+          </w:p>
+        </w:tc>
+        <w:tc>
+          <w:tcPr>
+            <w:tcW w:type="dxa" w:w="3288"/>
+            <w:shd w:fill="FFFFFF"/>
+          </w:tcPr>
+          <w:p>
+            <w:pPr>
+              <w:spacing w:before="60" w:after="60" w:line="300" w:lineRule="auto"/>
+              <w:jc w:val="left"/>
+            </w:pPr>
+            <w:r>
+              <w:rPr>
+                <w:rFonts w:ascii="Times New Roman" w:hAnsi="Times New Roman"/>
+                <w:b w:val="0"/>
+                <w:i w:val="0"/>
+                <w:color w:val="1E293B"/>
+                <w:sz w:val="22"/>
+              </w:rPr>
+              <w:t>Mặc định quyền root (UID 0), nguy cơ leo thang đặc quyền</w:t>
+            </w:r>
+          </w:p>
+        </w:tc>
+        <w:tc>
+          <w:tcPr>
+            <w:tcW w:type="dxa" w:w="3685"/>
+            <w:shd w:fill="FFFFFF"/>
+          </w:tcPr>
+          <w:p>
+            <w:pPr>
+              <w:spacing w:before="60" w:after="60" w:line="300" w:lineRule="auto"/>
+              <w:jc w:val="center"/>
+            </w:pPr>
+            <w:r>
+              <w:rPr>
+                <w:rFonts w:ascii="Times New Roman" w:hAnsi="Times New Roman"/>
+                <w:b w:val="0"/>
+                <w:i w:val="0"/>
+                <w:color w:val="1E293B"/>
+                <w:sz w:val="22"/>
+              </w:rPr>
+              <w:t>Chạy dưới quyền user phi đặc quyền (USER node) an toàn</w:t>
+            </w:r>
+          </w:p>
+        </w:tc>
+      </w:tr>
+      <w:tr>
+        <w:tc>
+          <w:tcPr>
+            <w:tcW w:type="dxa" w:w="1814"/>
+            <w:shd w:fill="F8FAFC"/>
+          </w:tcPr>
+          <w:p>
+            <w:pPr>
+              <w:spacing w:before="60" w:after="60" w:line="300" w:lineRule="auto"/>
+              <w:jc w:val="center"/>
+            </w:pPr>
+            <w:r>
+              <w:rPr>
+                <w:rFonts w:ascii="Times New Roman" w:hAnsi="Times New Roman"/>
+                <w:b w:val="0"/>
+                <w:i w:val="0"/>
+                <w:color w:val="1E293B"/>
+                <w:sz w:val="22"/>
+              </w:rPr>
+              <w:t>Cách ly mạng CSDL</w:t>
+            </w:r>
+          </w:p>
+        </w:tc>
+        <w:tc>
+          <w:tcPr>
+            <w:tcW w:type="dxa" w:w="3288"/>
+            <w:shd w:fill="F8FAFC"/>
+          </w:tcPr>
+          <w:p>
+            <w:pPr>
+              <w:spacing w:before="60" w:after="60" w:line="300" w:lineRule="auto"/>
+              <w:jc w:val="left"/>
+            </w:pPr>
+            <w:r>
+              <w:rPr>
+                <w:rFonts w:ascii="Times New Roman" w:hAnsi="Times New Roman"/>
+                <w:b w:val="0"/>
+                <w:i w:val="0"/>
+                <w:color w:val="1E293B"/>
+                <w:sz w:val="22"/>
+              </w:rPr>
+              <w:t>Mở cổng 3306 công khai ra ngoài host, dễ bị dò quét</w:t>
+            </w:r>
+          </w:p>
+        </w:tc>
+        <w:tc>
+          <w:tcPr>
+            <w:tcW w:type="dxa" w:w="3685"/>
+            <w:shd w:fill="F8FAFC"/>
+          </w:tcPr>
+          <w:p>
+            <w:pPr>
+              <w:spacing w:before="60" w:after="60" w:line="300" w:lineRule="auto"/>
+              <w:jc w:val="center"/>
+            </w:pPr>
+            <w:r>
+              <w:rPr>
+                <w:rFonts w:ascii="Times New Roman" w:hAnsi="Times New Roman"/>
+                <w:b w:val="0"/>
+                <w:i w:val="0"/>
+                <w:color w:val="1E293B"/>
+                <w:sz w:val="22"/>
+              </w:rPr>
+              <w:t>Cô lập hoàn toàn trong backend_net, không mở cổng ngoài</w:t>
+            </w:r>
+          </w:p>
+        </w:tc>
+      </w:tr>
+      <w:tr>
+        <w:tc>
+          <w:tcPr>
+            <w:tcW w:type="dxa" w:w="1814"/>
+            <w:shd w:fill="FFFFFF"/>
+          </w:tcPr>
+          <w:p>
+            <w:pPr>
+              <w:spacing w:before="60" w:after="60" w:line="300" w:lineRule="auto"/>
+              <w:jc w:val="center"/>
+            </w:pPr>
+            <w:r>
+              <w:rPr>
+                <w:rFonts w:ascii="Times New Roman" w:hAnsi="Times New Roman"/>
+                <w:b w:val="0"/>
+                <w:i w:val="0"/>
+                <w:color w:val="1E293B"/>
+                <w:sz w:val="22"/>
+              </w:rPr>
+              <w:t>Quản lý thông tin mật</w:t>
+            </w:r>
+          </w:p>
+        </w:tc>
+        <w:tc>
+          <w:tcPr>
+            <w:tcW w:type="dxa" w:w="3288"/>
+            <w:shd w:fill="FFFFFF"/>
+          </w:tcPr>
+          <w:p>
+            <w:pPr>
+              <w:spacing w:before="60" w:after="60" w:line="300" w:lineRule="auto"/>
+              <w:jc w:val="left"/>
+            </w:pPr>
+            <w:r>
+              <w:rPr>
+                <w:rFonts w:ascii="Times New Roman" w:hAnsi="Times New Roman"/>
+                <w:b w:val="0"/>
+                <w:i w:val="0"/>
+                <w:color w:val="1E293B"/>
+                <w:sz w:val="22"/>
+              </w:rPr>
+              <w:t>Hardcode mật khẩu trực tiếp trong mã nguồn git</w:t>
+            </w:r>
+          </w:p>
+        </w:tc>
+        <w:tc>
+          <w:tcPr>
+            <w:tcW w:type="dxa" w:w="3685"/>
+            <w:shd w:fill="FFFFFF"/>
+          </w:tcPr>
+          <w:p>
+            <w:pPr>
+              <w:spacing w:before="60" w:after="60" w:line="300" w:lineRule="auto"/>
+              <w:jc w:val="center"/>
+            </w:pPr>
+            <w:r>
+              <w:rPr>
+                <w:rFonts w:ascii="Times New Roman" w:hAnsi="Times New Roman"/>
+                <w:b w:val="0"/>
+                <w:i w:val="0"/>
+                <w:color w:val="1E293B"/>
+                <w:sz w:val="22"/>
+              </w:rPr>
+              <w:t>Tách biệt trong file .env an toàn, nạp biến môi trường động</w:t>
+            </w:r>
+          </w:p>
+        </w:tc>
+      </w:tr>
+      <w:tr>
+        <w:tc>
+          <w:tcPr>
+            <w:tcW w:type="dxa" w:w="1814"/>
+            <w:shd w:fill="F8FAFC"/>
+          </w:tcPr>
+          <w:p>
+            <w:pPr>
+              <w:spacing w:before="60" w:after="60" w:line="300" w:lineRule="auto"/>
+              <w:jc w:val="center"/>
+            </w:pPr>
+            <w:r>
+              <w:rPr>
+                <w:rFonts w:ascii="Times New Roman" w:hAnsi="Times New Roman"/>
+                <w:b w:val="0"/>
+                <w:i w:val="0"/>
+                <w:color w:val="1E293B"/>
+                <w:sz w:val="22"/>
+              </w:rPr>
+              <w:t>Kiểm soát tài nguyên</w:t>
+            </w:r>
+          </w:p>
+        </w:tc>
+        <w:tc>
+          <w:tcPr>
+            <w:tcW w:type="dxa" w:w="3288"/>
+            <w:shd w:fill="F8FAFC"/>
+          </w:tcPr>
+          <w:p>
+            <w:pPr>
+              <w:spacing w:before="60" w:after="60" w:line="300" w:lineRule="auto"/>
+              <w:jc w:val="left"/>
+            </w:pPr>
+            <w:r>
+              <w:rPr>
+                <w:rFonts w:ascii="Times New Roman" w:hAnsi="Times New Roman"/>
+                <w:b w:val="0"/>
+                <w:i w:val="0"/>
+                <w:color w:val="1E293B"/>
+                <w:sz w:val="22"/>
+              </w:rPr>
+              <w:t>Không giới hạn, nguy cơ DoS làm tràn RAM máy chủ</w:t>
+            </w:r>
+          </w:p>
+        </w:tc>
+        <w:tc>
+          <w:tcPr>
+            <w:tcW w:type="dxa" w:w="3685"/>
+            <w:shd w:fill="F8FAFC"/>
+          </w:tcPr>
+          <w:p>
+            <w:pPr>
+              <w:spacing w:before="60" w:after="60" w:line="300" w:lineRule="auto"/>
+              <w:jc w:val="center"/>
+            </w:pPr>
+            <w:r>
+              <w:rPr>
+                <w:rFonts w:ascii="Times New Roman" w:hAnsi="Times New Roman"/>
+                <w:b w:val="0"/>
+                <w:i w:val="0"/>
+                <w:color w:val="1E293B"/>
+                <w:sz w:val="22"/>
+              </w:rPr>
+              <w:t>Giới hạn cứng CPU và RAM cho từng container trong Compose</w:t>
+            </w:r>
+          </w:p>
+        </w:tc>
+      </w:tr>
+      <w:tr>
+        <w:tc>
+          <w:tcPr>
+            <w:tcW w:type="dxa" w:w="1814"/>
+            <w:shd w:fill="FFFFFF"/>
+          </w:tcPr>
+          <w:p>
+            <w:pPr>
+              <w:spacing w:before="60" w:after="60" w:line="300" w:lineRule="auto"/>
+              <w:jc w:val="center"/>
+            </w:pPr>
+            <w:r>
+              <w:rPr>
+                <w:rFonts w:ascii="Times New Roman" w:hAnsi="Times New Roman"/>
+                <w:b w:val="0"/>
+                <w:i w:val="0"/>
+                <w:color w:val="1E293B"/>
+                <w:sz w:val="22"/>
+              </w:rPr>
+              <w:t>Đặc quyền người dùng CSDL</w:t>
+            </w:r>
+          </w:p>
+        </w:tc>
+        <w:tc>
+          <w:tcPr>
+            <w:tcW w:type="dxa" w:w="3288"/>
+            <w:shd w:fill="FFFFFF"/>
+          </w:tcPr>
+          <w:p>
+            <w:pPr>
+              <w:spacing w:before="60" w:after="60" w:line="300" w:lineRule="auto"/>
+              <w:jc w:val="left"/>
+            </w:pPr>
+            <w:r>
+              <w:rPr>
+                <w:rFonts w:ascii="Times New Roman" w:hAnsi="Times New Roman"/>
+                <w:b w:val="0"/>
+                <w:i w:val="0"/>
+                <w:color w:val="1E293B"/>
+                <w:sz w:val="22"/>
+              </w:rPr>
+              <w:t>Cấp toàn quyền ALL PRIVILEGES bao gồm cả DROP TABLE</w:t>
+            </w:r>
+          </w:p>
+        </w:tc>
+        <w:tc>
+          <w:tcPr>
+            <w:tcW w:type="dxa" w:w="3685"/>
+            <w:shd w:fill="FFFFFF"/>
+          </w:tcPr>
+          <w:p>
+            <w:pPr>
+              <w:spacing w:before="60" w:after="60" w:line="300" w:lineRule="auto"/>
+              <w:jc w:val="center"/>
+            </w:pPr>
+            <w:r>
+              <w:rPr>
+                <w:rFonts w:ascii="Times New Roman" w:hAnsi="Times New Roman"/>
+                <w:b w:val="0"/>
+                <w:i w:val="0"/>
+                <w:color w:val="1E293B"/>
+                <w:sz w:val="22"/>
+              </w:rPr>
+              <w:t>Chỉ cấp quyền tối thiểu: SELECT, INSERT, UPDATE cho vận hành</w:t>
+            </w:r>
+          </w:p>
+        </w:tc>
+      </w:tr>
+    </w:tbl>
     <w:p>
       <w:pPr>
-        <w:spacing w:before="60" w:after="60" w:line="360" w:lineRule="auto"/>
-        <w:ind w:firstLine="720"/>
-        <w:jc w:val="both"/>
+        <w:spacing w:before="80" w:after="200" w:line="336" w:lineRule="auto"/>
+        <w:jc w:val="center"/>
       </w:pPr>
       <w:r>
         <w:rPr>
           <w:rFonts w:ascii="Times New Roman" w:hAnsi="Times New Roman"/>
           <w:b w:val="0"/>
-          <w:i w:val="0"/>
+          <w:i/>
           <w:color w:val="000000"/>
-          <w:sz w:val="26"/>
+          <w:sz w:val="22"/>
         </w:rPr>
-        <w:t>Nếu một container bị lỗi rò rỉ bộ nhớ (Memory Leak) hoặc bị tấn công DoS, nó có thể chiếm dụng toàn bộ 100% CPU và RAM của máy chủ, gây sập toàn bộ các dịch vụ lân cận. Để ngăn chặn điều này, tệp docker-compose.yml thiết lập giới hạn cứng cho từng container:</w:t>
-      </w:r>
-    </w:p>
-    <w:p>
-      <w:pPr>
-        <w:spacing w:before="60" w:after="60" w:line="360" w:lineRule="auto"/>
-        <w:ind w:firstLine="720"/>
-        <w:jc w:val="both"/>
-      </w:pPr>
-      <w:r>
-        <w:rPr>
-          <w:rFonts w:ascii="Times New Roman" w:hAnsi="Times New Roman"/>
-          <w:b w:val="0"/>
-          <w:i w:val="0"/>
-          <w:color w:val="000000"/>
-          <w:sz w:val="26"/>
-        </w:rPr>
-        <w:t>• Web App: limits: cpus: '0.50', memory: 350M</w:t>
-      </w:r>
-    </w:p>
-    <w:p>
-      <w:pPr>
-        <w:spacing w:before="60" w:after="60" w:line="360" w:lineRule="auto"/>
-        <w:ind w:firstLine="720"/>
-        <w:jc w:val="both"/>
-      </w:pPr>
-      <w:r>
-        <w:rPr>
-          <w:rFonts w:ascii="Times New Roman" w:hAnsi="Times New Roman"/>
-          <w:b w:val="0"/>
-          <w:i w:val="0"/>
-          <w:color w:val="000000"/>
-          <w:sz w:val="26"/>
-        </w:rPr>
-        <w:t>• MySQL Database: limits: cpus: '0.75', memory: 512M</w:t>
-      </w:r>
-    </w:p>
-    <w:p>
-      <w:pPr>
-        <w:spacing w:before="60" w:after="60" w:line="360" w:lineRule="auto"/>
-        <w:ind w:firstLine="720"/>
-        <w:jc w:val="both"/>
-      </w:pPr>
-      <w:r>
-        <w:rPr>
-          <w:rFonts w:ascii="Times New Roman" w:hAnsi="Times New Roman"/>
-          <w:b w:val="0"/>
-          <w:i w:val="0"/>
-          <w:color w:val="000000"/>
-          <w:sz w:val="26"/>
-        </w:rPr>
-        <w:t>• Nginx Reverse Proxy: limits: cpus: '0.25', memory: 128M</w:t>
-      </w:r>
-    </w:p>
-    <w:p>
-      <w:pPr>
-        <w:spacing w:before="60" w:after="60" w:line="360" w:lineRule="auto"/>
-        <w:ind w:firstLine="720"/>
-        <w:jc w:val="both"/>
-      </w:pPr>
-      <w:r>
-        <w:rPr>
-          <w:rFonts w:ascii="Times New Roman" w:hAnsi="Times New Roman"/>
-          <w:b w:val="0"/>
-          <w:i w:val="0"/>
-          <w:color w:val="000000"/>
-          <w:sz w:val="26"/>
-        </w:rPr>
-        <w:t>• Prometheus &amp; Grafana: limits: cpus: '0.50', memory: 384M</w:t>
-      </w:r>
-    </w:p>
-    <w:p>
-      <w:pPr>
-        <w:spacing w:before="200" w:after="80" w:line="312" w:lineRule="auto"/>
-        <w:jc w:val="left"/>
-      </w:pPr>
-      <w:r>
-        <w:rPr>
-          <w:rFonts w:ascii="Times New Roman" w:hAnsi="Times New Roman"/>
-          <w:b/>
-          <w:i w:val="0"/>
-          <w:color w:val="1E293B"/>
-          <w:sz w:val="27"/>
-        </w:rPr>
-        <w:t>6.4. Bảo mật CSDL và Nguyên tắc Least Privilege</w:t>
-      </w:r>
-    </w:p>
-    <w:p>
-      <w:pPr>
-        <w:spacing w:before="60" w:after="60" w:line="360" w:lineRule="auto"/>
-        <w:ind w:firstLine="720"/>
-        <w:jc w:val="both"/>
-      </w:pPr>
-      <w:r>
-        <w:rPr>
-          <w:rFonts w:ascii="Times New Roman" w:hAnsi="Times New Roman"/>
-          <w:b w:val="0"/>
-          <w:i w:val="0"/>
-          <w:color w:val="000000"/>
-          <w:sz w:val="26"/>
-        </w:rPr>
-        <w:t>Trong tệp khởi tạo mysql/init.sql, tài khoản người dùng ứng dụng ticket_user được áp dụng nguyên tắc đặc quyền tối thiểu:</w:t>
-      </w:r>
-    </w:p>
-    <w:p>
-      <w:pPr>
-        <w:spacing w:before="60" w:after="60" w:line="360" w:lineRule="auto"/>
-        <w:ind w:firstLine="720"/>
-        <w:jc w:val="both"/>
-      </w:pPr>
-      <w:r>
-        <w:rPr>
-          <w:rFonts w:ascii="Times New Roman" w:hAnsi="Times New Roman"/>
-          <w:b w:val="0"/>
-          <w:i w:val="0"/>
-          <w:color w:val="000000"/>
-          <w:sz w:val="26"/>
-        </w:rPr>
-        <w:t>• Chỉ cấp phát 3 quyền cần thiết phục vụ vận hành: GRANT SELECT, INSERT, UPDATE ON ticket_db.* TO 'ticket_user'@'%';</w:t>
-      </w:r>
-    </w:p>
-    <w:p>
-      <w:pPr>
-        <w:spacing w:before="60" w:after="60" w:line="360" w:lineRule="auto"/>
-        <w:ind w:firstLine="720"/>
-        <w:jc w:val="both"/>
-      </w:pPr>
-      <w:r>
-        <w:rPr>
-          <w:rFonts w:ascii="Times New Roman" w:hAnsi="Times New Roman"/>
-          <w:b w:val="0"/>
-          <w:i w:val="0"/>
-          <w:color w:val="000000"/>
-          <w:sz w:val="26"/>
-        </w:rPr>
-        <w:t>• Tuyệt đối không cấp các quyền nguy hiểm: DROP TABLE, ALTER TABLE, SHUTDOWN, GRANT OPTION. Kể cả khi ứng dụng bị tấn công SQL Injection, kẻ tấn công cũng không thể xóa bảng hay thay đổi cấu trúc cơ sở dữ liệu.</w:t>
+        <w:t>Bảng 4.1: So sánh mức độ an toàn trước và sau khi áp dụng Hardening</w:t>
       </w:r>
     </w:p>
     <w:p>
@@ -6077,7 +6155,7 @@
     </w:p>
     <w:p>
       <w:pPr>
-        <w:spacing w:before="240" w:after="160" w:line="312" w:lineRule="auto"/>
+        <w:spacing w:before="280" w:after="160" w:line="312" w:lineRule="auto"/>
         <w:jc w:val="center"/>
       </w:pPr>
       <w:r>
@@ -6093,7 +6171,7 @@
     </w:p>
     <w:p>
       <w:pPr>
-        <w:spacing w:before="60" w:after="60" w:line="360" w:lineRule="auto"/>
+        <w:spacing w:before="60" w:after="60" w:line="336" w:lineRule="auto"/>
         <w:ind w:firstLine="720"/>
         <w:jc w:val="both"/>
       </w:pPr>
@@ -6105,12 +6183,12 @@
           <w:color w:val="000000"/>
           <w:sz w:val="26"/>
         </w:rPr>
-        <w:t>Trải qua 3 giai đoạn nghiên cứu, thiết kế, triển khai và kiểm thử nghiêm túc, bài tập lớn kết thúc học phần môn "Triển khai và Quản trị Hệ thống Phần mềm" với đề tài: "Hệ thống Đặt vé Xem phim &amp; Sự kiện trực tuyến" đã hoàn thành xuất sắc 100% các mục tiêu đề ra:</w:t>
+        <w:t>Báo cáo đã trình bày toàn diện quy trình nghiên cứu, thiết kế, triển khai và bảo mật hệ thống ứng dụng web đặt vé xem phim và sự kiện trực tuyến (Cinestar K23) theo đúng 6 bước yêu cầu của đề tài học phần:</w:t>
       </w:r>
     </w:p>
     <w:p>
       <w:pPr>
-        <w:spacing w:before="60" w:after="60" w:line="360" w:lineRule="auto"/>
+        <w:spacing w:before="60" w:after="60" w:line="336" w:lineRule="auto"/>
         <w:ind w:firstLine="720"/>
         <w:jc w:val="both"/>
       </w:pPr>
@@ -6122,12 +6200,12 @@
           <w:color w:val="000000"/>
           <w:sz w:val="26"/>
         </w:rPr>
-        <w:t>1. Xây dựng ứng dụng Web Full-stack hoàn chỉnh, giao diện Cinema Dark Mode sang trọng, sơ đồ chọn ghế trực quan, thanh toán giả lập và xuất vé điện tử kèm mã QR Code.</w:t>
+        <w:t>1. Xây dựng thành công ứng dụng Web Full-stack động hoàn chỉnh (Node.js/Express, EJS), CSDL MySQL 8.0 chuẩn 3NF, cơ chế chống đặt trùng ghế ACID Transaction (FOR UPDATE) và xuất vé điện tử kèm mã QR Code.</w:t>
       </w:r>
     </w:p>
     <w:p>
       <w:pPr>
-        <w:spacing w:before="60" w:after="60" w:line="360" w:lineRule="auto"/>
+        <w:spacing w:before="60" w:after="60" w:line="336" w:lineRule="auto"/>
         <w:ind w:firstLine="720"/>
         <w:jc w:val="both"/>
       </w:pPr>
@@ -6139,12 +6217,12 @@
           <w:color w:val="000000"/>
           <w:sz w:val="26"/>
         </w:rPr>
-        <w:t>2. Thiết kế và chuẩn hóa cơ sở dữ liệu quan hệ MySQL 8.0 đạt Chuẩn 3NF, xử lý giao dịch ACID chống xung đột ghế ngồi.</w:t>
+        <w:t>2. Đóng gói hệ thống đồng bộ qua Docker Compose với Nginx Reverse Proxy, cấu hình HTTPS tự ký cổng 443 và các tiêu đề Security Headers chuẩn.</w:t>
       </w:r>
     </w:p>
     <w:p>
       <w:pPr>
-        <w:spacing w:before="60" w:after="60" w:line="360" w:lineRule="auto"/>
+        <w:spacing w:before="60" w:after="60" w:line="336" w:lineRule="auto"/>
         <w:ind w:firstLine="720"/>
         <w:jc w:val="both"/>
       </w:pPr>
@@ -6156,12 +6234,12 @@
           <w:color w:val="000000"/>
           <w:sz w:val="26"/>
         </w:rPr>
-        <w:t>3. Triển khai Nginx Reverse Proxy an toàn với chứng chỉ SSL tự ký, chuyển hướng HTTPS, áp dụng đầy đủ các HTTP Security Headers và Rate Limiting chống spam đơn vé.</w:t>
+        <w:t>3. Tích hợp trọn vẹn cụm giám sát Prometheus + Grafana và hệ thống quản trị log tập trung Loki + Promtail, thực thi chính xác các câu truy vấn LogQL.</w:t>
       </w:r>
     </w:p>
     <w:p>
       <w:pPr>
-        <w:spacing w:before="60" w:after="60" w:line="360" w:lineRule="auto"/>
+        <w:spacing w:before="60" w:after="60" w:line="336" w:lineRule="auto"/>
         <w:ind w:firstLine="720"/>
         <w:jc w:val="both"/>
       </w:pPr>
@@ -6173,58 +6251,7 @@
           <w:color w:val="000000"/>
           <w:sz w:val="26"/>
         </w:rPr>
-        <w:t>4. Xây dựng thành công hệ thống giám sát Metrics toàn diện bằng Prometheus + Grafana với cơ chế Provisioning tự động, cào số liệu từ cAdvisor, MySQL, Nginx và Web App.</w:t>
-      </w:r>
-    </w:p>
-    <w:p>
-      <w:pPr>
-        <w:spacing w:before="60" w:after="60" w:line="360" w:lineRule="auto"/>
-        <w:ind w:firstLine="720"/>
-        <w:jc w:val="both"/>
-      </w:pPr>
-      <w:r>
-        <w:rPr>
-          <w:rFonts w:ascii="Times New Roman" w:hAnsi="Times New Roman"/>
-          <w:b w:val="0"/>
-          <w:i w:val="0"/>
-          <w:color w:val="000000"/>
-          <w:sz w:val="26"/>
-        </w:rPr>
-        <w:t>5. Hiện thực hệ thống thu thập log tập trung Loki + Promtail và kiểm thử thành công bộ 3 câu truy vấn LogQL chuẩn hoá.</w:t>
-      </w:r>
-    </w:p>
-    <w:p>
-      <w:pPr>
-        <w:spacing w:before="60" w:after="60" w:line="360" w:lineRule="auto"/>
-        <w:ind w:firstLine="720"/>
-        <w:jc w:val="both"/>
-      </w:pPr>
-      <w:r>
-        <w:rPr>
-          <w:rFonts w:ascii="Times New Roman" w:hAnsi="Times New Roman"/>
-          <w:b w:val="0"/>
-          <w:i w:val="0"/>
-          <w:color w:val="000000"/>
-          <w:sz w:val="26"/>
-        </w:rPr>
-        <w:t>6. Áp dụng 5 giải pháp Hardening an toàn hệ thống chuyên sâu: Non-root container, Network isolation, Database least privilege, Nginx hardening và Resource limits.</w:t>
-      </w:r>
-    </w:p>
-    <w:p>
-      <w:pPr>
-        <w:spacing w:before="60" w:after="60" w:line="360" w:lineRule="auto"/>
-        <w:ind w:firstLine="720"/>
-        <w:jc w:val="both"/>
-      </w:pPr>
-      <w:r>
-        <w:rPr>
-          <w:rFonts w:ascii="Times New Roman" w:hAnsi="Times New Roman"/>
-          <w:b w:val="0"/>
-          <w:i w:val="0"/>
-          <w:color w:val="000000"/>
-          <w:sz w:val="26"/>
-        </w:rPr>
-        <w:t>7. Đóng gói hoàn thiện bộ khởi động tự động 1 chạm RUN.bat giúp hệ thống có thể chạy ngay trên mọi máy tính mà không gặp lỗi.</w:t>
+        <w:t>4. Áp dụng toàn diện 5 giải pháp Hardening an toàn bảo mật và đóng gói kịch bản khởi chạy 1-chạm RUN.bat thông minh với cơ chế Dual-Engine Fallback.</w:t>
       </w:r>
     </w:p>
     <w:p>
@@ -6245,7 +6272,7 @@
     </w:p>
     <w:p>
       <w:pPr>
-        <w:spacing w:before="60" w:after="60" w:line="360" w:lineRule="auto"/>
+        <w:spacing w:before="60" w:after="60" w:line="336" w:lineRule="auto"/>
         <w:ind w:firstLine="720"/>
         <w:jc w:val="both"/>
       </w:pPr>
@@ -6257,12 +6284,12 @@
           <w:color w:val="000000"/>
           <w:sz w:val="26"/>
         </w:rPr>
-        <w:t>• Tích hợp hệ thống hàng đợi thông điệp RabbitMQ hoặc Apache Kafka để xử lý lượng đặt vé siêu lớn trong các đợt mở bán vé ca nhạc (Concert) quy mô hàng vạn người.</w:t>
+        <w:t>• Tích hợp hệ thống phát hiện xâm nhập thời gian thực (IDS/IPS) như Falco hoặc Snort trực tiếp vào Docker containers.</w:t>
       </w:r>
     </w:p>
     <w:p>
       <w:pPr>
-        <w:spacing w:before="60" w:after="60" w:line="360" w:lineRule="auto"/>
+        <w:spacing w:before="60" w:after="60" w:line="336" w:lineRule="auto"/>
         <w:ind w:firstLine="720"/>
         <w:jc w:val="both"/>
       </w:pPr>
@@ -6274,12 +6301,12 @@
           <w:color w:val="000000"/>
           <w:sz w:val="26"/>
         </w:rPr>
-        <w:t>• Nâng cấp kiến trúc lên cụm Kubernetes (K8s) với khả năng tự động co giãn tải (Horizontal Pod Autoscaler - HPA).</w:t>
+        <w:t>• Xây dựng quy trình tự động hóa kiểm thử và triển khai liên tục (CI/CD Pipeline) thông qua GitHub Actions.</w:t>
       </w:r>
     </w:p>
     <w:p>
       <w:pPr>
-        <w:spacing w:before="60" w:after="60" w:line="360" w:lineRule="auto"/>
+        <w:spacing w:before="60" w:after="60" w:line="336" w:lineRule="auto"/>
         <w:ind w:firstLine="720"/>
         <w:jc w:val="both"/>
       </w:pPr>
@@ -6291,7 +6318,7 @@
           <w:color w:val="000000"/>
           <w:sz w:val="26"/>
         </w:rPr>
-        <w:t>• Tích hợp hệ thống cảnh báo Alertmanager gửi thông báo trực tiếp về Telegram hoặc Slack khi máy chủ có sự cố.</w:t>
+        <w:t>• Nâng cấp kiến trúc lên cụm Kubernetes (K8s) kết hợp hệ thống hàng đợi thông điệp RabbitMQ/Kafka để phục vụ các sự kiện bán vé quy mô lớn hàng chục ngàn người.</w:t>
       </w:r>
     </w:p>
     <w:p>
@@ -6301,7 +6328,7 @@
     </w:p>
     <w:p>
       <w:pPr>
-        <w:spacing w:before="240" w:after="160" w:line="312" w:lineRule="auto"/>
+        <w:spacing w:before="280" w:after="160" w:line="312" w:lineRule="auto"/>
         <w:jc w:val="center"/>
       </w:pPr>
       <w:r>
@@ -6317,7 +6344,7 @@
     </w:p>
     <w:p>
       <w:pPr>
-        <w:spacing w:before="60" w:after="60" w:line="360" w:lineRule="auto"/>
+        <w:spacing w:before="60" w:after="60" w:line="336" w:lineRule="auto"/>
         <w:jc w:val="both"/>
       </w:pPr>
       <w:r>
@@ -6333,7 +6360,7 @@
     </w:p>
     <w:p>
       <w:pPr>
-        <w:spacing w:before="60" w:after="60" w:line="360" w:lineRule="auto"/>
+        <w:spacing w:before="60" w:after="60" w:line="336" w:lineRule="auto"/>
         <w:jc w:val="both"/>
       </w:pPr>
       <w:r>
@@ -6349,7 +6376,7 @@
     </w:p>
     <w:p>
       <w:pPr>
-        <w:spacing w:before="60" w:after="60" w:line="360" w:lineRule="auto"/>
+        <w:spacing w:before="60" w:after="60" w:line="336" w:lineRule="auto"/>
         <w:jc w:val="both"/>
       </w:pPr>
       <w:r>
@@ -6365,7 +6392,7 @@
     </w:p>
     <w:p>
       <w:pPr>
-        <w:spacing w:before="60" w:after="60" w:line="360" w:lineRule="auto"/>
+        <w:spacing w:before="60" w:after="60" w:line="336" w:lineRule="auto"/>
         <w:jc w:val="both"/>
       </w:pPr>
       <w:r>
@@ -6381,7 +6408,7 @@
     </w:p>
     <w:p>
       <w:pPr>
-        <w:spacing w:before="60" w:after="60" w:line="360" w:lineRule="auto"/>
+        <w:spacing w:before="60" w:after="60" w:line="336" w:lineRule="auto"/>
         <w:jc w:val="both"/>
       </w:pPr>
       <w:r>
@@ -6397,7 +6424,7 @@
     </w:p>
     <w:p>
       <w:pPr>
-        <w:spacing w:before="60" w:after="60" w:line="360" w:lineRule="auto"/>
+        <w:spacing w:before="60" w:after="60" w:line="336" w:lineRule="auto"/>
         <w:jc w:val="both"/>
       </w:pPr>
       <w:r>
@@ -6413,7 +6440,7 @@
     </w:p>
     <w:p>
       <w:pPr>
-        <w:spacing w:before="60" w:after="60" w:line="360" w:lineRule="auto"/>
+        <w:spacing w:before="60" w:after="60" w:line="336" w:lineRule="auto"/>
         <w:jc w:val="both"/>
       </w:pPr>
       <w:r>
@@ -6434,7 +6461,7 @@
     </w:p>
     <w:p>
       <w:pPr>
-        <w:spacing w:before="240" w:after="160" w:line="312" w:lineRule="auto"/>
+        <w:spacing w:before="280" w:after="160" w:line="312" w:lineRule="auto"/>
         <w:jc w:val="center"/>
       </w:pPr>
       <w:r>
@@ -6461,12 +6488,12 @@
           <w:color w:val="1E293B"/>
           <w:sz w:val="27"/>
         </w:rPr>
-        <w:t>Phụ lục A: Hướng dẫn khởi chạy hệ thống 1 chạm (One-Command Run)</w:t>
+        <w:t>Phụ lục A: Hướng dẫn khởi chạy hệ thống 1 chạm (RUN.bat)</w:t>
       </w:r>
     </w:p>
     <w:p>
       <w:pPr>
-        <w:spacing w:before="60" w:after="60" w:line="360" w:lineRule="auto"/>
+        <w:spacing w:before="60" w:after="60" w:line="336" w:lineRule="auto"/>
         <w:ind w:firstLine="720"/>
         <w:jc w:val="both"/>
       </w:pPr>
@@ -6478,12 +6505,12 @@
           <w:color w:val="000000"/>
           <w:sz w:val="26"/>
         </w:rPr>
-        <w:t>Hệ thống cung cấp tệp RUN.bat tự động hóa hoàn toàn quy trình khởi động trên bất kỳ máy tính nào:</w:t>
+        <w:t>Hệ thống cung cấp kịch bản tự động hóa khởi động RUN.bat trên môi trường Windows:</w:t>
       </w:r>
     </w:p>
     <w:p>
       <w:pPr>
-        <w:spacing w:before="60" w:after="60" w:line="360" w:lineRule="auto"/>
+        <w:spacing w:before="60" w:after="60" w:line="336" w:lineRule="auto"/>
         <w:ind w:firstLine="720"/>
         <w:jc w:val="both"/>
       </w:pPr>
@@ -6500,7 +6527,7 @@
     </w:p>
     <w:p>
       <w:pPr>
-        <w:spacing w:before="60" w:after="60" w:line="360" w:lineRule="auto"/>
+        <w:spacing w:before="60" w:after="60" w:line="336" w:lineRule="auto"/>
         <w:ind w:firstLine="720"/>
         <w:jc w:val="both"/>
       </w:pPr>
@@ -6512,12 +6539,12 @@
           <w:color w:val="000000"/>
           <w:sz w:val="26"/>
         </w:rPr>
-        <w:t>2. Kịch bản tự động phát hiện môi trường: Nếu máy có Docker Desktop, tự động gọi docker compose up -d và bật 2 tab trình duyệt Web (http://localhost) và phpMyAdmin (http://localhost:8080).</w:t>
+        <w:t>2. Kịch bản tự động phát hiện môi trường: Nếu có Docker Desktop, khởi chạy tự động toàn bộ 6 container (Nginx, Node App, MySQL, Prometheus, Grafana, Loki) và tự động mở trình duyệt web tại https://localhost và http://localhost:8080.</w:t>
       </w:r>
     </w:p>
     <w:p>
       <w:pPr>
-        <w:spacing w:before="60" w:after="60" w:line="360" w:lineRule="auto"/>
+        <w:spacing w:before="60" w:after="60" w:line="336" w:lineRule="auto"/>
         <w:ind w:firstLine="720"/>
         <w:jc w:val="both"/>
       </w:pPr>
@@ -6529,12 +6556,12 @@
           <w:color w:val="000000"/>
           <w:sz w:val="26"/>
         </w:rPr>
-        <w:t>3. Nếu máy chưa có Docker, kịch bản tự động kích hoạt chế độ Dual-Engine In-Memory với 180 ghế và các phim hot có sẵn để chạy mượt mà tại http://localhost:3000.</w:t>
+        <w:t>3. Nếu máy chưa cài Docker, kịch bản tự động chuyển sang chế độ Dual-Engine In-Memory để khởi chạy ứng dụng tức thì tại http://localhost:3000.</w:t>
       </w:r>
     </w:p>
     <w:p>
       <w:pPr>
-        <w:spacing w:before="60" w:after="60" w:line="360" w:lineRule="auto"/>
+        <w:spacing w:before="60" w:after="60" w:line="336" w:lineRule="auto"/>
         <w:ind w:firstLine="720"/>
         <w:jc w:val="both"/>
       </w:pPr>
@@ -6546,7 +6573,7 @@
           <w:color w:val="000000"/>
           <w:sz w:val="26"/>
         </w:rPr>
-        <w:t>4. Khi kết thúc buổi trình chiếu hoặc demo, nhấp đúp vào tệp STOP.bat để dừng toàn bộ dịch vụ.</w:t>
+        <w:t>4. Khi kết thúc buổi trình chiếu, nhấp đúp vào STOP.bat để dọn dẹp an toàn toàn bộ tiến trình.</w:t>
       </w:r>
     </w:p>
     <w:p>
@@ -6567,7 +6594,7 @@
     </w:p>
     <w:p>
       <w:pPr>
-        <w:spacing w:before="60" w:after="60" w:line="360" w:lineRule="auto"/>
+        <w:spacing w:before="60" w:after="60" w:line="336" w:lineRule="auto"/>
         <w:ind w:firstLine="720"/>
         <w:jc w:val="both"/>
       </w:pPr>
@@ -6584,7 +6611,7 @@
     </w:p>
     <w:p>
       <w:pPr>
-        <w:spacing w:before="60" w:after="60" w:line="360" w:lineRule="auto"/>
+        <w:spacing w:before="60" w:after="60" w:line="336" w:lineRule="auto"/>
         <w:ind w:firstLine="720"/>
         <w:jc w:val="both"/>
       </w:pPr>
@@ -6596,12 +6623,12 @@
           <w:color w:val="000000"/>
           <w:sz w:val="26"/>
         </w:rPr>
-        <w:t>• Commit 1 (Ngày 1): feat: initialize fullstack ticket booking app, mysql, phpmyadmin, and nginx reverse proxy with ssl (Khởi tạo Web App, CSDL MySQL 3NF, Nginx Reverse Proxy, HTTPS).</w:t>
+        <w:t>• Commit 1 (Ngày 1): feat: initialize fullstack ticket booking app, mysql, phpmyadmin, and nginx reverse proxy with ssl</w:t>
       </w:r>
     </w:p>
     <w:p>
       <w:pPr>
-        <w:spacing w:before="60" w:after="60" w:line="360" w:lineRule="auto"/>
+        <w:spacing w:before="60" w:after="60" w:line="336" w:lineRule="auto"/>
         <w:ind w:firstLine="720"/>
         <w:jc w:val="both"/>
       </w:pPr>
@@ -6613,12 +6640,12 @@
           <w:color w:val="000000"/>
           <w:sz w:val="26"/>
         </w:rPr>
-        <w:t>• Commit 2 (Ngày 2): feat: integrate prometheus and grafana monitoring stack with cadvisor and database metrics (Tích hợp cụm giám sát Prometheus, Grafana, cAdvisor, Exporters).</w:t>
+        <w:t>• Commit 2 (Ngày 2): feat: integrate prometheus and grafana monitoring stack with cadvisor and database metrics</w:t>
       </w:r>
     </w:p>
     <w:p>
       <w:pPr>
-        <w:spacing w:before="60" w:after="60" w:line="360" w:lineRule="auto"/>
+        <w:spacing w:before="60" w:after="60" w:line="336" w:lineRule="auto"/>
         <w:ind w:firstLine="720"/>
         <w:jc w:val="both"/>
       </w:pPr>
@@ -6630,7 +6657,7 @@
           <w:color w:val="000000"/>
           <w:sz w:val="26"/>
         </w:rPr>
-        <w:t>• Commit 3 (Ngày 3): feat: implement centralized logging with loki, promtail and apply system hardening (Tích hợp cụm quản lý log tập trung Loki, Promtail và 5 giải pháp Hardening bảo mật).</w:t>
+        <w:t>• Commit 3 (Ngày 3): feat: implement centralized logging with loki, promtail and apply system hardening</w:t>
       </w:r>
     </w:p>
     <w:sectPr>
@@ -6677,7 +6704,7 @@
         <w:color w:val="787878"/>
         <w:sz w:val="17"/>
       </w:rPr>
-      <w:t>Báo cáo KTHP: Triển khai và Quản trị Hệ thống Phần mềm | SV: Nguyễn Tuấn Đạt</w:t>
+      <w:t>Báo cáo KTHP: Triển khai &amp; Quản trị Hệ thống Phần mềm | SV: Nguyễn Tuấn Đạt - DTC245200452</w:t>
     </w:r>
   </w:p>
 </w:hdr>

</xml_diff>

<commit_message>
style: apply left indent to bullets and center alignments to headings and table titles
</commit_message>
<xml_diff>
--- a/Bao_Cao_KTHP_PTTKHT_De_11_Nguyen_Tuan_Dat.docx
+++ b/Bao_Cao_KTHP_PTTKHT_De_11_Nguyen_Tuan_Dat.docx
@@ -5,6 +5,7 @@
     <w:p>
       <w:pPr>
         <w:spacing w:before="200" w:after="40" w:line="324" w:lineRule="auto"/>
+        <w:ind w:firstLine="0"/>
         <w:jc w:val="center"/>
       </w:pPr>
       <w:r>
@@ -21,6 +22,7 @@
     <w:p>
       <w:pPr>
         <w:spacing w:before="40" w:after="40" w:line="324" w:lineRule="auto"/>
+        <w:ind w:firstLine="0"/>
         <w:jc w:val="center"/>
       </w:pPr>
       <w:r>
@@ -37,6 +39,7 @@
     <w:p>
       <w:pPr>
         <w:spacing w:before="40" w:after="480" w:line="324" w:lineRule="auto"/>
+        <w:ind w:firstLine="0"/>
         <w:jc w:val="center"/>
       </w:pPr>
       <w:r>
@@ -53,6 +56,7 @@
     <w:p>
       <w:pPr>
         <w:spacing w:before="0" w:after="560" w:line="324" w:lineRule="auto"/>
+        <w:ind w:firstLine="0"/>
         <w:jc w:val="center"/>
       </w:pPr>
       <w:r>
@@ -69,6 +73,7 @@
     <w:p>
       <w:pPr>
         <w:spacing w:before="0" w:after="120" w:line="324" w:lineRule="auto"/>
+        <w:ind w:firstLine="0"/>
         <w:jc w:val="center"/>
       </w:pPr>
       <w:r>
@@ -85,6 +90,7 @@
     <w:p>
       <w:pPr>
         <w:spacing w:before="0" w:after="560" w:line="324" w:lineRule="auto"/>
+        <w:ind w:firstLine="0"/>
         <w:jc w:val="center"/>
       </w:pPr>
       <w:r>
@@ -101,6 +107,7 @@
     <w:p>
       <w:pPr>
         <w:spacing w:before="0" w:after="120" w:line="324" w:lineRule="auto"/>
+        <w:ind w:firstLine="0"/>
         <w:jc w:val="center"/>
       </w:pPr>
       <w:r>
@@ -117,6 +124,7 @@
     <w:p>
       <w:pPr>
         <w:spacing w:before="0" w:after="1000" w:line="324" w:lineRule="auto"/>
+        <w:ind w:firstLine="0"/>
         <w:jc w:val="center"/>
       </w:pPr>
       <w:r>
@@ -148,6 +156,7 @@
           <w:p>
             <w:pPr>
               <w:spacing w:before="60" w:after="60" w:line="312" w:lineRule="auto"/>
+              <w:ind w:firstLine="0"/>
               <w:jc w:val="left"/>
             </w:pPr>
             <w:r>
@@ -169,6 +178,7 @@
           <w:p>
             <w:pPr>
               <w:spacing w:before="60" w:after="60" w:line="312" w:lineRule="auto"/>
+              <w:ind w:firstLine="0"/>
               <w:jc w:val="left"/>
             </w:pPr>
             <w:r>
@@ -192,6 +202,7 @@
           <w:p>
             <w:pPr>
               <w:spacing w:before="60" w:after="60" w:line="312" w:lineRule="auto"/>
+              <w:ind w:firstLine="0"/>
               <w:jc w:val="left"/>
             </w:pPr>
             <w:r>
@@ -213,6 +224,7 @@
           <w:p>
             <w:pPr>
               <w:spacing w:before="60" w:after="60" w:line="312" w:lineRule="auto"/>
+              <w:ind w:firstLine="0"/>
               <w:jc w:val="left"/>
             </w:pPr>
             <w:r>
@@ -236,6 +248,7 @@
           <w:p>
             <w:pPr>
               <w:spacing w:before="60" w:after="60" w:line="312" w:lineRule="auto"/>
+              <w:ind w:firstLine="0"/>
               <w:jc w:val="left"/>
             </w:pPr>
             <w:r>
@@ -257,6 +270,7 @@
           <w:p>
             <w:pPr>
               <w:spacing w:before="60" w:after="60" w:line="312" w:lineRule="auto"/>
+              <w:ind w:firstLine="0"/>
               <w:jc w:val="left"/>
             </w:pPr>
             <w:r>
@@ -280,6 +294,7 @@
           <w:p>
             <w:pPr>
               <w:spacing w:before="60" w:after="60" w:line="312" w:lineRule="auto"/>
+              <w:ind w:firstLine="0"/>
               <w:jc w:val="left"/>
             </w:pPr>
             <w:r>
@@ -301,6 +316,7 @@
           <w:p>
             <w:pPr>
               <w:spacing w:before="60" w:after="60" w:line="312" w:lineRule="auto"/>
+              <w:ind w:firstLine="0"/>
               <w:jc w:val="left"/>
             </w:pPr>
             <w:r>
@@ -320,13 +336,14 @@
     <w:p>
       <w:pPr>
         <w:spacing w:before="600" w:after="0" w:line="324" w:lineRule="auto"/>
-        <w:ind w:firstLine="720"/>
+        <w:ind w:firstLine="0"/>
         <w:jc w:val="both"/>
       </w:pPr>
     </w:p>
     <w:p>
       <w:pPr>
         <w:spacing w:before="400" w:after="200" w:line="324" w:lineRule="auto"/>
+        <w:ind w:firstLine="0"/>
         <w:jc w:val="center"/>
       </w:pPr>
       <w:r>
@@ -348,6 +365,7 @@
     <w:p>
       <w:pPr>
         <w:spacing w:before="200" w:after="280" w:line="324" w:lineRule="auto"/>
+        <w:ind w:firstLine="0"/>
         <w:jc w:val="center"/>
       </w:pPr>
       <w:r>
@@ -364,6 +382,7 @@
     <w:p>
       <w:pPr>
         <w:spacing w:before="60" w:after="60" w:line="324" w:lineRule="auto"/>
+        <w:ind w:firstLine="0"/>
         <w:jc w:val="both"/>
       </w:pPr>
       <w:r>
@@ -380,7 +399,7 @@
     <w:p>
       <w:pPr>
         <w:spacing w:before="60" w:after="60" w:line="324" w:lineRule="auto"/>
-        <w:ind w:firstLine="720"/>
+        <w:ind w:firstLine="0"/>
         <w:jc w:val="both"/>
       </w:pPr>
       <w:r>
@@ -397,7 +416,7 @@
     <w:p>
       <w:pPr>
         <w:spacing w:before="60" w:after="60" w:line="324" w:lineRule="auto"/>
-        <w:ind w:firstLine="720"/>
+        <w:ind w:firstLine="0"/>
         <w:jc w:val="both"/>
       </w:pPr>
       <w:r>
@@ -414,6 +433,7 @@
     <w:p>
       <w:pPr>
         <w:spacing w:before="60" w:after="60" w:line="324" w:lineRule="auto"/>
+        <w:ind w:firstLine="0"/>
         <w:jc w:val="both"/>
       </w:pPr>
       <w:r>
@@ -430,7 +450,7 @@
     <w:p>
       <w:pPr>
         <w:spacing w:before="60" w:after="60" w:line="324" w:lineRule="auto"/>
-        <w:ind w:firstLine="720"/>
+        <w:ind w:firstLine="0"/>
         <w:jc w:val="both"/>
       </w:pPr>
       <w:r>
@@ -447,7 +467,7 @@
     <w:p>
       <w:pPr>
         <w:spacing w:before="60" w:after="60" w:line="324" w:lineRule="auto"/>
-        <w:ind w:firstLine="720"/>
+        <w:ind w:firstLine="0"/>
         <w:jc w:val="both"/>
       </w:pPr>
       <w:r>
@@ -464,6 +484,7 @@
     <w:p>
       <w:pPr>
         <w:spacing w:before="60" w:after="60" w:line="324" w:lineRule="auto"/>
+        <w:ind w:firstLine="0"/>
         <w:jc w:val="both"/>
       </w:pPr>
       <w:r>
@@ -480,7 +501,7 @@
     <w:p>
       <w:pPr>
         <w:spacing w:before="60" w:after="60" w:line="324" w:lineRule="auto"/>
-        <w:ind w:firstLine="720"/>
+        <w:ind w:firstLine="0"/>
         <w:jc w:val="both"/>
       </w:pPr>
       <w:r>
@@ -497,7 +518,7 @@
     <w:p>
       <w:pPr>
         <w:spacing w:before="60" w:after="60" w:line="324" w:lineRule="auto"/>
-        <w:ind w:firstLine="720"/>
+        <w:ind w:firstLine="0"/>
         <w:jc w:val="both"/>
       </w:pPr>
       <w:r>
@@ -514,6 +535,7 @@
     <w:p>
       <w:pPr>
         <w:spacing w:before="60" w:after="60" w:line="324" w:lineRule="auto"/>
+        <w:ind w:firstLine="0"/>
         <w:jc w:val="both"/>
       </w:pPr>
       <w:r>
@@ -530,7 +552,7 @@
     <w:p>
       <w:pPr>
         <w:spacing w:before="60" w:after="60" w:line="324" w:lineRule="auto"/>
-        <w:ind w:firstLine="720"/>
+        <w:ind w:firstLine="0"/>
         <w:jc w:val="both"/>
       </w:pPr>
       <w:r>
@@ -547,7 +569,7 @@
     <w:p>
       <w:pPr>
         <w:spacing w:before="60" w:after="60" w:line="324" w:lineRule="auto"/>
-        <w:ind w:firstLine="720"/>
+        <w:ind w:firstLine="0"/>
         <w:jc w:val="both"/>
       </w:pPr>
       <w:r>
@@ -564,6 +586,7 @@
     <w:p>
       <w:pPr>
         <w:spacing w:before="160" w:after="60" w:line="324" w:lineRule="auto"/>
+        <w:ind w:firstLine="0"/>
         <w:jc w:val="both"/>
       </w:pPr>
       <w:r>
@@ -605,6 +628,7 @@
           <w:p>
             <w:pPr>
               <w:spacing w:before="80" w:after="80" w:line="300" w:lineRule="auto"/>
+              <w:ind w:firstLine="0"/>
               <w:jc w:val="center"/>
             </w:pPr>
             <w:r>
@@ -626,6 +650,7 @@
           <w:p>
             <w:pPr>
               <w:spacing w:before="80" w:after="80" w:line="300" w:lineRule="auto"/>
+              <w:ind w:firstLine="0"/>
               <w:jc w:val="center"/>
             </w:pPr>
             <w:r>
@@ -647,6 +672,7 @@
           <w:p>
             <w:pPr>
               <w:spacing w:before="80" w:after="80" w:line="300" w:lineRule="auto"/>
+              <w:ind w:firstLine="0"/>
               <w:jc w:val="center"/>
             </w:pPr>
             <w:r>
@@ -668,6 +694,7 @@
           <w:p>
             <w:pPr>
               <w:spacing w:before="80" w:after="80" w:line="300" w:lineRule="auto"/>
+              <w:ind w:firstLine="0"/>
               <w:jc w:val="center"/>
             </w:pPr>
             <w:r>
@@ -691,6 +718,7 @@
           <w:p>
             <w:pPr>
               <w:spacing w:before="60" w:after="60" w:line="300" w:lineRule="auto"/>
+              <w:ind w:firstLine="0"/>
               <w:jc w:val="center"/>
             </w:pPr>
             <w:r>
@@ -712,6 +740,7 @@
           <w:p>
             <w:pPr>
               <w:spacing w:before="60" w:after="60" w:line="300" w:lineRule="auto"/>
+              <w:ind w:firstLine="0"/>
               <w:jc w:val="left"/>
             </w:pPr>
             <w:r>
@@ -733,7 +762,8 @@
           <w:p>
             <w:pPr>
               <w:spacing w:before="60" w:after="60" w:line="300" w:lineRule="auto"/>
-              <w:jc w:val="left"/>
+              <w:ind w:firstLine="0"/>
+              <w:jc w:val="center"/>
             </w:pPr>
             <w:r>
               <w:rPr>
@@ -754,6 +784,7 @@
           <w:p>
             <w:pPr>
               <w:spacing w:before="60" w:after="60" w:line="300" w:lineRule="auto"/>
+              <w:ind w:firstLine="0"/>
               <w:jc w:val="center"/>
             </w:pPr>
             <w:r>
@@ -776,6 +807,7 @@
           <w:p>
             <w:pPr>
               <w:spacing w:before="60" w:after="60" w:line="300" w:lineRule="auto"/>
+              <w:ind w:firstLine="0"/>
               <w:jc w:val="center"/>
             </w:pPr>
             <w:r>
@@ -797,6 +829,7 @@
           <w:p>
             <w:pPr>
               <w:spacing w:before="60" w:after="60" w:line="300" w:lineRule="auto"/>
+              <w:ind w:firstLine="0"/>
               <w:jc w:val="left"/>
             </w:pPr>
             <w:r>
@@ -818,7 +851,8 @@
           <w:p>
             <w:pPr>
               <w:spacing w:before="60" w:after="60" w:line="300" w:lineRule="auto"/>
-              <w:jc w:val="left"/>
+              <w:ind w:firstLine="0"/>
+              <w:jc w:val="center"/>
             </w:pPr>
             <w:r>
               <w:rPr>
@@ -839,6 +873,7 @@
           <w:p>
             <w:pPr>
               <w:spacing w:before="60" w:after="60" w:line="300" w:lineRule="auto"/>
+              <w:ind w:firstLine="0"/>
               <w:jc w:val="center"/>
             </w:pPr>
             <w:r>
@@ -861,6 +896,7 @@
           <w:p>
             <w:pPr>
               <w:spacing w:before="60" w:after="60" w:line="300" w:lineRule="auto"/>
+              <w:ind w:firstLine="0"/>
               <w:jc w:val="center"/>
             </w:pPr>
             <w:r>
@@ -882,6 +918,7 @@
           <w:p>
             <w:pPr>
               <w:spacing w:before="60" w:after="60" w:line="300" w:lineRule="auto"/>
+              <w:ind w:firstLine="0"/>
               <w:jc w:val="left"/>
             </w:pPr>
             <w:r>
@@ -903,7 +940,8 @@
           <w:p>
             <w:pPr>
               <w:spacing w:before="60" w:after="60" w:line="300" w:lineRule="auto"/>
-              <w:jc w:val="left"/>
+              <w:ind w:firstLine="0"/>
+              <w:jc w:val="center"/>
             </w:pPr>
             <w:r>
               <w:rPr>
@@ -924,6 +962,7 @@
           <w:p>
             <w:pPr>
               <w:spacing w:before="60" w:after="60" w:line="300" w:lineRule="auto"/>
+              <w:ind w:firstLine="0"/>
               <w:jc w:val="center"/>
             </w:pPr>
             <w:r>
@@ -946,6 +985,7 @@
           <w:p>
             <w:pPr>
               <w:spacing w:before="60" w:after="60" w:line="300" w:lineRule="auto"/>
+              <w:ind w:firstLine="0"/>
               <w:jc w:val="center"/>
             </w:pPr>
             <w:r>
@@ -967,6 +1007,7 @@
           <w:p>
             <w:pPr>
               <w:spacing w:before="60" w:after="60" w:line="300" w:lineRule="auto"/>
+              <w:ind w:firstLine="0"/>
               <w:jc w:val="left"/>
             </w:pPr>
             <w:r>
@@ -988,7 +1029,8 @@
           <w:p>
             <w:pPr>
               <w:spacing w:before="60" w:after="60" w:line="300" w:lineRule="auto"/>
-              <w:jc w:val="left"/>
+              <w:ind w:firstLine="0"/>
+              <w:jc w:val="center"/>
             </w:pPr>
             <w:r>
               <w:rPr>
@@ -1009,6 +1051,7 @@
           <w:p>
             <w:pPr>
               <w:spacing w:before="60" w:after="60" w:line="300" w:lineRule="auto"/>
+              <w:ind w:firstLine="0"/>
               <w:jc w:val="center"/>
             </w:pPr>
             <w:r>
@@ -1031,6 +1074,7 @@
           <w:p>
             <w:pPr>
               <w:spacing w:before="60" w:after="60" w:line="300" w:lineRule="auto"/>
+              <w:ind w:firstLine="0"/>
               <w:jc w:val="center"/>
             </w:pPr>
             <w:r>
@@ -1052,6 +1096,7 @@
           <w:p>
             <w:pPr>
               <w:spacing w:before="60" w:after="60" w:line="300" w:lineRule="auto"/>
+              <w:ind w:firstLine="0"/>
               <w:jc w:val="left"/>
             </w:pPr>
             <w:r>
@@ -1073,7 +1118,8 @@
           <w:p>
             <w:pPr>
               <w:spacing w:before="60" w:after="60" w:line="300" w:lineRule="auto"/>
-              <w:jc w:val="left"/>
+              <w:ind w:firstLine="0"/>
+              <w:jc w:val="center"/>
             </w:pPr>
             <w:r>
               <w:rPr>
@@ -1094,6 +1140,7 @@
           <w:p>
             <w:pPr>
               <w:spacing w:before="60" w:after="60" w:line="300" w:lineRule="auto"/>
+              <w:ind w:firstLine="0"/>
               <w:jc w:val="center"/>
             </w:pPr>
             <w:r>
@@ -1116,6 +1163,7 @@
           <w:p>
             <w:pPr>
               <w:spacing w:before="60" w:after="60" w:line="300" w:lineRule="auto"/>
+              <w:ind w:firstLine="0"/>
               <w:jc w:val="center"/>
             </w:pPr>
             <w:r>
@@ -1137,6 +1185,7 @@
           <w:p>
             <w:pPr>
               <w:spacing w:before="60" w:after="60" w:line="300" w:lineRule="auto"/>
+              <w:ind w:firstLine="0"/>
               <w:jc w:val="left"/>
             </w:pPr>
             <w:r>
@@ -1158,7 +1207,8 @@
           <w:p>
             <w:pPr>
               <w:spacing w:before="60" w:after="60" w:line="300" w:lineRule="auto"/>
-              <w:jc w:val="left"/>
+              <w:ind w:firstLine="0"/>
+              <w:jc w:val="center"/>
             </w:pPr>
             <w:r>
               <w:rPr>
@@ -1179,6 +1229,7 @@
           <w:p>
             <w:pPr>
               <w:spacing w:before="60" w:after="60" w:line="300" w:lineRule="auto"/>
+              <w:ind w:firstLine="0"/>
               <w:jc w:val="center"/>
             </w:pPr>
             <w:r>
@@ -1201,6 +1252,7 @@
           <w:p>
             <w:pPr>
               <w:spacing w:before="60" w:after="60" w:line="300" w:lineRule="auto"/>
+              <w:ind w:firstLine="0"/>
               <w:jc w:val="center"/>
             </w:pPr>
             <w:r>
@@ -1222,6 +1274,7 @@
           <w:p>
             <w:pPr>
               <w:spacing w:before="60" w:after="60" w:line="300" w:lineRule="auto"/>
+              <w:ind w:firstLine="0"/>
               <w:jc w:val="left"/>
             </w:pPr>
             <w:r>
@@ -1243,7 +1296,8 @@
           <w:p>
             <w:pPr>
               <w:spacing w:before="60" w:after="60" w:line="300" w:lineRule="auto"/>
-              <w:jc w:val="left"/>
+              <w:ind w:firstLine="0"/>
+              <w:jc w:val="center"/>
             </w:pPr>
             <w:r>
               <w:rPr>
@@ -1264,6 +1318,7 @@
           <w:p>
             <w:pPr>
               <w:spacing w:before="60" w:after="60" w:line="300" w:lineRule="auto"/>
+              <w:ind w:firstLine="0"/>
               <w:jc w:val="center"/>
             </w:pPr>
             <w:r>
@@ -1282,6 +1337,7 @@
     <w:p>
       <w:pPr>
         <w:spacing w:before="320" w:after="60" w:line="324" w:lineRule="auto"/>
+        <w:ind w:firstLine="0"/>
         <w:jc w:val="right"/>
       </w:pPr>
       <w:r>
@@ -1298,6 +1354,7 @@
     <w:p>
       <w:pPr>
         <w:spacing w:before="80" w:after="60" w:line="324" w:lineRule="auto"/>
+        <w:ind w:firstLine="0"/>
         <w:jc w:val="right"/>
       </w:pPr>
       <w:r>
@@ -1321,6 +1378,7 @@
     <w:p>
       <w:pPr>
         <w:spacing w:before="200" w:after="280" w:line="324" w:lineRule="auto"/>
+        <w:ind w:firstLine="0"/>
         <w:jc w:val="center"/>
       </w:pPr>
       <w:r>
@@ -1388,6 +1446,7 @@
     <w:p>
       <w:pPr>
         <w:spacing w:before="320" w:after="60" w:line="324" w:lineRule="auto"/>
+        <w:ind w:firstLine="0"/>
         <w:jc w:val="right"/>
       </w:pPr>
       <w:r>
@@ -1404,6 +1463,7 @@
     <w:p>
       <w:pPr>
         <w:spacing w:before="480" w:after="280" w:line="324" w:lineRule="auto"/>
+        <w:ind w:firstLine="0"/>
         <w:jc w:val="center"/>
       </w:pPr>
       <w:r>
@@ -1476,6 +1536,7 @@
     <w:p>
       <w:pPr>
         <w:spacing w:before="200" w:after="280" w:line="324" w:lineRule="auto"/>
+        <w:ind w:firstLine="0"/>
         <w:jc w:val="center"/>
       </w:pPr>
       <w:r>
@@ -1516,6 +1577,7 @@
           <w:p>
             <w:pPr>
               <w:spacing w:before="80" w:after="80" w:line="300" w:lineRule="auto"/>
+              <w:ind w:firstLine="0"/>
               <w:jc w:val="center"/>
             </w:pPr>
             <w:r>
@@ -1537,6 +1599,7 @@
           <w:p>
             <w:pPr>
               <w:spacing w:before="80" w:after="80" w:line="300" w:lineRule="auto"/>
+              <w:ind w:firstLine="0"/>
               <w:jc w:val="center"/>
             </w:pPr>
             <w:r>
@@ -1558,6 +1621,7 @@
           <w:p>
             <w:pPr>
               <w:spacing w:before="80" w:after="80" w:line="300" w:lineRule="auto"/>
+              <w:ind w:firstLine="0"/>
               <w:jc w:val="center"/>
             </w:pPr>
             <w:r>
@@ -1581,6 +1645,7 @@
           <w:p>
             <w:pPr>
               <w:spacing w:before="60" w:after="60" w:line="300" w:lineRule="auto"/>
+              <w:ind w:firstLine="0"/>
               <w:jc w:val="center"/>
             </w:pPr>
             <w:r>
@@ -1602,7 +1667,8 @@
           <w:p>
             <w:pPr>
               <w:spacing w:before="60" w:after="60" w:line="300" w:lineRule="auto"/>
-              <w:jc w:val="left"/>
+              <w:ind w:firstLine="0"/>
+              <w:jc w:val="center"/>
             </w:pPr>
             <w:r>
               <w:rPr>
@@ -1623,7 +1689,8 @@
           <w:p>
             <w:pPr>
               <w:spacing w:before="60" w:after="60" w:line="300" w:lineRule="auto"/>
-              <w:jc w:val="center"/>
+              <w:ind w:firstLine="0"/>
+              <w:jc w:val="left"/>
             </w:pPr>
             <w:r>
               <w:rPr>
@@ -1646,6 +1713,7 @@
           <w:p>
             <w:pPr>
               <w:spacing w:before="60" w:after="60" w:line="300" w:lineRule="auto"/>
+              <w:ind w:firstLine="0"/>
               <w:jc w:val="center"/>
             </w:pPr>
             <w:r>
@@ -1667,7 +1735,8 @@
           <w:p>
             <w:pPr>
               <w:spacing w:before="60" w:after="60" w:line="300" w:lineRule="auto"/>
-              <w:jc w:val="left"/>
+              <w:ind w:firstLine="0"/>
+              <w:jc w:val="center"/>
             </w:pPr>
             <w:r>
               <w:rPr>
@@ -1688,7 +1757,8 @@
           <w:p>
             <w:pPr>
               <w:spacing w:before="60" w:after="60" w:line="300" w:lineRule="auto"/>
-              <w:jc w:val="center"/>
+              <w:ind w:firstLine="0"/>
+              <w:jc w:val="left"/>
             </w:pPr>
             <w:r>
               <w:rPr>
@@ -1711,6 +1781,7 @@
           <w:p>
             <w:pPr>
               <w:spacing w:before="60" w:after="60" w:line="300" w:lineRule="auto"/>
+              <w:ind w:firstLine="0"/>
               <w:jc w:val="center"/>
             </w:pPr>
             <w:r>
@@ -1732,7 +1803,8 @@
           <w:p>
             <w:pPr>
               <w:spacing w:before="60" w:after="60" w:line="300" w:lineRule="auto"/>
-              <w:jc w:val="left"/>
+              <w:ind w:firstLine="0"/>
+              <w:jc w:val="center"/>
             </w:pPr>
             <w:r>
               <w:rPr>
@@ -1753,7 +1825,8 @@
           <w:p>
             <w:pPr>
               <w:spacing w:before="60" w:after="60" w:line="300" w:lineRule="auto"/>
-              <w:jc w:val="center"/>
+              <w:ind w:firstLine="0"/>
+              <w:jc w:val="left"/>
             </w:pPr>
             <w:r>
               <w:rPr>
@@ -1776,6 +1849,7 @@
           <w:p>
             <w:pPr>
               <w:spacing w:before="60" w:after="60" w:line="300" w:lineRule="auto"/>
+              <w:ind w:firstLine="0"/>
               <w:jc w:val="center"/>
             </w:pPr>
             <w:r>
@@ -1797,7 +1871,8 @@
           <w:p>
             <w:pPr>
               <w:spacing w:before="60" w:after="60" w:line="300" w:lineRule="auto"/>
-              <w:jc w:val="left"/>
+              <w:ind w:firstLine="0"/>
+              <w:jc w:val="center"/>
             </w:pPr>
             <w:r>
               <w:rPr>
@@ -1818,7 +1893,8 @@
           <w:p>
             <w:pPr>
               <w:spacing w:before="60" w:after="60" w:line="300" w:lineRule="auto"/>
-              <w:jc w:val="center"/>
+              <w:ind w:firstLine="0"/>
+              <w:jc w:val="left"/>
             </w:pPr>
             <w:r>
               <w:rPr>
@@ -1841,6 +1917,7 @@
           <w:p>
             <w:pPr>
               <w:spacing w:before="60" w:after="60" w:line="300" w:lineRule="auto"/>
+              <w:ind w:firstLine="0"/>
               <w:jc w:val="center"/>
             </w:pPr>
             <w:r>
@@ -1862,7 +1939,8 @@
           <w:p>
             <w:pPr>
               <w:spacing w:before="60" w:after="60" w:line="300" w:lineRule="auto"/>
-              <w:jc w:val="left"/>
+              <w:ind w:firstLine="0"/>
+              <w:jc w:val="center"/>
             </w:pPr>
             <w:r>
               <w:rPr>
@@ -1883,7 +1961,8 @@
           <w:p>
             <w:pPr>
               <w:spacing w:before="60" w:after="60" w:line="300" w:lineRule="auto"/>
-              <w:jc w:val="center"/>
+              <w:ind w:firstLine="0"/>
+              <w:jc w:val="left"/>
             </w:pPr>
             <w:r>
               <w:rPr>
@@ -1906,6 +1985,7 @@
           <w:p>
             <w:pPr>
               <w:spacing w:before="60" w:after="60" w:line="300" w:lineRule="auto"/>
+              <w:ind w:firstLine="0"/>
               <w:jc w:val="center"/>
             </w:pPr>
             <w:r>
@@ -1927,7 +2007,8 @@
           <w:p>
             <w:pPr>
               <w:spacing w:before="60" w:after="60" w:line="300" w:lineRule="auto"/>
-              <w:jc w:val="left"/>
+              <w:ind w:firstLine="0"/>
+              <w:jc w:val="center"/>
             </w:pPr>
             <w:r>
               <w:rPr>
@@ -1948,7 +2029,8 @@
           <w:p>
             <w:pPr>
               <w:spacing w:before="60" w:after="60" w:line="300" w:lineRule="auto"/>
-              <w:jc w:val="center"/>
+              <w:ind w:firstLine="0"/>
+              <w:jc w:val="left"/>
             </w:pPr>
             <w:r>
               <w:rPr>
@@ -1971,6 +2053,7 @@
           <w:p>
             <w:pPr>
               <w:spacing w:before="60" w:after="60" w:line="300" w:lineRule="auto"/>
+              <w:ind w:firstLine="0"/>
               <w:jc w:val="center"/>
             </w:pPr>
             <w:r>
@@ -1992,7 +2075,8 @@
           <w:p>
             <w:pPr>
               <w:spacing w:before="60" w:after="60" w:line="300" w:lineRule="auto"/>
-              <w:jc w:val="left"/>
+              <w:ind w:firstLine="0"/>
+              <w:jc w:val="center"/>
             </w:pPr>
             <w:r>
               <w:rPr>
@@ -2013,7 +2097,8 @@
           <w:p>
             <w:pPr>
               <w:spacing w:before="60" w:after="60" w:line="300" w:lineRule="auto"/>
-              <w:jc w:val="center"/>
+              <w:ind w:firstLine="0"/>
+              <w:jc w:val="left"/>
             </w:pPr>
             <w:r>
               <w:rPr>
@@ -2036,6 +2121,7 @@
           <w:p>
             <w:pPr>
               <w:spacing w:before="60" w:after="60" w:line="300" w:lineRule="auto"/>
+              <w:ind w:firstLine="0"/>
               <w:jc w:val="center"/>
             </w:pPr>
             <w:r>
@@ -2057,7 +2143,8 @@
           <w:p>
             <w:pPr>
               <w:spacing w:before="60" w:after="60" w:line="300" w:lineRule="auto"/>
-              <w:jc w:val="left"/>
+              <w:ind w:firstLine="0"/>
+              <w:jc w:val="center"/>
             </w:pPr>
             <w:r>
               <w:rPr>
@@ -2078,7 +2165,8 @@
           <w:p>
             <w:pPr>
               <w:spacing w:before="60" w:after="60" w:line="300" w:lineRule="auto"/>
-              <w:jc w:val="center"/>
+              <w:ind w:firstLine="0"/>
+              <w:jc w:val="left"/>
             </w:pPr>
             <w:r>
               <w:rPr>
@@ -2101,6 +2189,7 @@
           <w:p>
             <w:pPr>
               <w:spacing w:before="60" w:after="60" w:line="300" w:lineRule="auto"/>
+              <w:ind w:firstLine="0"/>
               <w:jc w:val="center"/>
             </w:pPr>
             <w:r>
@@ -2122,7 +2211,8 @@
           <w:p>
             <w:pPr>
               <w:spacing w:before="60" w:after="60" w:line="300" w:lineRule="auto"/>
-              <w:jc w:val="left"/>
+              <w:ind w:firstLine="0"/>
+              <w:jc w:val="center"/>
             </w:pPr>
             <w:r>
               <w:rPr>
@@ -2143,7 +2233,8 @@
           <w:p>
             <w:pPr>
               <w:spacing w:before="60" w:after="60" w:line="300" w:lineRule="auto"/>
-              <w:jc w:val="center"/>
+              <w:ind w:firstLine="0"/>
+              <w:jc w:val="left"/>
             </w:pPr>
             <w:r>
               <w:rPr>
@@ -2166,6 +2257,7 @@
           <w:p>
             <w:pPr>
               <w:spacing w:before="60" w:after="60" w:line="300" w:lineRule="auto"/>
+              <w:ind w:firstLine="0"/>
               <w:jc w:val="center"/>
             </w:pPr>
             <w:r>
@@ -2187,7 +2279,8 @@
           <w:p>
             <w:pPr>
               <w:spacing w:before="60" w:after="60" w:line="300" w:lineRule="auto"/>
-              <w:jc w:val="left"/>
+              <w:ind w:firstLine="0"/>
+              <w:jc w:val="center"/>
             </w:pPr>
             <w:r>
               <w:rPr>
@@ -2208,7 +2301,8 @@
           <w:p>
             <w:pPr>
               <w:spacing w:before="60" w:after="60" w:line="300" w:lineRule="auto"/>
-              <w:jc w:val="center"/>
+              <w:ind w:firstLine="0"/>
+              <w:jc w:val="left"/>
             </w:pPr>
             <w:r>
               <w:rPr>
@@ -2227,6 +2321,7 @@
     <w:p>
       <w:pPr>
         <w:spacing w:before="400" w:after="160" w:line="324" w:lineRule="auto"/>
+        <w:ind w:firstLine="0"/>
         <w:jc w:val="left"/>
       </w:pPr>
       <w:r>
@@ -2242,10 +2337,20 @@
     </w:p>
     <w:p>
       <w:pPr>
-        <w:spacing w:before="60" w:after="60" w:line="324" w:lineRule="auto"/>
-        <w:ind w:firstLine="720"/>
+        <w:spacing w:before="50" w:after="50" w:line="324" w:lineRule="auto"/>
+        <w:ind w:left="720" w:hanging="283"/>
         <w:jc w:val="both"/>
       </w:pPr>
+      <w:r>
+        <w:rPr>
+          <w:rFonts w:ascii="Times New Roman" w:hAnsi="Times New Roman"/>
+          <w:b/>
+          <w:i w:val="0"/>
+          <w:color w:val="000000"/>
+          <w:sz w:val="28"/>
+        </w:rPr>
+        <w:t xml:space="preserve">• </w:t>
+      </w:r>
       <w:r>
         <w:rPr>
           <w:rFonts w:ascii="Times New Roman" w:hAnsi="Times New Roman"/>
@@ -2259,10 +2364,20 @@
     </w:p>
     <w:p>
       <w:pPr>
-        <w:spacing w:before="60" w:after="60" w:line="324" w:lineRule="auto"/>
-        <w:ind w:firstLine="720"/>
+        <w:spacing w:before="50" w:after="50" w:line="324" w:lineRule="auto"/>
+        <w:ind w:left="720" w:hanging="283"/>
         <w:jc w:val="both"/>
       </w:pPr>
+      <w:r>
+        <w:rPr>
+          <w:rFonts w:ascii="Times New Roman" w:hAnsi="Times New Roman"/>
+          <w:b/>
+          <w:i w:val="0"/>
+          <w:color w:val="000000"/>
+          <w:sz w:val="28"/>
+        </w:rPr>
+        <w:t xml:space="preserve">• </w:t>
+      </w:r>
       <w:r>
         <w:rPr>
           <w:rFonts w:ascii="Times New Roman" w:hAnsi="Times New Roman"/>
@@ -2276,10 +2391,20 @@
     </w:p>
     <w:p>
       <w:pPr>
-        <w:spacing w:before="60" w:after="60" w:line="324" w:lineRule="auto"/>
-        <w:ind w:firstLine="720"/>
+        <w:spacing w:before="50" w:after="50" w:line="324" w:lineRule="auto"/>
+        <w:ind w:left="720" w:hanging="283"/>
         <w:jc w:val="both"/>
       </w:pPr>
+      <w:r>
+        <w:rPr>
+          <w:rFonts w:ascii="Times New Roman" w:hAnsi="Times New Roman"/>
+          <w:b/>
+          <w:i w:val="0"/>
+          <w:color w:val="000000"/>
+          <w:sz w:val="28"/>
+        </w:rPr>
+        <w:t xml:space="preserve">• </w:t>
+      </w:r>
       <w:r>
         <w:rPr>
           <w:rFonts w:ascii="Times New Roman" w:hAnsi="Times New Roman"/>
@@ -2293,10 +2418,20 @@
     </w:p>
     <w:p>
       <w:pPr>
-        <w:spacing w:before="60" w:after="60" w:line="324" w:lineRule="auto"/>
-        <w:ind w:firstLine="720"/>
+        <w:spacing w:before="50" w:after="50" w:line="324" w:lineRule="auto"/>
+        <w:ind w:left="720" w:hanging="283"/>
         <w:jc w:val="both"/>
       </w:pPr>
+      <w:r>
+        <w:rPr>
+          <w:rFonts w:ascii="Times New Roman" w:hAnsi="Times New Roman"/>
+          <w:b/>
+          <w:i w:val="0"/>
+          <w:color w:val="000000"/>
+          <w:sz w:val="28"/>
+        </w:rPr>
+        <w:t xml:space="preserve">• </w:t>
+      </w:r>
       <w:r>
         <w:rPr>
           <w:rFonts w:ascii="Times New Roman" w:hAnsi="Times New Roman"/>
@@ -2310,10 +2445,20 @@
     </w:p>
     <w:p>
       <w:pPr>
-        <w:spacing w:before="60" w:after="60" w:line="324" w:lineRule="auto"/>
-        <w:ind w:firstLine="720"/>
+        <w:spacing w:before="50" w:after="50" w:line="324" w:lineRule="auto"/>
+        <w:ind w:left="720" w:hanging="283"/>
         <w:jc w:val="both"/>
       </w:pPr>
+      <w:r>
+        <w:rPr>
+          <w:rFonts w:ascii="Times New Roman" w:hAnsi="Times New Roman"/>
+          <w:b/>
+          <w:i w:val="0"/>
+          <w:color w:val="000000"/>
+          <w:sz w:val="28"/>
+        </w:rPr>
+        <w:t xml:space="preserve">• </w:t>
+      </w:r>
       <w:r>
         <w:rPr>
           <w:rFonts w:ascii="Times New Roman" w:hAnsi="Times New Roman"/>
@@ -2327,10 +2472,20 @@
     </w:p>
     <w:p>
       <w:pPr>
-        <w:spacing w:before="60" w:after="60" w:line="324" w:lineRule="auto"/>
-        <w:ind w:firstLine="720"/>
+        <w:spacing w:before="50" w:after="50" w:line="324" w:lineRule="auto"/>
+        <w:ind w:left="720" w:hanging="283"/>
         <w:jc w:val="both"/>
       </w:pPr>
+      <w:r>
+        <w:rPr>
+          <w:rFonts w:ascii="Times New Roman" w:hAnsi="Times New Roman"/>
+          <w:b/>
+          <w:i w:val="0"/>
+          <w:color w:val="000000"/>
+          <w:sz w:val="28"/>
+        </w:rPr>
+        <w:t xml:space="preserve">• </w:t>
+      </w:r>
       <w:r>
         <w:rPr>
           <w:rFonts w:ascii="Times New Roman" w:hAnsi="Times New Roman"/>
@@ -2350,6 +2505,7 @@
     <w:p>
       <w:pPr>
         <w:spacing w:before="280" w:after="160" w:line="312" w:lineRule="auto"/>
+        <w:ind w:firstLine="0"/>
         <w:jc w:val="center"/>
       </w:pPr>
       <w:r>
@@ -2366,6 +2522,7 @@
     <w:p>
       <w:pPr>
         <w:spacing w:before="200" w:after="80" w:line="312" w:lineRule="auto"/>
+        <w:ind w:firstLine="0"/>
         <w:jc w:val="left"/>
       </w:pPr>
       <w:r>
@@ -2398,10 +2555,20 @@
     </w:p>
     <w:p>
       <w:pPr>
-        <w:spacing w:before="60" w:after="60" w:line="324" w:lineRule="auto"/>
-        <w:ind w:firstLine="720"/>
+        <w:spacing w:before="50" w:after="50" w:line="324" w:lineRule="auto"/>
+        <w:ind w:left="720" w:hanging="283"/>
         <w:jc w:val="both"/>
       </w:pPr>
+      <w:r>
+        <w:rPr>
+          <w:rFonts w:ascii="Times New Roman" w:hAnsi="Times New Roman"/>
+          <w:b/>
+          <w:i w:val="0"/>
+          <w:color w:val="000000"/>
+          <w:sz w:val="28"/>
+        </w:rPr>
+        <w:t xml:space="preserve">• </w:t>
+      </w:r>
       <w:r>
         <w:rPr>
           <w:rFonts w:ascii="Times New Roman" w:hAnsi="Times New Roman"/>
@@ -2410,15 +2577,25 @@
           <w:color w:val="000000"/>
           <w:sz w:val="28"/>
         </w:rPr>
-        <w:t>• Nginx Reverse Proxy: Đóng vai trò cổng giao tiếp chính (API Gateway) đón nhận toàn bộ request từ người dùng ngoài Internet qua cổng 80 (HTTP) và 443 (HTTPS), thực hiện giải mã SSL (SSL Termination), áp dụng các Security Headers bảo vệ và phân phối tải về container ứng dụng.</w:t>
+        <w:t>Nginx Reverse Proxy: Đóng vai trò cổng giao tiếp chính (API Gateway) đón nhận toàn bộ request từ người dùng ngoài Internet qua cổng 80 (HTTP) và 443 (HTTPS), thực hiện giải mã SSL (SSL Termination), áp dụng các Security Headers bảo vệ và phân phối tải về container ứng dụng.</w:t>
       </w:r>
     </w:p>
     <w:p>
       <w:pPr>
-        <w:spacing w:before="60" w:after="60" w:line="324" w:lineRule="auto"/>
-        <w:ind w:firstLine="720"/>
+        <w:spacing w:before="50" w:after="50" w:line="324" w:lineRule="auto"/>
+        <w:ind w:left="720" w:hanging="283"/>
         <w:jc w:val="both"/>
       </w:pPr>
+      <w:r>
+        <w:rPr>
+          <w:rFonts w:ascii="Times New Roman" w:hAnsi="Times New Roman"/>
+          <w:b/>
+          <w:i w:val="0"/>
+          <w:color w:val="000000"/>
+          <w:sz w:val="28"/>
+        </w:rPr>
+        <w:t xml:space="preserve">• </w:t>
+      </w:r>
       <w:r>
         <w:rPr>
           <w:rFonts w:ascii="Times New Roman" w:hAnsi="Times New Roman"/>
@@ -2427,15 +2604,25 @@
           <w:color w:val="000000"/>
           <w:sz w:val="28"/>
         </w:rPr>
-        <w:t>• Ứng dụng Web &amp; Database: Ứng dụng Full-stack động viết bằng Node.js/Express chạy trên cổng nội bộ 3000, kết nối trực tiếp với CSDL quan hệ MySQL 8.0 chuẩn 3NF và dịch vụ quản trị trực quan phpMyAdmin qua mạng cách ly.</w:t>
+        <w:t>Ứng dụng Web &amp; Database: Ứng dụng Full-stack động viết bằng Node.js/Express chạy trên cổng nội bộ 3000, kết nối trực tiếp với CSDL quan hệ MySQL 8.0 chuẩn 3NF và dịch vụ quản trị trực quan phpMyAdmin qua mạng cách ly.</w:t>
       </w:r>
     </w:p>
     <w:p>
       <w:pPr>
-        <w:spacing w:before="60" w:after="60" w:line="324" w:lineRule="auto"/>
-        <w:ind w:firstLine="720"/>
+        <w:spacing w:before="50" w:after="50" w:line="324" w:lineRule="auto"/>
+        <w:ind w:left="720" w:hanging="283"/>
         <w:jc w:val="both"/>
       </w:pPr>
+      <w:r>
+        <w:rPr>
+          <w:rFonts w:ascii="Times New Roman" w:hAnsi="Times New Roman"/>
+          <w:b/>
+          <w:i w:val="0"/>
+          <w:color w:val="000000"/>
+          <w:sz w:val="28"/>
+        </w:rPr>
+        <w:t xml:space="preserve">• </w:t>
+      </w:r>
       <w:r>
         <w:rPr>
           <w:rFonts w:ascii="Times New Roman" w:hAnsi="Times New Roman"/>
@@ -2444,15 +2631,25 @@
           <w:color w:val="000000"/>
           <w:sz w:val="28"/>
         </w:rPr>
-        <w:t>• Cụm giám sát Metrics (Prometheus + Grafana): Prometheus máy chủ định kỳ cào dữ liệu (scrape metrics) từ ứng dụng (/metrics), cAdvisor và MySQL Exporter; sau đó Grafana trực quan hóa thành các biểu đồ thời gian thực chuyên nghiệp.</w:t>
+        <w:t>Cụm giám sát Metrics (Prometheus + Grafana): Prometheus máy chủ định kỳ cào dữ liệu (scrape metrics) từ ứng dụng (/metrics), cAdvisor và MySQL Exporter; sau đó Grafana trực quan hóa thành các biểu đồ thời gian thực chuyên nghiệp.</w:t>
       </w:r>
     </w:p>
     <w:p>
       <w:pPr>
-        <w:spacing w:before="60" w:after="60" w:line="324" w:lineRule="auto"/>
-        <w:ind w:firstLine="720"/>
+        <w:spacing w:before="50" w:after="50" w:line="324" w:lineRule="auto"/>
+        <w:ind w:left="720" w:hanging="283"/>
         <w:jc w:val="both"/>
       </w:pPr>
+      <w:r>
+        <w:rPr>
+          <w:rFonts w:ascii="Times New Roman" w:hAnsi="Times New Roman"/>
+          <w:b/>
+          <w:i w:val="0"/>
+          <w:color w:val="000000"/>
+          <w:sz w:val="28"/>
+        </w:rPr>
+        <w:t xml:space="preserve">• </w:t>
+      </w:r>
       <w:r>
         <w:rPr>
           <w:rFonts w:ascii="Times New Roman" w:hAnsi="Times New Roman"/>
@@ -2461,7 +2658,7 @@
           <w:color w:val="000000"/>
           <w:sz w:val="28"/>
         </w:rPr>
-        <w:t>• Cụm quản lý Log tập trung (Loki + Promtail): Promtail tự động đọc log từ tất cả các Docker container đang chạy và đẩy về Loki server, cho phép kỹ trị viên tra cứu chi tiết ngữ cảnh lỗi bằng ngôn ngữ LogQL.</w:t>
+        <w:t>Cụm quản lý Log tập trung (Loki + Promtail): Promtail tự động đọc log từ tất cả các Docker container đang chạy và đẩy về Loki server, cho phép kỹ trị viên tra cứu chi tiết ngữ cảnh lỗi bằng ngôn ngữ LogQL.</w:t>
       </w:r>
     </w:p>
     <w:tbl>
@@ -2487,6 +2684,7 @@
           <w:p>
             <w:pPr>
               <w:spacing w:before="80" w:after="40" w:line="312" w:lineRule="auto"/>
+              <w:ind w:firstLine="0" w:left="170"/>
             </w:pPr>
             <w:r>
               <w:rPr>
@@ -2515,13 +2713,14 @@
     <w:p>
       <w:pPr>
         <w:spacing w:before="40" w:after="80" w:line="324" w:lineRule="auto"/>
-        <w:ind w:firstLine="720"/>
+        <w:ind w:firstLine="0"/>
         <w:jc w:val="both"/>
       </w:pPr>
     </w:p>
     <w:p>
       <w:pPr>
         <w:spacing w:before="120" w:after="40" w:line="312" w:lineRule="auto"/>
+        <w:ind w:firstLine="0"/>
         <w:jc w:val="left"/>
       </w:pPr>
       <w:r>
@@ -2564,6 +2763,7 @@
           <w:p>
             <w:pPr>
               <w:spacing w:before="80" w:after="80" w:line="300" w:lineRule="auto"/>
+              <w:ind w:firstLine="0"/>
               <w:jc w:val="center"/>
             </w:pPr>
             <w:r>
@@ -2585,6 +2785,7 @@
           <w:p>
             <w:pPr>
               <w:spacing w:before="80" w:after="80" w:line="300" w:lineRule="auto"/>
+              <w:ind w:firstLine="0"/>
               <w:jc w:val="center"/>
             </w:pPr>
             <w:r>
@@ -2606,6 +2807,7 @@
           <w:p>
             <w:pPr>
               <w:spacing w:before="80" w:after="80" w:line="300" w:lineRule="auto"/>
+              <w:ind w:firstLine="0"/>
               <w:jc w:val="center"/>
             </w:pPr>
             <w:r>
@@ -2627,6 +2829,7 @@
           <w:p>
             <w:pPr>
               <w:spacing w:before="80" w:after="80" w:line="300" w:lineRule="auto"/>
+              <w:ind w:firstLine="0"/>
               <w:jc w:val="center"/>
             </w:pPr>
             <w:r>
@@ -2648,6 +2851,7 @@
           <w:p>
             <w:pPr>
               <w:spacing w:before="80" w:after="80" w:line="300" w:lineRule="auto"/>
+              <w:ind w:firstLine="0"/>
               <w:jc w:val="center"/>
             </w:pPr>
             <w:r>
@@ -2671,7 +2875,8 @@
           <w:p>
             <w:pPr>
               <w:spacing w:before="60" w:after="60" w:line="300" w:lineRule="auto"/>
-              <w:jc w:val="center"/>
+              <w:ind w:firstLine="0"/>
+              <w:jc w:val="left"/>
             </w:pPr>
             <w:r>
               <w:rPr>
@@ -2692,6 +2897,7 @@
           <w:p>
             <w:pPr>
               <w:spacing w:before="60" w:after="60" w:line="300" w:lineRule="auto"/>
+              <w:ind w:firstLine="0"/>
               <w:jc w:val="left"/>
             </w:pPr>
             <w:r>
@@ -2713,7 +2919,8 @@
           <w:p>
             <w:pPr>
               <w:spacing w:before="60" w:after="60" w:line="300" w:lineRule="auto"/>
-              <w:jc w:val="left"/>
+              <w:ind w:firstLine="0"/>
+              <w:jc w:val="center"/>
             </w:pPr>
             <w:r>
               <w:rPr>
@@ -2734,7 +2941,8 @@
           <w:p>
             <w:pPr>
               <w:spacing w:before="60" w:after="60" w:line="300" w:lineRule="auto"/>
-              <w:jc w:val="left"/>
+              <w:ind w:firstLine="0"/>
+              <w:jc w:val="center"/>
             </w:pPr>
             <w:r>
               <w:rPr>
@@ -2755,7 +2963,8 @@
           <w:p>
             <w:pPr>
               <w:spacing w:before="60" w:after="60" w:line="300" w:lineRule="auto"/>
-              <w:jc w:val="center"/>
+              <w:ind w:firstLine="0"/>
+              <w:jc w:val="left"/>
             </w:pPr>
             <w:r>
               <w:rPr>
@@ -2778,7 +2987,8 @@
           <w:p>
             <w:pPr>
               <w:spacing w:before="60" w:after="60" w:line="300" w:lineRule="auto"/>
-              <w:jc w:val="center"/>
+              <w:ind w:firstLine="0"/>
+              <w:jc w:val="left"/>
             </w:pPr>
             <w:r>
               <w:rPr>
@@ -2799,6 +3009,7 @@
           <w:p>
             <w:pPr>
               <w:spacing w:before="60" w:after="60" w:line="300" w:lineRule="auto"/>
+              <w:ind w:firstLine="0"/>
               <w:jc w:val="left"/>
             </w:pPr>
             <w:r>
@@ -2820,7 +3031,8 @@
           <w:p>
             <w:pPr>
               <w:spacing w:before="60" w:after="60" w:line="300" w:lineRule="auto"/>
-              <w:jc w:val="left"/>
+              <w:ind w:firstLine="0"/>
+              <w:jc w:val="center"/>
             </w:pPr>
             <w:r>
               <w:rPr>
@@ -2841,7 +3053,8 @@
           <w:p>
             <w:pPr>
               <w:spacing w:before="60" w:after="60" w:line="300" w:lineRule="auto"/>
-              <w:jc w:val="left"/>
+              <w:ind w:firstLine="0"/>
+              <w:jc w:val="center"/>
             </w:pPr>
             <w:r>
               <w:rPr>
@@ -2862,7 +3075,8 @@
           <w:p>
             <w:pPr>
               <w:spacing w:before="60" w:after="60" w:line="300" w:lineRule="auto"/>
-              <w:jc w:val="center"/>
+              <w:ind w:firstLine="0"/>
+              <w:jc w:val="left"/>
             </w:pPr>
             <w:r>
               <w:rPr>
@@ -2885,7 +3099,8 @@
           <w:p>
             <w:pPr>
               <w:spacing w:before="60" w:after="60" w:line="300" w:lineRule="auto"/>
-              <w:jc w:val="center"/>
+              <w:ind w:firstLine="0"/>
+              <w:jc w:val="left"/>
             </w:pPr>
             <w:r>
               <w:rPr>
@@ -2906,6 +3121,7 @@
           <w:p>
             <w:pPr>
               <w:spacing w:before="60" w:after="60" w:line="300" w:lineRule="auto"/>
+              <w:ind w:firstLine="0"/>
               <w:jc w:val="left"/>
             </w:pPr>
             <w:r>
@@ -2927,7 +3143,8 @@
           <w:p>
             <w:pPr>
               <w:spacing w:before="60" w:after="60" w:line="300" w:lineRule="auto"/>
-              <w:jc w:val="left"/>
+              <w:ind w:firstLine="0"/>
+              <w:jc w:val="center"/>
             </w:pPr>
             <w:r>
               <w:rPr>
@@ -2948,7 +3165,8 @@
           <w:p>
             <w:pPr>
               <w:spacing w:before="60" w:after="60" w:line="300" w:lineRule="auto"/>
-              <w:jc w:val="left"/>
+              <w:ind w:firstLine="0"/>
+              <w:jc w:val="center"/>
             </w:pPr>
             <w:r>
               <w:rPr>
@@ -2969,7 +3187,8 @@
           <w:p>
             <w:pPr>
               <w:spacing w:before="60" w:after="60" w:line="300" w:lineRule="auto"/>
-              <w:jc w:val="center"/>
+              <w:ind w:firstLine="0"/>
+              <w:jc w:val="left"/>
             </w:pPr>
             <w:r>
               <w:rPr>
@@ -2992,7 +3211,8 @@
           <w:p>
             <w:pPr>
               <w:spacing w:before="60" w:after="60" w:line="300" w:lineRule="auto"/>
-              <w:jc w:val="center"/>
+              <w:ind w:firstLine="0"/>
+              <w:jc w:val="left"/>
             </w:pPr>
             <w:r>
               <w:rPr>
@@ -3013,6 +3233,7 @@
           <w:p>
             <w:pPr>
               <w:spacing w:before="60" w:after="60" w:line="300" w:lineRule="auto"/>
+              <w:ind w:firstLine="0"/>
               <w:jc w:val="left"/>
             </w:pPr>
             <w:r>
@@ -3034,7 +3255,8 @@
           <w:p>
             <w:pPr>
               <w:spacing w:before="60" w:after="60" w:line="300" w:lineRule="auto"/>
-              <w:jc w:val="left"/>
+              <w:ind w:firstLine="0"/>
+              <w:jc w:val="center"/>
             </w:pPr>
             <w:r>
               <w:rPr>
@@ -3055,7 +3277,8 @@
           <w:p>
             <w:pPr>
               <w:spacing w:before="60" w:after="60" w:line="300" w:lineRule="auto"/>
-              <w:jc w:val="left"/>
+              <w:ind w:firstLine="0"/>
+              <w:jc w:val="center"/>
             </w:pPr>
             <w:r>
               <w:rPr>
@@ -3076,7 +3299,8 @@
           <w:p>
             <w:pPr>
               <w:spacing w:before="60" w:after="60" w:line="300" w:lineRule="auto"/>
-              <w:jc w:val="center"/>
+              <w:ind w:firstLine="0"/>
+              <w:jc w:val="left"/>
             </w:pPr>
             <w:r>
               <w:rPr>
@@ -3099,7 +3323,8 @@
           <w:p>
             <w:pPr>
               <w:spacing w:before="60" w:after="60" w:line="300" w:lineRule="auto"/>
-              <w:jc w:val="center"/>
+              <w:ind w:firstLine="0"/>
+              <w:jc w:val="left"/>
             </w:pPr>
             <w:r>
               <w:rPr>
@@ -3120,6 +3345,7 @@
           <w:p>
             <w:pPr>
               <w:spacing w:before="60" w:after="60" w:line="300" w:lineRule="auto"/>
+              <w:ind w:firstLine="0"/>
               <w:jc w:val="left"/>
             </w:pPr>
             <w:r>
@@ -3141,7 +3367,8 @@
           <w:p>
             <w:pPr>
               <w:spacing w:before="60" w:after="60" w:line="300" w:lineRule="auto"/>
-              <w:jc w:val="left"/>
+              <w:ind w:firstLine="0"/>
+              <w:jc w:val="center"/>
             </w:pPr>
             <w:r>
               <w:rPr>
@@ -3162,7 +3389,8 @@
           <w:p>
             <w:pPr>
               <w:spacing w:before="60" w:after="60" w:line="300" w:lineRule="auto"/>
-              <w:jc w:val="left"/>
+              <w:ind w:firstLine="0"/>
+              <w:jc w:val="center"/>
             </w:pPr>
             <w:r>
               <w:rPr>
@@ -3183,7 +3411,8 @@
           <w:p>
             <w:pPr>
               <w:spacing w:before="60" w:after="60" w:line="300" w:lineRule="auto"/>
-              <w:jc w:val="center"/>
+              <w:ind w:firstLine="0"/>
+              <w:jc w:val="left"/>
             </w:pPr>
             <w:r>
               <w:rPr>
@@ -3206,7 +3435,8 @@
           <w:p>
             <w:pPr>
               <w:spacing w:before="60" w:after="60" w:line="300" w:lineRule="auto"/>
-              <w:jc w:val="center"/>
+              <w:ind w:firstLine="0"/>
+              <w:jc w:val="left"/>
             </w:pPr>
             <w:r>
               <w:rPr>
@@ -3227,6 +3457,7 @@
           <w:p>
             <w:pPr>
               <w:spacing w:before="60" w:after="60" w:line="300" w:lineRule="auto"/>
+              <w:ind w:firstLine="0"/>
               <w:jc w:val="left"/>
             </w:pPr>
             <w:r>
@@ -3248,7 +3479,8 @@
           <w:p>
             <w:pPr>
               <w:spacing w:before="60" w:after="60" w:line="300" w:lineRule="auto"/>
-              <w:jc w:val="left"/>
+              <w:ind w:firstLine="0"/>
+              <w:jc w:val="center"/>
             </w:pPr>
             <w:r>
               <w:rPr>
@@ -3269,7 +3501,8 @@
           <w:p>
             <w:pPr>
               <w:spacing w:before="60" w:after="60" w:line="300" w:lineRule="auto"/>
-              <w:jc w:val="left"/>
+              <w:ind w:firstLine="0"/>
+              <w:jc w:val="center"/>
             </w:pPr>
             <w:r>
               <w:rPr>
@@ -3290,7 +3523,8 @@
           <w:p>
             <w:pPr>
               <w:spacing w:before="60" w:after="60" w:line="300" w:lineRule="auto"/>
-              <w:jc w:val="center"/>
+              <w:ind w:firstLine="0"/>
+              <w:jc w:val="left"/>
             </w:pPr>
             <w:r>
               <w:rPr>
@@ -3313,7 +3547,8 @@
           <w:p>
             <w:pPr>
               <w:spacing w:before="60" w:after="60" w:line="300" w:lineRule="auto"/>
-              <w:jc w:val="center"/>
+              <w:ind w:firstLine="0"/>
+              <w:jc w:val="left"/>
             </w:pPr>
             <w:r>
               <w:rPr>
@@ -3334,6 +3569,7 @@
           <w:p>
             <w:pPr>
               <w:spacing w:before="60" w:after="60" w:line="300" w:lineRule="auto"/>
+              <w:ind w:firstLine="0"/>
               <w:jc w:val="left"/>
             </w:pPr>
             <w:r>
@@ -3355,7 +3591,8 @@
           <w:p>
             <w:pPr>
               <w:spacing w:before="60" w:after="60" w:line="300" w:lineRule="auto"/>
-              <w:jc w:val="left"/>
+              <w:ind w:firstLine="0"/>
+              <w:jc w:val="center"/>
             </w:pPr>
             <w:r>
               <w:rPr>
@@ -3376,7 +3613,8 @@
           <w:p>
             <w:pPr>
               <w:spacing w:before="60" w:after="60" w:line="300" w:lineRule="auto"/>
-              <w:jc w:val="left"/>
+              <w:ind w:firstLine="0"/>
+              <w:jc w:val="center"/>
             </w:pPr>
             <w:r>
               <w:rPr>
@@ -3397,7 +3635,8 @@
           <w:p>
             <w:pPr>
               <w:spacing w:before="60" w:after="60" w:line="300" w:lineRule="auto"/>
-              <w:jc w:val="center"/>
+              <w:ind w:firstLine="0"/>
+              <w:jc w:val="left"/>
             </w:pPr>
             <w:r>
               <w:rPr>
@@ -3415,13 +3654,14 @@
     </w:tbl>
     <w:p>
       <w:pPr>
-        <w:spacing w:before="80" w:after="200" w:line="324" w:lineRule="auto"/>
+        <w:spacing w:before="160" w:after="80" w:line="312" w:lineRule="auto"/>
+        <w:ind w:firstLine="0"/>
         <w:jc w:val="center"/>
       </w:pPr>
       <w:r>
         <w:rPr>
           <w:rFonts w:ascii="Times New Roman" w:hAnsi="Times New Roman"/>
-          <w:b w:val="0"/>
+          <w:b/>
           <w:i/>
           <w:color w:val="000000"/>
           <w:sz w:val="28"/>
@@ -3432,6 +3672,7 @@
     <w:p>
       <w:pPr>
         <w:spacing w:before="200" w:after="80" w:line="312" w:lineRule="auto"/>
+        <w:ind w:firstLine="0"/>
         <w:jc w:val="left"/>
       </w:pPr>
       <w:r>
@@ -3476,7 +3717,88 @@
           <w:color w:val="000000"/>
           <w:sz w:val="28"/>
         </w:rPr>
-        <w:t>• Tiến độ phát triển được chia tách thành các Commit có ý nghĩa kỹ thuật rõ ràng, tương ứng với 3 mốc nộp bài yêu cầu của giảng viên:</w:t>
+        <w:t>Tiến độ phát triển được chia tách thành các Commit có ý nghĩa kỹ thuật rõ ràng, tương ứng với 3 mốc nộp bài yêu cầu của giảng viên:</w:t>
+      </w:r>
+    </w:p>
+    <w:p>
+      <w:pPr>
+        <w:spacing w:before="50" w:after="50" w:line="324" w:lineRule="auto"/>
+        <w:ind w:left="720" w:hanging="283"/>
+        <w:jc w:val="both"/>
+      </w:pPr>
+      <w:r>
+        <w:rPr>
+          <w:rFonts w:ascii="Times New Roman" w:hAnsi="Times New Roman"/>
+          <w:b/>
+          <w:i w:val="0"/>
+          <w:color w:val="000000"/>
+          <w:sz w:val="28"/>
+        </w:rPr>
+        <w:t xml:space="preserve">• </w:t>
+      </w:r>
+      <w:r>
+        <w:rPr>
+          <w:rFonts w:ascii="Times New Roman" w:hAnsi="Times New Roman"/>
+          <w:b w:val="0"/>
+          <w:i w:val="0"/>
+          <w:color w:val="000000"/>
+          <w:sz w:val="28"/>
+        </w:rPr>
+        <w:t>Commit 1 (Mốc 1): feat: initialize fullstack ticket booking app, mysql, phpmyadmin, and nginx reverse proxy with ssl (Khởi tạo Web App, CSDL MySQL 3NF, phpMyAdmin, Nginx Reverse Proxy với HTTPS).</w:t>
+      </w:r>
+    </w:p>
+    <w:p>
+      <w:pPr>
+        <w:spacing w:before="50" w:after="50" w:line="324" w:lineRule="auto"/>
+        <w:ind w:left="720" w:hanging="283"/>
+        <w:jc w:val="both"/>
+      </w:pPr>
+      <w:r>
+        <w:rPr>
+          <w:rFonts w:ascii="Times New Roman" w:hAnsi="Times New Roman"/>
+          <w:b/>
+          <w:i w:val="0"/>
+          <w:color w:val="000000"/>
+          <w:sz w:val="28"/>
+        </w:rPr>
+        <w:t xml:space="preserve">• </w:t>
+      </w:r>
+      <w:r>
+        <w:rPr>
+          <w:rFonts w:ascii="Times New Roman" w:hAnsi="Times New Roman"/>
+          <w:b w:val="0"/>
+          <w:i w:val="0"/>
+          <w:color w:val="000000"/>
+          <w:sz w:val="28"/>
+        </w:rPr>
+        <w:t>Commit 2 (Mốc 2): feat: integrate prometheus and grafana monitoring stack with cadvisor and database metrics (Tích hợp cụm giám sát Prometheus, Grafana, cAdvisor, Exporters).</w:t>
+      </w:r>
+    </w:p>
+    <w:p>
+      <w:pPr>
+        <w:spacing w:before="50" w:after="50" w:line="324" w:lineRule="auto"/>
+        <w:ind w:left="720" w:hanging="283"/>
+        <w:jc w:val="both"/>
+      </w:pPr>
+      <w:r>
+        <w:rPr>
+          <w:rFonts w:ascii="Times New Roman" w:hAnsi="Times New Roman"/>
+          <w:b/>
+          <w:i w:val="0"/>
+          <w:color w:val="000000"/>
+          <w:sz w:val="28"/>
+        </w:rPr>
+        <w:t xml:space="preserve">• </w:t>
+      </w:r>
+      <w:r>
+        <w:rPr>
+          <w:rFonts w:ascii="Times New Roman" w:hAnsi="Times New Roman"/>
+          <w:b w:val="0"/>
+          <w:i w:val="0"/>
+          <w:color w:val="000000"/>
+          <w:sz w:val="28"/>
+        </w:rPr>
+        <w:t>Commit 3 (Mốc 3): feat: implement centralized logging with loki, promtail and apply system hardening (Tích hợp cụm quản lý log tập trung Loki, Promtail và 5 giải pháp Hardening bảo mật).</w:t>
       </w:r>
     </w:p>
     <w:p>
@@ -3493,7 +3815,7 @@
           <w:color w:val="000000"/>
           <w:sz w:val="28"/>
         </w:rPr>
-        <w:t xml:space="preserve">   - Commit 1 (Mốc 1): feat: initialize fullstack ticket booking app, mysql, phpmyadmin, and nginx reverse proxy with ssl (Khởi tạo Web App, CSDL MySQL 3NF, phpMyAdmin, Nginx Reverse Proxy với HTTPS).</w:t>
+        <w:t>Tệp hướng dẫn README.md được biên soạn chi tiết, hướng dẫn cụ thể cách thức clone repository, cấu hình biến môi trường và chạy lệnh khởi chạy tự động.</w:t>
       </w:r>
     </w:p>
     <w:p>
@@ -3510,58 +3832,7 @@
           <w:color w:val="000000"/>
           <w:sz w:val="28"/>
         </w:rPr>
-        <w:t xml:space="preserve">   - Commit 2 (Mốc 2): feat: integrate prometheus and grafana monitoring stack with cadvisor and database metrics (Tích hợp cụm giám sát Prometheus, Grafana, cAdvisor, Exporters).</w:t>
-      </w:r>
-    </w:p>
-    <w:p>
-      <w:pPr>
-        <w:spacing w:before="60" w:after="60" w:line="324" w:lineRule="auto"/>
-        <w:ind w:firstLine="720"/>
-        <w:jc w:val="both"/>
-      </w:pPr>
-      <w:r>
-        <w:rPr>
-          <w:rFonts w:ascii="Times New Roman" w:hAnsi="Times New Roman"/>
-          <w:b w:val="0"/>
-          <w:i w:val="0"/>
-          <w:color w:val="000000"/>
-          <w:sz w:val="28"/>
-        </w:rPr>
-        <w:t xml:space="preserve">   - Commit 3 (Mốc 3): feat: implement centralized logging with loki, promtail and apply system hardening (Tích hợp cụm quản lý log tập trung Loki, Promtail và 5 giải pháp Hardening bảo mật).</w:t>
-      </w:r>
-    </w:p>
-    <w:p>
-      <w:pPr>
-        <w:spacing w:before="60" w:after="60" w:line="324" w:lineRule="auto"/>
-        <w:ind w:firstLine="720"/>
-        <w:jc w:val="both"/>
-      </w:pPr>
-      <w:r>
-        <w:rPr>
-          <w:rFonts w:ascii="Times New Roman" w:hAnsi="Times New Roman"/>
-          <w:b w:val="0"/>
-          <w:i w:val="0"/>
-          <w:color w:val="000000"/>
-          <w:sz w:val="28"/>
-        </w:rPr>
-        <w:t>• Tệp hướng dẫn README.md được biên soạn chi tiết, hướng dẫn cụ thể cách thức clone repository, cấu hình biến môi trường và chạy lệnh khởi chạy tự động.</w:t>
-      </w:r>
-    </w:p>
-    <w:p>
-      <w:pPr>
-        <w:spacing w:before="60" w:after="60" w:line="324" w:lineRule="auto"/>
-        <w:ind w:firstLine="720"/>
-        <w:jc w:val="both"/>
-      </w:pPr>
-      <w:r>
-        <w:rPr>
-          <w:rFonts w:ascii="Times New Roman" w:hAnsi="Times New Roman"/>
-          <w:b w:val="0"/>
-          <w:i w:val="0"/>
-          <w:color w:val="000000"/>
-          <w:sz w:val="28"/>
-        </w:rPr>
-        <w:t>• Đặc biệt, hệ thống cung cấp tệp khởi động 1-chạm RUN.bat và dừng dịch vụ STOP.bat. Kịch bản này tự động nhận diện môi trường: nếu máy chấm thi có Docker sẽ tự động kích hoạt cụm container; nếu không có Docker sẽ chuyển đổi sang chế độ Dual-Engine In-Memory siêu nhẹ để bảo đảm ứng dụng luôn mở được ngay lập tức tại http://localhost:3000.</w:t>
+        <w:t>Đặc biệt, hệ thống cung cấp tệp khởi động 1-chạm RUN.bat và dừng dịch vụ STOP.bat. Kịch bản này tự động nhận diện môi trường: nếu máy chấm thi có Docker sẽ tự động kích hoạt cụm container; nếu không có Docker sẽ chuyển đổi sang chế độ Dual-Engine In-Memory siêu nhẹ để bảo đảm ứng dụng luôn mở được ngay lập tức tại http://localhost:3000.</w:t>
       </w:r>
     </w:p>
     <w:p>
@@ -3572,6 +3843,7 @@
     <w:p>
       <w:pPr>
         <w:spacing w:before="280" w:after="160" w:line="312" w:lineRule="auto"/>
+        <w:ind w:firstLine="0"/>
         <w:jc w:val="center"/>
       </w:pPr>
       <w:r>
@@ -3588,6 +3860,7 @@
     <w:p>
       <w:pPr>
         <w:spacing w:before="200" w:after="80" w:line="312" w:lineRule="auto"/>
+        <w:ind w:firstLine="0"/>
         <w:jc w:val="left"/>
       </w:pPr>
       <w:r>
@@ -3620,10 +3893,20 @@
     </w:p>
     <w:p>
       <w:pPr>
-        <w:spacing w:before="60" w:after="60" w:line="324" w:lineRule="auto"/>
-        <w:ind w:firstLine="720"/>
+        <w:spacing w:before="50" w:after="50" w:line="324" w:lineRule="auto"/>
+        <w:ind w:left="720" w:hanging="283"/>
         <w:jc w:val="both"/>
       </w:pPr>
+      <w:r>
+        <w:rPr>
+          <w:rFonts w:ascii="Times New Roman" w:hAnsi="Times New Roman"/>
+          <w:b/>
+          <w:i w:val="0"/>
+          <w:color w:val="000000"/>
+          <w:sz w:val="28"/>
+        </w:rPr>
+        <w:t xml:space="preserve">• </w:t>
+      </w:r>
       <w:r>
         <w:rPr>
           <w:rFonts w:ascii="Times New Roman" w:hAnsi="Times New Roman"/>
@@ -3632,15 +3915,25 @@
           <w:color w:val="000000"/>
           <w:sz w:val="28"/>
         </w:rPr>
-        <w:t>• Quản lý danh mục phim &amp; sự kiện: Thông tin phim đang chiếu, trailer, thời lượng, phân loại độ tuổi, giá vé cơ bản.</w:t>
+        <w:t>Quản lý danh mục phim &amp; sự kiện: Thông tin phim đang chiếu, trailer, thời lượng, phân loại độ tuổi, giá vé cơ bản.</w:t>
       </w:r>
     </w:p>
     <w:p>
       <w:pPr>
-        <w:spacing w:before="60" w:after="60" w:line="324" w:lineRule="auto"/>
-        <w:ind w:firstLine="720"/>
+        <w:spacing w:before="50" w:after="50" w:line="324" w:lineRule="auto"/>
+        <w:ind w:left="720" w:hanging="283"/>
         <w:jc w:val="both"/>
       </w:pPr>
+      <w:r>
+        <w:rPr>
+          <w:rFonts w:ascii="Times New Roman" w:hAnsi="Times New Roman"/>
+          <w:b/>
+          <w:i w:val="0"/>
+          <w:color w:val="000000"/>
+          <w:sz w:val="28"/>
+        </w:rPr>
+        <w:t xml:space="preserve">• </w:t>
+      </w:r>
       <w:r>
         <w:rPr>
           <w:rFonts w:ascii="Times New Roman" w:hAnsi="Times New Roman"/>
@@ -3649,15 +3942,25 @@
           <w:color w:val="000000"/>
           <w:sz w:val="28"/>
         </w:rPr>
-        <w:t>• Sơ đồ chọn ghế tương tác 3D: Mỗi phòng chiếu có 60 ghế (Hàng A-F, số 1-10) phân thành 3 hạng ghế: Ghế Standard (vàng nhạt), Ghế VIP (xanh, +20.000đ), Ghế đôi Sweetbox (hồng tím, +45.000đ). Giá vé tự động tính toán theo thời gian thực (Real-time).</w:t>
+        <w:t>Sơ đồ chọn ghế tương tác 3D: Mỗi phòng chiếu có 60 ghế (Hàng A-F, số 1-10) phân thành 3 hạng ghế: Ghế Standard (vàng nhạt), Ghế VIP (xanh, +20.000đ), Ghế đôi Sweetbox (hồng tím, +45.000đ). Giá vé tự động tính toán theo thời gian thực (Real-time).</w:t>
       </w:r>
     </w:p>
     <w:p>
       <w:pPr>
-        <w:spacing w:before="60" w:after="60" w:line="324" w:lineRule="auto"/>
-        <w:ind w:firstLine="720"/>
+        <w:spacing w:before="50" w:after="50" w:line="324" w:lineRule="auto"/>
+        <w:ind w:left="720" w:hanging="283"/>
         <w:jc w:val="both"/>
       </w:pPr>
+      <w:r>
+        <w:rPr>
+          <w:rFonts w:ascii="Times New Roman" w:hAnsi="Times New Roman"/>
+          <w:b/>
+          <w:i w:val="0"/>
+          <w:color w:val="000000"/>
+          <w:sz w:val="28"/>
+        </w:rPr>
+        <w:t xml:space="preserve">• </w:t>
+      </w:r>
       <w:r>
         <w:rPr>
           <w:rFonts w:ascii="Times New Roman" w:hAnsi="Times New Roman"/>
@@ -3666,15 +3969,25 @@
           <w:color w:val="000000"/>
           <w:sz w:val="28"/>
         </w:rPr>
-        <w:t>• Giải quyết bài toán Race Condition (Chống đặt trùng ghế): Trong thực tế, khi nhiều người dùng cùng nhấn đặt 1 ghế tại cùng một tích tắc, hệ thống rất dễ bị lỗi trùng ghế. Hệ thống áp dụng cơ chế ACID Transaction kết hợp Khóa dòng bi quan (Pessimistic Locking) trong MySQL 8.0 thông qua câu lệnh: SELECT * FROM seats WHERE showtime_id = ? AND seat_code = ? FOR UPDATE; Khóa độc quyền này ngăn chặn tuyệt đối tình trạng 2 giao dịch đồng thời chiếm dụng cùng một vị trí ngồi.</w:t>
+        <w:t>Giải quyết bài toán Race Condition (Chống đặt trùng ghế): Trong thực tế, khi nhiều người dùng cùng nhấn đặt 1 ghế tại cùng một tích tắc, hệ thống rất dễ bị lỗi trùng ghế. Hệ thống áp dụng cơ chế ACID Transaction kết hợp Khóa dòng bi quan (Pessimistic Locking) trong MySQL 8.0 thông qua câu lệnh: SELECT * FROM seats WHERE showtime_id = ? AND seat_code = ? FOR UPDATE; Khóa độc quyền này ngăn chặn tuyệt đối tình trạng 2 giao dịch đồng thời chiếm dụng cùng một vị trí ngồi.</w:t>
       </w:r>
     </w:p>
     <w:p>
       <w:pPr>
-        <w:spacing w:before="60" w:after="60" w:line="324" w:lineRule="auto"/>
-        <w:ind w:firstLine="720"/>
+        <w:spacing w:before="50" w:after="50" w:line="324" w:lineRule="auto"/>
+        <w:ind w:left="720" w:hanging="283"/>
         <w:jc w:val="both"/>
       </w:pPr>
+      <w:r>
+        <w:rPr>
+          <w:rFonts w:ascii="Times New Roman" w:hAnsi="Times New Roman"/>
+          <w:b/>
+          <w:i w:val="0"/>
+          <w:color w:val="000000"/>
+          <w:sz w:val="28"/>
+        </w:rPr>
+        <w:t xml:space="preserve">• </w:t>
+      </w:r>
       <w:r>
         <w:rPr>
           <w:rFonts w:ascii="Times New Roman" w:hAnsi="Times New Roman"/>
@@ -3683,15 +3996,25 @@
           <w:color w:val="000000"/>
           <w:sz w:val="28"/>
         </w:rPr>
-        <w:t>• Thanh toán giả lập &amp; Vé điện tử E-Ticket: Sinh mã vé dạng sinh viên TKT-DTC24520-XXXX và tạo mã QR Code động cho khách hàng.</w:t>
+        <w:t>Thanh toán giả lập &amp; Vé điện tử E-Ticket: Sinh mã vé dạng sinh viên TKT-DTC24520-XXXX và tạo mã QR Code động cho khách hàng.</w:t>
       </w:r>
     </w:p>
     <w:p>
       <w:pPr>
-        <w:spacing w:before="60" w:after="60" w:line="324" w:lineRule="auto"/>
-        <w:ind w:firstLine="720"/>
+        <w:spacing w:before="50" w:after="50" w:line="324" w:lineRule="auto"/>
+        <w:ind w:left="720" w:hanging="283"/>
         <w:jc w:val="both"/>
       </w:pPr>
+      <w:r>
+        <w:rPr>
+          <w:rFonts w:ascii="Times New Roman" w:hAnsi="Times New Roman"/>
+          <w:b/>
+          <w:i w:val="0"/>
+          <w:color w:val="000000"/>
+          <w:sz w:val="28"/>
+        </w:rPr>
+        <w:t xml:space="preserve">• </w:t>
+      </w:r>
       <w:r>
         <w:rPr>
           <w:rFonts w:ascii="Times New Roman" w:hAnsi="Times New Roman"/>
@@ -3700,12 +4023,13 @@
           <w:color w:val="000000"/>
           <w:sz w:val="28"/>
         </w:rPr>
-        <w:t>• Xác thực &amp; Audit Log: Hệ thống phân quyền User/Admin, bảng login_logs lưu vết toàn bộ IP, User-Agent và trạng thái đăng nhập.</w:t>
+        <w:t>Xác thực &amp; Audit Log: Hệ thống phân quyền User/Admin, bảng login_logs lưu vết toàn bộ IP, User-Agent và trạng thái đăng nhập.</w:t>
       </w:r>
     </w:p>
     <w:p>
       <w:pPr>
         <w:spacing w:before="120" w:after="40" w:line="312" w:lineRule="auto"/>
+        <w:ind w:firstLine="0"/>
         <w:jc w:val="left"/>
       </w:pPr>
       <w:r>
@@ -3763,6 +4087,7 @@
           <w:p>
             <w:pPr>
               <w:spacing w:before="80" w:after="80" w:line="300" w:lineRule="auto"/>
+              <w:ind w:firstLine="0"/>
               <w:jc w:val="center"/>
             </w:pPr>
             <w:r>
@@ -3784,6 +4109,7 @@
           <w:p>
             <w:pPr>
               <w:spacing w:before="80" w:after="80" w:line="300" w:lineRule="auto"/>
+              <w:ind w:firstLine="0"/>
               <w:jc w:val="center"/>
             </w:pPr>
             <w:r>
@@ -3805,6 +4131,7 @@
           <w:p>
             <w:pPr>
               <w:spacing w:before="80" w:after="80" w:line="300" w:lineRule="auto"/>
+              <w:ind w:firstLine="0"/>
               <w:jc w:val="center"/>
             </w:pPr>
             <w:r>
@@ -3828,7 +4155,8 @@
           <w:p>
             <w:pPr>
               <w:spacing w:before="60" w:after="60" w:line="300" w:lineRule="auto"/>
-              <w:jc w:val="center"/>
+              <w:ind w:firstLine="0"/>
+              <w:jc w:val="left"/>
             </w:pPr>
             <w:r>
               <w:rPr>
@@ -3849,6 +4177,7 @@
           <w:p>
             <w:pPr>
               <w:spacing w:before="60" w:after="60" w:line="300" w:lineRule="auto"/>
+              <w:ind w:firstLine="0"/>
               <w:jc w:val="left"/>
             </w:pPr>
             <w:r>
@@ -3870,7 +4199,8 @@
           <w:p>
             <w:pPr>
               <w:spacing w:before="60" w:after="60" w:line="300" w:lineRule="auto"/>
-              <w:jc w:val="center"/>
+              <w:ind w:firstLine="0"/>
+              <w:jc w:val="left"/>
             </w:pPr>
             <w:r>
               <w:rPr>
@@ -3893,7 +4223,8 @@
           <w:p>
             <w:pPr>
               <w:spacing w:before="60" w:after="60" w:line="300" w:lineRule="auto"/>
-              <w:jc w:val="center"/>
+              <w:ind w:firstLine="0"/>
+              <w:jc w:val="left"/>
             </w:pPr>
             <w:r>
               <w:rPr>
@@ -3914,6 +4245,7 @@
           <w:p>
             <w:pPr>
               <w:spacing w:before="60" w:after="60" w:line="300" w:lineRule="auto"/>
+              <w:ind w:firstLine="0"/>
               <w:jc w:val="left"/>
             </w:pPr>
             <w:r>
@@ -3935,7 +4267,8 @@
           <w:p>
             <w:pPr>
               <w:spacing w:before="60" w:after="60" w:line="300" w:lineRule="auto"/>
-              <w:jc w:val="center"/>
+              <w:ind w:firstLine="0"/>
+              <w:jc w:val="left"/>
             </w:pPr>
             <w:r>
               <w:rPr>
@@ -3958,7 +4291,8 @@
           <w:p>
             <w:pPr>
               <w:spacing w:before="60" w:after="60" w:line="300" w:lineRule="auto"/>
-              <w:jc w:val="center"/>
+              <w:ind w:firstLine="0"/>
+              <w:jc w:val="left"/>
             </w:pPr>
             <w:r>
               <w:rPr>
@@ -3979,6 +4313,7 @@
           <w:p>
             <w:pPr>
               <w:spacing w:before="60" w:after="60" w:line="300" w:lineRule="auto"/>
+              <w:ind w:firstLine="0"/>
               <w:jc w:val="left"/>
             </w:pPr>
             <w:r>
@@ -4000,7 +4335,8 @@
           <w:p>
             <w:pPr>
               <w:spacing w:before="60" w:after="60" w:line="300" w:lineRule="auto"/>
-              <w:jc w:val="center"/>
+              <w:ind w:firstLine="0"/>
+              <w:jc w:val="left"/>
             </w:pPr>
             <w:r>
               <w:rPr>
@@ -4023,7 +4359,8 @@
           <w:p>
             <w:pPr>
               <w:spacing w:before="60" w:after="60" w:line="300" w:lineRule="auto"/>
-              <w:jc w:val="center"/>
+              <w:ind w:firstLine="0"/>
+              <w:jc w:val="left"/>
             </w:pPr>
             <w:r>
               <w:rPr>
@@ -4044,6 +4381,7 @@
           <w:p>
             <w:pPr>
               <w:spacing w:before="60" w:after="60" w:line="300" w:lineRule="auto"/>
+              <w:ind w:firstLine="0"/>
               <w:jc w:val="left"/>
             </w:pPr>
             <w:r>
@@ -4065,7 +4403,8 @@
           <w:p>
             <w:pPr>
               <w:spacing w:before="60" w:after="60" w:line="300" w:lineRule="auto"/>
-              <w:jc w:val="center"/>
+              <w:ind w:firstLine="0"/>
+              <w:jc w:val="left"/>
             </w:pPr>
             <w:r>
               <w:rPr>
@@ -4088,7 +4427,8 @@
           <w:p>
             <w:pPr>
               <w:spacing w:before="60" w:after="60" w:line="300" w:lineRule="auto"/>
-              <w:jc w:val="center"/>
+              <w:ind w:firstLine="0"/>
+              <w:jc w:val="left"/>
             </w:pPr>
             <w:r>
               <w:rPr>
@@ -4109,6 +4449,7 @@
           <w:p>
             <w:pPr>
               <w:spacing w:before="60" w:after="60" w:line="300" w:lineRule="auto"/>
+              <w:ind w:firstLine="0"/>
               <w:jc w:val="left"/>
             </w:pPr>
             <w:r>
@@ -4130,7 +4471,8 @@
           <w:p>
             <w:pPr>
               <w:spacing w:before="60" w:after="60" w:line="300" w:lineRule="auto"/>
-              <w:jc w:val="center"/>
+              <w:ind w:firstLine="0"/>
+              <w:jc w:val="left"/>
             </w:pPr>
             <w:r>
               <w:rPr>
@@ -4148,13 +4490,14 @@
     </w:tbl>
     <w:p>
       <w:pPr>
-        <w:spacing w:before="80" w:after="200" w:line="324" w:lineRule="auto"/>
+        <w:spacing w:before="160" w:after="80" w:line="312" w:lineRule="auto"/>
+        <w:ind w:firstLine="0"/>
         <w:jc w:val="center"/>
       </w:pPr>
       <w:r>
         <w:rPr>
           <w:rFonts w:ascii="Times New Roman" w:hAnsi="Times New Roman"/>
-          <w:b w:val="0"/>
+          <w:b/>
           <w:i/>
           <w:color w:val="000000"/>
           <w:sz w:val="28"/>
@@ -4165,6 +4508,7 @@
     <w:p>
       <w:pPr>
         <w:spacing w:before="120" w:after="40" w:line="312" w:lineRule="auto"/>
+        <w:ind w:firstLine="0"/>
         <w:jc w:val="left"/>
       </w:pPr>
       <w:r>
@@ -4201,6 +4545,7 @@
           <w:p>
             <w:pPr>
               <w:spacing w:before="80" w:after="80" w:line="288" w:lineRule="auto"/>
+              <w:ind w:firstLine="0" w:left="170"/>
             </w:pPr>
             <w:r>
               <w:rPr>
@@ -4278,13 +4623,14 @@
     <w:p>
       <w:pPr>
         <w:spacing w:before="40" w:after="80" w:line="324" w:lineRule="auto"/>
-        <w:ind w:firstLine="720"/>
+        <w:ind w:firstLine="0"/>
         <w:jc w:val="both"/>
       </w:pPr>
     </w:p>
     <w:p>
       <w:pPr>
         <w:spacing w:before="200" w:after="80" w:line="312" w:lineRule="auto"/>
+        <w:ind w:firstLine="0"/>
         <w:jc w:val="left"/>
       </w:pPr>
       <w:r>
@@ -4317,10 +4663,20 @@
     </w:p>
     <w:p>
       <w:pPr>
-        <w:spacing w:before="60" w:after="60" w:line="324" w:lineRule="auto"/>
-        <w:ind w:firstLine="720"/>
+        <w:spacing w:before="50" w:after="50" w:line="324" w:lineRule="auto"/>
+        <w:ind w:left="720" w:hanging="283"/>
         <w:jc w:val="both"/>
       </w:pPr>
+      <w:r>
+        <w:rPr>
+          <w:rFonts w:ascii="Times New Roman" w:hAnsi="Times New Roman"/>
+          <w:b/>
+          <w:i w:val="0"/>
+          <w:color w:val="000000"/>
+          <w:sz w:val="28"/>
+        </w:rPr>
+        <w:t xml:space="preserve">• </w:t>
+      </w:r>
       <w:r>
         <w:rPr>
           <w:rFonts w:ascii="Times New Roman" w:hAnsi="Times New Roman"/>
@@ -4329,15 +4685,25 @@
           <w:color w:val="000000"/>
           <w:sz w:val="28"/>
         </w:rPr>
-        <w:t>• Tích hợp HTTPS với chứng chỉ SSL/TLS tự ký (Self-signed Certificate): Sử dụng cặp khóa RSA 2048-bit (cert.pem và key.pem).</w:t>
+        <w:t>Tích hợp HTTPS với chứng chỉ SSL/TLS tự ký (Self-signed Certificate): Sử dụng cặp khóa RSA 2048-bit (cert.pem và key.pem).</w:t>
       </w:r>
     </w:p>
     <w:p>
       <w:pPr>
-        <w:spacing w:before="60" w:after="60" w:line="324" w:lineRule="auto"/>
-        <w:ind w:firstLine="720"/>
+        <w:spacing w:before="50" w:after="50" w:line="324" w:lineRule="auto"/>
+        <w:ind w:left="720" w:hanging="283"/>
         <w:jc w:val="both"/>
       </w:pPr>
+      <w:r>
+        <w:rPr>
+          <w:rFonts w:ascii="Times New Roman" w:hAnsi="Times New Roman"/>
+          <w:b/>
+          <w:i w:val="0"/>
+          <w:color w:val="000000"/>
+          <w:sz w:val="28"/>
+        </w:rPr>
+        <w:t xml:space="preserve">• </w:t>
+      </w:r>
       <w:r>
         <w:rPr>
           <w:rFonts w:ascii="Times New Roman" w:hAnsi="Times New Roman"/>
@@ -4346,15 +4712,25 @@
           <w:color w:val="000000"/>
           <w:sz w:val="28"/>
         </w:rPr>
-        <w:t>• Tự động chuyển hướng (HTTP Redirection): Mọi request đến cổng 80 đều tự động chuyển hướng sang cổng 443 bằng mã HTTP 301 Moved Permanently.</w:t>
+        <w:t>Tự động chuyển hướng (HTTP Redirection): Mọi request đến cổng 80 đều tự động chuyển hướng sang cổng 443 bằng mã HTTP 301 Moved Permanently.</w:t>
       </w:r>
     </w:p>
     <w:p>
       <w:pPr>
-        <w:spacing w:before="60" w:after="60" w:line="324" w:lineRule="auto"/>
-        <w:ind w:firstLine="720"/>
+        <w:spacing w:before="50" w:after="50" w:line="324" w:lineRule="auto"/>
+        <w:ind w:left="720" w:hanging="283"/>
         <w:jc w:val="both"/>
       </w:pPr>
+      <w:r>
+        <w:rPr>
+          <w:rFonts w:ascii="Times New Roman" w:hAnsi="Times New Roman"/>
+          <w:b/>
+          <w:i w:val="0"/>
+          <w:color w:val="000000"/>
+          <w:sz w:val="28"/>
+        </w:rPr>
+        <w:t xml:space="preserve">• </w:t>
+      </w:r>
       <w:r>
         <w:rPr>
           <w:rFonts w:ascii="Times New Roman" w:hAnsi="Times New Roman"/>
@@ -4363,7 +4739,7 @@
           <w:color w:val="000000"/>
           <w:sz w:val="28"/>
         </w:rPr>
-        <w:t>• Triển khai bộ HTTP Security Headers chuẩn bảo vệ trình duyệt:</w:t>
+        <w:t>Triển khai bộ HTTP Security Headers chuẩn bảo vệ trình duyệt phòng chống tấn công web độc hại.</w:t>
       </w:r>
     </w:p>
     <w:tbl>
@@ -4393,6 +4769,7 @@
           <w:p>
             <w:pPr>
               <w:spacing w:before="80" w:after="80" w:line="300" w:lineRule="auto"/>
+              <w:ind w:firstLine="0"/>
               <w:jc w:val="center"/>
             </w:pPr>
             <w:r>
@@ -4414,6 +4791,7 @@
           <w:p>
             <w:pPr>
               <w:spacing w:before="80" w:after="80" w:line="300" w:lineRule="auto"/>
+              <w:ind w:firstLine="0"/>
               <w:jc w:val="center"/>
             </w:pPr>
             <w:r>
@@ -4435,6 +4813,7 @@
           <w:p>
             <w:pPr>
               <w:spacing w:before="80" w:after="80" w:line="300" w:lineRule="auto"/>
+              <w:ind w:firstLine="0"/>
               <w:jc w:val="center"/>
             </w:pPr>
             <w:r>
@@ -4458,7 +4837,8 @@
           <w:p>
             <w:pPr>
               <w:spacing w:before="60" w:after="60" w:line="300" w:lineRule="auto"/>
-              <w:jc w:val="center"/>
+              <w:ind w:firstLine="0"/>
+              <w:jc w:val="left"/>
             </w:pPr>
             <w:r>
               <w:rPr>
@@ -4479,7 +4859,8 @@
           <w:p>
             <w:pPr>
               <w:spacing w:before="60" w:after="60" w:line="300" w:lineRule="auto"/>
-              <w:jc w:val="left"/>
+              <w:ind w:firstLine="0"/>
+              <w:jc w:val="center"/>
             </w:pPr>
             <w:r>
               <w:rPr>
@@ -4500,7 +4881,8 @@
           <w:p>
             <w:pPr>
               <w:spacing w:before="60" w:after="60" w:line="300" w:lineRule="auto"/>
-              <w:jc w:val="center"/>
+              <w:ind w:firstLine="0"/>
+              <w:jc w:val="left"/>
             </w:pPr>
             <w:r>
               <w:rPr>
@@ -4523,7 +4905,8 @@
           <w:p>
             <w:pPr>
               <w:spacing w:before="60" w:after="60" w:line="300" w:lineRule="auto"/>
-              <w:jc w:val="center"/>
+              <w:ind w:firstLine="0"/>
+              <w:jc w:val="left"/>
             </w:pPr>
             <w:r>
               <w:rPr>
@@ -4544,7 +4927,8 @@
           <w:p>
             <w:pPr>
               <w:spacing w:before="60" w:after="60" w:line="300" w:lineRule="auto"/>
-              <w:jc w:val="left"/>
+              <w:ind w:firstLine="0"/>
+              <w:jc w:val="center"/>
             </w:pPr>
             <w:r>
               <w:rPr>
@@ -4565,7 +4949,8 @@
           <w:p>
             <w:pPr>
               <w:spacing w:before="60" w:after="60" w:line="300" w:lineRule="auto"/>
-              <w:jc w:val="center"/>
+              <w:ind w:firstLine="0"/>
+              <w:jc w:val="left"/>
             </w:pPr>
             <w:r>
               <w:rPr>
@@ -4588,7 +4973,8 @@
           <w:p>
             <w:pPr>
               <w:spacing w:before="60" w:after="60" w:line="300" w:lineRule="auto"/>
-              <w:jc w:val="center"/>
+              <w:ind w:firstLine="0"/>
+              <w:jc w:val="left"/>
             </w:pPr>
             <w:r>
               <w:rPr>
@@ -4609,7 +4995,8 @@
           <w:p>
             <w:pPr>
               <w:spacing w:before="60" w:after="60" w:line="300" w:lineRule="auto"/>
-              <w:jc w:val="left"/>
+              <w:ind w:firstLine="0"/>
+              <w:jc w:val="center"/>
             </w:pPr>
             <w:r>
               <w:rPr>
@@ -4630,7 +5017,8 @@
           <w:p>
             <w:pPr>
               <w:spacing w:before="60" w:after="60" w:line="300" w:lineRule="auto"/>
-              <w:jc w:val="center"/>
+              <w:ind w:firstLine="0"/>
+              <w:jc w:val="left"/>
             </w:pPr>
             <w:r>
               <w:rPr>
@@ -4653,7 +5041,8 @@
           <w:p>
             <w:pPr>
               <w:spacing w:before="60" w:after="60" w:line="300" w:lineRule="auto"/>
-              <w:jc w:val="center"/>
+              <w:ind w:firstLine="0"/>
+              <w:jc w:val="left"/>
             </w:pPr>
             <w:r>
               <w:rPr>
@@ -4674,7 +5063,8 @@
           <w:p>
             <w:pPr>
               <w:spacing w:before="60" w:after="60" w:line="300" w:lineRule="auto"/>
-              <w:jc w:val="left"/>
+              <w:ind w:firstLine="0"/>
+              <w:jc w:val="center"/>
             </w:pPr>
             <w:r>
               <w:rPr>
@@ -4695,7 +5085,8 @@
           <w:p>
             <w:pPr>
               <w:spacing w:before="60" w:after="60" w:line="300" w:lineRule="auto"/>
-              <w:jc w:val="center"/>
+              <w:ind w:firstLine="0"/>
+              <w:jc w:val="left"/>
             </w:pPr>
             <w:r>
               <w:rPr>
@@ -4718,7 +5109,8 @@
           <w:p>
             <w:pPr>
               <w:spacing w:before="60" w:after="60" w:line="300" w:lineRule="auto"/>
-              <w:jc w:val="center"/>
+              <w:ind w:firstLine="0"/>
+              <w:jc w:val="left"/>
             </w:pPr>
             <w:r>
               <w:rPr>
@@ -4739,7 +5131,8 @@
           <w:p>
             <w:pPr>
               <w:spacing w:before="60" w:after="60" w:line="300" w:lineRule="auto"/>
-              <w:jc w:val="left"/>
+              <w:ind w:firstLine="0"/>
+              <w:jc w:val="center"/>
             </w:pPr>
             <w:r>
               <w:rPr>
@@ -4760,7 +5153,8 @@
           <w:p>
             <w:pPr>
               <w:spacing w:before="60" w:after="60" w:line="300" w:lineRule="auto"/>
-              <w:jc w:val="center"/>
+              <w:ind w:firstLine="0"/>
+              <w:jc w:val="left"/>
             </w:pPr>
             <w:r>
               <w:rPr>
@@ -4778,13 +5172,14 @@
     </w:tbl>
     <w:p>
       <w:pPr>
-        <w:spacing w:before="80" w:after="200" w:line="324" w:lineRule="auto"/>
+        <w:spacing w:before="160" w:after="80" w:line="312" w:lineRule="auto"/>
+        <w:ind w:firstLine="0"/>
         <w:jc w:val="center"/>
       </w:pPr>
       <w:r>
         <w:rPr>
           <w:rFonts w:ascii="Times New Roman" w:hAnsi="Times New Roman"/>
-          <w:b w:val="0"/>
+          <w:b/>
           <w:i/>
           <w:color w:val="000000"/>
           <w:sz w:val="28"/>
@@ -4806,7 +5201,7 @@
           <w:color w:val="000000"/>
           <w:sz w:val="28"/>
         </w:rPr>
-        <w:t>• Cấu hình Rate Limiting (Chống DDoS/Spam): Nginx thiết lập giới hạn 30 req/s cho các trang xem phim và 5 req/s cho endpoint đặt vé nhạy cảm /api/bookings, loại bỏ hoàn toàn nguy cơ dùng bot spam đơn vé ảo.</w:t>
+        <w:t>Cấu hình Rate Limiting (Chống DDoS/Spam): Nginx thiết lập giới hạn 30 req/s cho các trang xem phim và 5 req/s cho endpoint đặt vé nhạy cảm /api/bookings, loại bỏ hoàn toàn nguy cơ dùng bot spam đơn vé ảo.</w:t>
       </w:r>
     </w:p>
     <w:p>
@@ -4817,6 +5212,7 @@
     <w:p>
       <w:pPr>
         <w:spacing w:before="280" w:after="160" w:line="312" w:lineRule="auto"/>
+        <w:ind w:firstLine="0"/>
         <w:jc w:val="center"/>
       </w:pPr>
       <w:r>
@@ -4833,6 +5229,7 @@
     <w:p>
       <w:pPr>
         <w:spacing w:before="200" w:after="80" w:line="312" w:lineRule="auto"/>
+        <w:ind w:firstLine="0"/>
         <w:jc w:val="left"/>
       </w:pPr>
       <w:r>
@@ -4865,10 +5262,20 @@
     </w:p>
     <w:p>
       <w:pPr>
-        <w:spacing w:before="60" w:after="60" w:line="324" w:lineRule="auto"/>
-        <w:ind w:firstLine="720"/>
+        <w:spacing w:before="50" w:after="50" w:line="324" w:lineRule="auto"/>
+        <w:ind w:left="720" w:hanging="283"/>
         <w:jc w:val="both"/>
       </w:pPr>
+      <w:r>
+        <w:rPr>
+          <w:rFonts w:ascii="Times New Roman" w:hAnsi="Times New Roman"/>
+          <w:b/>
+          <w:i w:val="0"/>
+          <w:color w:val="000000"/>
+          <w:sz w:val="28"/>
+        </w:rPr>
+        <w:t xml:space="preserve">1. </w:t>
+      </w:r>
       <w:r>
         <w:rPr>
           <w:rFonts w:ascii="Times New Roman" w:hAnsi="Times New Roman"/>
@@ -4877,15 +5284,25 @@
           <w:color w:val="000000"/>
           <w:sz w:val="28"/>
         </w:rPr>
-        <w:t>1. cAdvisor (Container Advisor): Đọc số liệu tài nguyên trực tiếp từ cgroups của hệ điều hành máy chủ, giám sát tỷ lệ CPU và dung lượng RAM thực tế của từng container.</w:t>
+        <w:t>cAdvisor (Container Advisor): Đọc số liệu tài nguyên trực tiếp từ cgroups của hệ điều hành máy chủ, giám sát tỷ lệ CPU và dung lượng RAM thực tế của từng container.</w:t>
       </w:r>
     </w:p>
     <w:p>
       <w:pPr>
-        <w:spacing w:before="60" w:after="60" w:line="324" w:lineRule="auto"/>
-        <w:ind w:firstLine="720"/>
+        <w:spacing w:before="50" w:after="50" w:line="324" w:lineRule="auto"/>
+        <w:ind w:left="720" w:hanging="283"/>
         <w:jc w:val="both"/>
       </w:pPr>
+      <w:r>
+        <w:rPr>
+          <w:rFonts w:ascii="Times New Roman" w:hAnsi="Times New Roman"/>
+          <w:b/>
+          <w:i w:val="0"/>
+          <w:color w:val="000000"/>
+          <w:sz w:val="28"/>
+        </w:rPr>
+        <w:t xml:space="preserve">2. </w:t>
+      </w:r>
       <w:r>
         <w:rPr>
           <w:rFonts w:ascii="Times New Roman" w:hAnsi="Times New Roman"/>
@@ -4894,15 +5311,25 @@
           <w:color w:val="000000"/>
           <w:sz w:val="28"/>
         </w:rPr>
-        <w:t>2. Ứng dụng Web App (/metrics): Tích hợp thư viện prom-client, xuất bản các chỉ số nghiệp vụ theo thời gian thực (cinema_http_requests_total, cinema_http_request_duration_seconds, cinema_ticket_bookings_total, cinema_ticket_revenue_total_vnd).</w:t>
+        <w:t>Ứng dụng Web App (/metrics): Tích hợp thư viện prom-client, xuất bản các chỉ số nghiệp vụ theo thời gian thực (cinema_http_requests_total, cinema_http_request_duration_seconds, cinema_ticket_bookings_total, cinema_ticket_revenue_total_vnd).</w:t>
       </w:r>
     </w:p>
     <w:p>
       <w:pPr>
-        <w:spacing w:before="60" w:after="60" w:line="324" w:lineRule="auto"/>
-        <w:ind w:firstLine="720"/>
+        <w:spacing w:before="50" w:after="50" w:line="324" w:lineRule="auto"/>
+        <w:ind w:left="720" w:hanging="283"/>
         <w:jc w:val="both"/>
       </w:pPr>
+      <w:r>
+        <w:rPr>
+          <w:rFonts w:ascii="Times New Roman" w:hAnsi="Times New Roman"/>
+          <w:b/>
+          <w:i w:val="0"/>
+          <w:color w:val="000000"/>
+          <w:sz w:val="28"/>
+        </w:rPr>
+        <w:t xml:space="preserve">3. </w:t>
+      </w:r>
       <w:r>
         <w:rPr>
           <w:rFonts w:ascii="Times New Roman" w:hAnsi="Times New Roman"/>
@@ -4911,15 +5338,25 @@
           <w:color w:val="000000"/>
           <w:sz w:val="28"/>
         </w:rPr>
-        <w:t>3. Cơ sở dữ liệu &amp; Nginx Exporter: Thu thập QPS (Queries Per Second) của MySQL và số kết nối hoạt động của Nginx.</w:t>
+        <w:t>Cơ sở dữ liệu &amp; Nginx Exporter: Thu thập QPS (Queries Per Second) của MySQL và số kết nối hoạt động của Nginx.</w:t>
       </w:r>
     </w:p>
     <w:p>
       <w:pPr>
-        <w:spacing w:before="60" w:after="60" w:line="324" w:lineRule="auto"/>
-        <w:ind w:firstLine="720"/>
+        <w:spacing w:before="50" w:after="50" w:line="324" w:lineRule="auto"/>
+        <w:ind w:left="720" w:hanging="283"/>
         <w:jc w:val="both"/>
       </w:pPr>
+      <w:r>
+        <w:rPr>
+          <w:rFonts w:ascii="Times New Roman" w:hAnsi="Times New Roman"/>
+          <w:b/>
+          <w:i w:val="0"/>
+          <w:color w:val="000000"/>
+          <w:sz w:val="28"/>
+        </w:rPr>
+        <w:t xml:space="preserve">4. </w:t>
+      </w:r>
       <w:r>
         <w:rPr>
           <w:rFonts w:ascii="Times New Roman" w:hAnsi="Times New Roman"/>
@@ -4928,12 +5365,13 @@
           <w:color w:val="000000"/>
           <w:sz w:val="28"/>
         </w:rPr>
-        <w:t>4. Tự động thiết lập Dashboard trên Grafana (Provisioning): Grafana tự động kết nối nguồn dữ liệu Prometheus (http://prometheus:9090) và nhập tệp cinema_monitoring_dashboard.json mà không cần cấu hình thủ công bằng tay. Dashboard hiển thị trực quan các biểu đồ lưu lượng request, biểu đồ RAM/CPU container và KPI doanh thu.</w:t>
+        <w:t>Tự động thiết lập Dashboard trên Grafana (Provisioning): Grafana tự động kết nối nguồn dữ liệu Prometheus (http://prometheus:9090) và nhập tệp cinema_monitoring_dashboard.json mà không cần cấu hình thủ công bằng tay. Dashboard hiển thị trực quan các biểu đồ lưu lượng request, biểu đồ RAM/CPU container và KPI doanh thu.</w:t>
       </w:r>
     </w:p>
     <w:p>
       <w:pPr>
         <w:spacing w:before="200" w:after="80" w:line="312" w:lineRule="auto"/>
+        <w:ind w:firstLine="0"/>
         <w:jc w:val="left"/>
       </w:pPr>
       <w:r>
@@ -4966,10 +5404,20 @@
     </w:p>
     <w:p>
       <w:pPr>
-        <w:spacing w:before="60" w:after="60" w:line="324" w:lineRule="auto"/>
-        <w:ind w:firstLine="720"/>
+        <w:spacing w:before="50" w:after="50" w:line="324" w:lineRule="auto"/>
+        <w:ind w:left="720" w:hanging="283"/>
         <w:jc w:val="both"/>
       </w:pPr>
+      <w:r>
+        <w:rPr>
+          <w:rFonts w:ascii="Times New Roman" w:hAnsi="Times New Roman"/>
+          <w:b/>
+          <w:i w:val="0"/>
+          <w:color w:val="000000"/>
+          <w:sz w:val="28"/>
+        </w:rPr>
+        <w:t xml:space="preserve">• </w:t>
+      </w:r>
       <w:r>
         <w:rPr>
           <w:rFonts w:ascii="Times New Roman" w:hAnsi="Times New Roman"/>
@@ -4978,15 +5426,25 @@
           <w:color w:val="000000"/>
           <w:sz w:val="28"/>
         </w:rPr>
-        <w:t>• Promtail Agent: Lắng nghe trực tiếp các tệp log dạng JSON của Docker daemon (/var/lib/docker/containers/*/*-json.log), gán nhãn container (container="ticket-app", container="nginx") và gửi từng khối về Loki server qua HTTP API /loki/api/v1/push.</w:t>
+        <w:t>Promtail Agent: Lắng nghe trực tiếp các tệp log dạng JSON của Docker daemon (/var/lib/docker/containers/*/*-json.log), gán nhãn container (container="ticket-app", container="nginx") và gửi từng khối về Loki server qua HTTP API /loki/api/v1/push.</w:t>
       </w:r>
     </w:p>
     <w:p>
       <w:pPr>
-        <w:spacing w:before="60" w:after="60" w:line="324" w:lineRule="auto"/>
-        <w:ind w:firstLine="720"/>
+        <w:spacing w:before="50" w:after="50" w:line="324" w:lineRule="auto"/>
+        <w:ind w:left="720" w:hanging="283"/>
         <w:jc w:val="both"/>
       </w:pPr>
+      <w:r>
+        <w:rPr>
+          <w:rFonts w:ascii="Times New Roman" w:hAnsi="Times New Roman"/>
+          <w:b/>
+          <w:i w:val="0"/>
+          <w:color w:val="000000"/>
+          <w:sz w:val="28"/>
+        </w:rPr>
+        <w:t xml:space="preserve">• </w:t>
+      </w:r>
       <w:r>
         <w:rPr>
           <w:rFonts w:ascii="Times New Roman" w:hAnsi="Times New Roman"/>
@@ -4995,12 +5453,13 @@
           <w:color w:val="000000"/>
           <w:sz w:val="28"/>
         </w:rPr>
-        <w:t>• Loki Server: Chỉ đánh chỉ mục (index) cho metadata nhãn mà không đánh chỉ mục toàn văn bản log, giúp tiết kiệm hơn 80% dung lượng RAM so với Elasticsearch.</w:t>
+        <w:t>Loki Server: Chỉ đánh chỉ mục (index) cho metadata nhãn mà không đánh chỉ mục toàn văn bản log, giúp tiết kiệm hơn 80% dung lượng RAM so với Elasticsearch.</w:t>
       </w:r>
     </w:p>
     <w:p>
       <w:pPr>
         <w:spacing w:before="120" w:after="40" w:line="312" w:lineRule="auto"/>
+        <w:ind w:firstLine="0"/>
         <w:jc w:val="left"/>
       </w:pPr>
       <w:r>
@@ -5041,6 +5500,7 @@
           <w:p>
             <w:pPr>
               <w:spacing w:before="80" w:after="80" w:line="300" w:lineRule="auto"/>
+              <w:ind w:firstLine="0"/>
               <w:jc w:val="center"/>
             </w:pPr>
             <w:r>
@@ -5062,6 +5522,7 @@
           <w:p>
             <w:pPr>
               <w:spacing w:before="80" w:after="80" w:line="300" w:lineRule="auto"/>
+              <w:ind w:firstLine="0"/>
               <w:jc w:val="center"/>
             </w:pPr>
             <w:r>
@@ -5083,6 +5544,7 @@
           <w:p>
             <w:pPr>
               <w:spacing w:before="80" w:after="80" w:line="300" w:lineRule="auto"/>
+              <w:ind w:firstLine="0"/>
               <w:jc w:val="center"/>
             </w:pPr>
             <w:r>
@@ -5106,6 +5568,7 @@
           <w:p>
             <w:pPr>
               <w:spacing w:before="60" w:after="60" w:line="300" w:lineRule="auto"/>
+              <w:ind w:firstLine="0"/>
               <w:jc w:val="center"/>
             </w:pPr>
             <w:r>
@@ -5127,6 +5590,7 @@
           <w:p>
             <w:pPr>
               <w:spacing w:before="60" w:after="60" w:line="300" w:lineRule="auto"/>
+              <w:ind w:firstLine="0"/>
               <w:jc w:val="left"/>
             </w:pPr>
             <w:r>
@@ -5148,7 +5612,8 @@
           <w:p>
             <w:pPr>
               <w:spacing w:before="60" w:after="60" w:line="300" w:lineRule="auto"/>
-              <w:jc w:val="center"/>
+              <w:ind w:firstLine="0"/>
+              <w:jc w:val="left"/>
             </w:pPr>
             <w:r>
               <w:rPr>
@@ -5171,6 +5636,7 @@
           <w:p>
             <w:pPr>
               <w:spacing w:before="60" w:after="60" w:line="300" w:lineRule="auto"/>
+              <w:ind w:firstLine="0"/>
               <w:jc w:val="center"/>
             </w:pPr>
             <w:r>
@@ -5192,6 +5658,7 @@
           <w:p>
             <w:pPr>
               <w:spacing w:before="60" w:after="60" w:line="300" w:lineRule="auto"/>
+              <w:ind w:firstLine="0"/>
               <w:jc w:val="left"/>
             </w:pPr>
             <w:r>
@@ -5213,7 +5680,8 @@
           <w:p>
             <w:pPr>
               <w:spacing w:before="60" w:after="60" w:line="300" w:lineRule="auto"/>
-              <w:jc w:val="center"/>
+              <w:ind w:firstLine="0"/>
+              <w:jc w:val="left"/>
             </w:pPr>
             <w:r>
               <w:rPr>
@@ -5236,6 +5704,7 @@
           <w:p>
             <w:pPr>
               <w:spacing w:before="60" w:after="60" w:line="300" w:lineRule="auto"/>
+              <w:ind w:firstLine="0"/>
               <w:jc w:val="center"/>
             </w:pPr>
             <w:r>
@@ -5257,6 +5726,7 @@
           <w:p>
             <w:pPr>
               <w:spacing w:before="60" w:after="60" w:line="300" w:lineRule="auto"/>
+              <w:ind w:firstLine="0"/>
               <w:jc w:val="left"/>
             </w:pPr>
             <w:r>
@@ -5278,7 +5748,8 @@
           <w:p>
             <w:pPr>
               <w:spacing w:before="60" w:after="60" w:line="300" w:lineRule="auto"/>
-              <w:jc w:val="center"/>
+              <w:ind w:firstLine="0"/>
+              <w:jc w:val="left"/>
             </w:pPr>
             <w:r>
               <w:rPr>
@@ -5296,13 +5767,14 @@
     </w:tbl>
     <w:p>
       <w:pPr>
-        <w:spacing w:before="80" w:after="200" w:line="324" w:lineRule="auto"/>
+        <w:spacing w:before="160" w:after="80" w:line="312" w:lineRule="auto"/>
+        <w:ind w:firstLine="0"/>
         <w:jc w:val="center"/>
       </w:pPr>
       <w:r>
         <w:rPr>
           <w:rFonts w:ascii="Times New Roman" w:hAnsi="Times New Roman"/>
-          <w:b w:val="0"/>
+          <w:b/>
           <w:i/>
           <w:color w:val="000000"/>
           <w:sz w:val="28"/>
@@ -5313,6 +5785,7 @@
     <w:p>
       <w:pPr>
         <w:spacing w:before="120" w:after="40" w:line="312" w:lineRule="auto"/>
+        <w:ind w:firstLine="0"/>
         <w:jc w:val="left"/>
       </w:pPr>
       <w:r>
@@ -5349,6 +5822,7 @@
           <w:p>
             <w:pPr>
               <w:spacing w:before="80" w:after="80" w:line="288" w:lineRule="auto"/>
+              <w:ind w:firstLine="0" w:left="170"/>
             </w:pPr>
             <w:r>
               <w:rPr>
@@ -5386,7 +5860,7 @@
     <w:p>
       <w:pPr>
         <w:spacing w:before="40" w:after="80" w:line="324" w:lineRule="auto"/>
-        <w:ind w:firstLine="720"/>
+        <w:ind w:firstLine="0"/>
         <w:jc w:val="both"/>
       </w:pPr>
     </w:p>
@@ -5398,6 +5872,7 @@
     <w:p>
       <w:pPr>
         <w:spacing w:before="280" w:after="160" w:line="312" w:lineRule="auto"/>
+        <w:ind w:firstLine="0"/>
         <w:jc w:val="center"/>
       </w:pPr>
       <w:r>
@@ -5414,6 +5889,7 @@
     <w:p>
       <w:pPr>
         <w:spacing w:before="200" w:after="80" w:line="312" w:lineRule="auto"/>
+        <w:ind w:firstLine="0"/>
         <w:jc w:val="left"/>
       </w:pPr>
       <w:r>
@@ -5446,10 +5922,20 @@
     </w:p>
     <w:p>
       <w:pPr>
-        <w:spacing w:before="60" w:after="60" w:line="324" w:lineRule="auto"/>
-        <w:ind w:firstLine="720"/>
+        <w:spacing w:before="50" w:after="50" w:line="324" w:lineRule="auto"/>
+        <w:ind w:left="720" w:hanging="283"/>
         <w:jc w:val="both"/>
       </w:pPr>
+      <w:r>
+        <w:rPr>
+          <w:rFonts w:ascii="Times New Roman" w:hAnsi="Times New Roman"/>
+          <w:b/>
+          <w:i w:val="0"/>
+          <w:color w:val="000000"/>
+          <w:sz w:val="28"/>
+        </w:rPr>
+        <w:t xml:space="preserve">1. </w:t>
+      </w:r>
       <w:r>
         <w:rPr>
           <w:rFonts w:ascii="Times New Roman" w:hAnsi="Times New Roman"/>
@@ -5458,15 +5944,25 @@
           <w:color w:val="000000"/>
           <w:sz w:val="28"/>
         </w:rPr>
-        <w:t>1. Chạy container dưới quyền Non-root User: Theo mặc định, Docker chạy dưới quyền root (UID 0). Nếu mã nguồn web dính lỗ hổng Remote Code Execution (RCE), kẻ tấn công có thể thoát khỏi container (Container Escape) và chiếm quyền root máy chủ. Trong file app/Dockerfile, hệ thống phân quyền sở hữu thư mục cho user node và khai báo chỉ thị USER node trước khi chạy máy chủ, loại trừ nguy cơ leo thang đặc quyền.</w:t>
+        <w:t>Chạy container dưới quyền Non-root User: Theo mặc định, Docker chạy dưới quyền root (UID 0). Nếu mã nguồn web dính lỗ hổng Remote Code Execution (RCE), kẻ tấn công có thể thoát khỏi container (Container Escape) và chiếm quyền root máy chủ. Trong file app/Dockerfile, hệ thống phân quyền sở hữu thư mục cho user node và khai báo chỉ thị USER node trước khi chạy máy chủ, loại trừ nguy cơ leo thang đặc quyền.</w:t>
       </w:r>
     </w:p>
     <w:p>
       <w:pPr>
-        <w:spacing w:before="60" w:after="60" w:line="324" w:lineRule="auto"/>
-        <w:ind w:firstLine="720"/>
+        <w:spacing w:before="50" w:after="50" w:line="324" w:lineRule="auto"/>
+        <w:ind w:left="720" w:hanging="283"/>
         <w:jc w:val="both"/>
       </w:pPr>
+      <w:r>
+        <w:rPr>
+          <w:rFonts w:ascii="Times New Roman" w:hAnsi="Times New Roman"/>
+          <w:b/>
+          <w:i w:val="0"/>
+          <w:color w:val="000000"/>
+          <w:sz w:val="28"/>
+        </w:rPr>
+        <w:t xml:space="preserve">2. </w:t>
+      </w:r>
       <w:r>
         <w:rPr>
           <w:rFonts w:ascii="Times New Roman" w:hAnsi="Times New Roman"/>
@@ -5475,15 +5971,25 @@
           <w:color w:val="000000"/>
           <w:sz w:val="28"/>
         </w:rPr>
-        <w:t>2. Phân tách mạng nội bộ (Network Isolation): Sử dụng 3 Docker Bridge Networks độc lập (frontend_net, backend_net, monitoring_net). Máy chủ CSDL MySQL chỉ nằm trong backend_net, không mở bất kỳ cổng ngoài nào trên Host (không có ports: 3306), ngăn chặn 100% các cuộc tấn công quét cổng hay brute-force mật khẩu từ Internet.</w:t>
+        <w:t>Phân tách mạng nội bộ (Network Isolation): Sử dụng 3 Docker Bridge Networks độc lập (frontend_net, backend_net, monitoring_net). Máy chủ CSDL MySQL chỉ nằm trong backend_net, không mở bất kỳ cổng ngoài nào trên Host (không có ports: 3306), ngăn chặn 100% các cuộc tấn công quét cổng hay brute-force mật khẩu từ Internet.</w:t>
       </w:r>
     </w:p>
     <w:p>
       <w:pPr>
-        <w:spacing w:before="60" w:after="60" w:line="324" w:lineRule="auto"/>
-        <w:ind w:firstLine="720"/>
+        <w:spacing w:before="50" w:after="50" w:line="324" w:lineRule="auto"/>
+        <w:ind w:left="720" w:hanging="283"/>
         <w:jc w:val="both"/>
       </w:pPr>
+      <w:r>
+        <w:rPr>
+          <w:rFonts w:ascii="Times New Roman" w:hAnsi="Times New Roman"/>
+          <w:b/>
+          <w:i w:val="0"/>
+          <w:color w:val="000000"/>
+          <w:sz w:val="28"/>
+        </w:rPr>
+        <w:t xml:space="preserve">3. </w:t>
+      </w:r>
       <w:r>
         <w:rPr>
           <w:rFonts w:ascii="Times New Roman" w:hAnsi="Times New Roman"/>
@@ -5492,15 +5998,25 @@
           <w:color w:val="000000"/>
           <w:sz w:val="28"/>
         </w:rPr>
-        <w:t>3. Quản lý biến môi trường an toàn qua tệp .env: Toàn bộ mật khẩu CSDL (Root, App user, Grafana admin) được đưa vào tệp .env riêng biệt, phân quyền bảo vệ và đưa vào .gitignore để tránh lộ lọt bí mật mã nguồn.</w:t>
+        <w:t>Quản lý biến môi trường an toàn qua tệp .env: Toàn bộ mật khẩu CSDL (Root, App user, Grafana admin) được đưa vào tệp .env riêng biệt, phân quyền bảo vệ và đưa vào .gitignore để tránh lộ lọt bí mật mã nguồn.</w:t>
       </w:r>
     </w:p>
     <w:p>
       <w:pPr>
-        <w:spacing w:before="60" w:after="60" w:line="324" w:lineRule="auto"/>
-        <w:ind w:firstLine="720"/>
+        <w:spacing w:before="50" w:after="50" w:line="324" w:lineRule="auto"/>
+        <w:ind w:left="720" w:hanging="283"/>
         <w:jc w:val="both"/>
       </w:pPr>
+      <w:r>
+        <w:rPr>
+          <w:rFonts w:ascii="Times New Roman" w:hAnsi="Times New Roman"/>
+          <w:b/>
+          <w:i w:val="0"/>
+          <w:color w:val="000000"/>
+          <w:sz w:val="28"/>
+        </w:rPr>
+        <w:t xml:space="preserve">4. </w:t>
+      </w:r>
       <w:r>
         <w:rPr>
           <w:rFonts w:ascii="Times New Roman" w:hAnsi="Times New Roman"/>
@@ -5509,15 +6025,25 @@
           <w:color w:val="000000"/>
           <w:sz w:val="28"/>
         </w:rPr>
-        <w:t>4. Giới hạn tài nguyên phần cứng (Resource Limits): Thiết lập giới hạn tối đa về CPU và bộ nhớ RAM cho từng container (app: 0.5 CPU, 350MB RAM; mysql: 0.75 CPU, 512MB RAM). Cơ chế này bảo vệ hệ thống không bị tê liệt (Denial of Service) khi một container gặp lỗi rò rỉ bộ nhớ (Memory Leak).</w:t>
+        <w:t>Giới hạn tài nguyên phần cứng (Resource Limits): Thiết lập giới hạn tối đa về CPU và bộ nhớ RAM cho từng container (app: 0.5 CPU, 350MB RAM; mysql: 0.75 CPU, 512MB RAM). Cơ chế này bảo vệ hệ thống không bị tê liệt (Denial of Service) khi một container gặp lỗi rò rỉ bộ nhớ (Memory Leak).</w:t>
       </w:r>
     </w:p>
     <w:p>
       <w:pPr>
-        <w:spacing w:before="60" w:after="60" w:line="324" w:lineRule="auto"/>
-        <w:ind w:firstLine="720"/>
+        <w:spacing w:before="50" w:after="50" w:line="324" w:lineRule="auto"/>
+        <w:ind w:left="720" w:hanging="283"/>
         <w:jc w:val="both"/>
       </w:pPr>
+      <w:r>
+        <w:rPr>
+          <w:rFonts w:ascii="Times New Roman" w:hAnsi="Times New Roman"/>
+          <w:b/>
+          <w:i w:val="0"/>
+          <w:color w:val="000000"/>
+          <w:sz w:val="28"/>
+        </w:rPr>
+        <w:t xml:space="preserve">5. </w:t>
+      </w:r>
       <w:r>
         <w:rPr>
           <w:rFonts w:ascii="Times New Roman" w:hAnsi="Times New Roman"/>
@@ -5526,12 +6052,13 @@
           <w:color w:val="000000"/>
           <w:sz w:val="28"/>
         </w:rPr>
-        <w:t>5. Áp dụng nguyên tắc đặc quyền tối thiểu trong CSDL (Database Least Privilege): Tài khoản ticket_user chỉ được cấp 3 quyền tối thiểu (SELECT, INSERT, UPDATE). Tuyệt đối không cấp các quyền nguy hiểm (DROP, ALTER, GRANT OPTION), vô hiệu hóa hoàn toàn ý đồ xóa sạch dữ liệu nếu chẳng may bị lỗi SQL Injection.</w:t>
+        <w:t>Áp dụng nguyên tắc đặc quyền tối thiểu trong CSDL (Database Least Privilege): Tài khoản ticket_user chỉ được cấp 3 quyền tối thiểu (SELECT, INSERT, UPDATE). Tuyệt đối không cấp các quyền nguy hiểm (DROP, ALTER, GRANT OPTION), vô hiệu hóa hoàn toàn ý đồ xóa sạch dữ liệu nếu chẳng may bị lỗi SQL Injection.</w:t>
       </w:r>
     </w:p>
     <w:p>
       <w:pPr>
         <w:spacing w:before="120" w:after="40" w:line="312" w:lineRule="auto"/>
+        <w:ind w:firstLine="0"/>
         <w:jc w:val="left"/>
       </w:pPr>
       <w:r>
@@ -5572,6 +6099,7 @@
           <w:p>
             <w:pPr>
               <w:spacing w:before="80" w:after="80" w:line="300" w:lineRule="auto"/>
+              <w:ind w:firstLine="0"/>
               <w:jc w:val="center"/>
             </w:pPr>
             <w:r>
@@ -5593,6 +6121,7 @@
           <w:p>
             <w:pPr>
               <w:spacing w:before="80" w:after="80" w:line="300" w:lineRule="auto"/>
+              <w:ind w:firstLine="0"/>
               <w:jc w:val="center"/>
             </w:pPr>
             <w:r>
@@ -5614,6 +6143,7 @@
           <w:p>
             <w:pPr>
               <w:spacing w:before="80" w:after="80" w:line="300" w:lineRule="auto"/>
+              <w:ind w:firstLine="0"/>
               <w:jc w:val="center"/>
             </w:pPr>
             <w:r>
@@ -5637,7 +6167,8 @@
           <w:p>
             <w:pPr>
               <w:spacing w:before="60" w:after="60" w:line="300" w:lineRule="auto"/>
-              <w:jc w:val="center"/>
+              <w:ind w:firstLine="0"/>
+              <w:jc w:val="left"/>
             </w:pPr>
             <w:r>
               <w:rPr>
@@ -5658,6 +6189,7 @@
           <w:p>
             <w:pPr>
               <w:spacing w:before="60" w:after="60" w:line="300" w:lineRule="auto"/>
+              <w:ind w:firstLine="0"/>
               <w:jc w:val="left"/>
             </w:pPr>
             <w:r>
@@ -5679,7 +6211,8 @@
           <w:p>
             <w:pPr>
               <w:spacing w:before="60" w:after="60" w:line="300" w:lineRule="auto"/>
-              <w:jc w:val="center"/>
+              <w:ind w:firstLine="0"/>
+              <w:jc w:val="left"/>
             </w:pPr>
             <w:r>
               <w:rPr>
@@ -5702,7 +6235,8 @@
           <w:p>
             <w:pPr>
               <w:spacing w:before="60" w:after="60" w:line="300" w:lineRule="auto"/>
-              <w:jc w:val="center"/>
+              <w:ind w:firstLine="0"/>
+              <w:jc w:val="left"/>
             </w:pPr>
             <w:r>
               <w:rPr>
@@ -5723,6 +6257,7 @@
           <w:p>
             <w:pPr>
               <w:spacing w:before="60" w:after="60" w:line="300" w:lineRule="auto"/>
+              <w:ind w:firstLine="0"/>
               <w:jc w:val="left"/>
             </w:pPr>
             <w:r>
@@ -5744,7 +6279,8 @@
           <w:p>
             <w:pPr>
               <w:spacing w:before="60" w:after="60" w:line="300" w:lineRule="auto"/>
-              <w:jc w:val="center"/>
+              <w:ind w:firstLine="0"/>
+              <w:jc w:val="left"/>
             </w:pPr>
             <w:r>
               <w:rPr>
@@ -5767,7 +6303,8 @@
           <w:p>
             <w:pPr>
               <w:spacing w:before="60" w:after="60" w:line="300" w:lineRule="auto"/>
-              <w:jc w:val="center"/>
+              <w:ind w:firstLine="0"/>
+              <w:jc w:val="left"/>
             </w:pPr>
             <w:r>
               <w:rPr>
@@ -5788,6 +6325,7 @@
           <w:p>
             <w:pPr>
               <w:spacing w:before="60" w:after="60" w:line="300" w:lineRule="auto"/>
+              <w:ind w:firstLine="0"/>
               <w:jc w:val="left"/>
             </w:pPr>
             <w:r>
@@ -5809,7 +6347,8 @@
           <w:p>
             <w:pPr>
               <w:spacing w:before="60" w:after="60" w:line="300" w:lineRule="auto"/>
-              <w:jc w:val="center"/>
+              <w:ind w:firstLine="0"/>
+              <w:jc w:val="left"/>
             </w:pPr>
             <w:r>
               <w:rPr>
@@ -5832,7 +6371,8 @@
           <w:p>
             <w:pPr>
               <w:spacing w:before="60" w:after="60" w:line="300" w:lineRule="auto"/>
-              <w:jc w:val="center"/>
+              <w:ind w:firstLine="0"/>
+              <w:jc w:val="left"/>
             </w:pPr>
             <w:r>
               <w:rPr>
@@ -5853,6 +6393,7 @@
           <w:p>
             <w:pPr>
               <w:spacing w:before="60" w:after="60" w:line="300" w:lineRule="auto"/>
+              <w:ind w:firstLine="0"/>
               <w:jc w:val="left"/>
             </w:pPr>
             <w:r>
@@ -5874,7 +6415,8 @@
           <w:p>
             <w:pPr>
               <w:spacing w:before="60" w:after="60" w:line="300" w:lineRule="auto"/>
-              <w:jc w:val="center"/>
+              <w:ind w:firstLine="0"/>
+              <w:jc w:val="left"/>
             </w:pPr>
             <w:r>
               <w:rPr>
@@ -5897,7 +6439,8 @@
           <w:p>
             <w:pPr>
               <w:spacing w:before="60" w:after="60" w:line="300" w:lineRule="auto"/>
-              <w:jc w:val="center"/>
+              <w:ind w:firstLine="0"/>
+              <w:jc w:val="left"/>
             </w:pPr>
             <w:r>
               <w:rPr>
@@ -5918,6 +6461,7 @@
           <w:p>
             <w:pPr>
               <w:spacing w:before="60" w:after="60" w:line="300" w:lineRule="auto"/>
+              <w:ind w:firstLine="0"/>
               <w:jc w:val="left"/>
             </w:pPr>
             <w:r>
@@ -5939,7 +6483,8 @@
           <w:p>
             <w:pPr>
               <w:spacing w:before="60" w:after="60" w:line="300" w:lineRule="auto"/>
-              <w:jc w:val="center"/>
+              <w:ind w:firstLine="0"/>
+              <w:jc w:val="left"/>
             </w:pPr>
             <w:r>
               <w:rPr>
@@ -5957,13 +6502,14 @@
     </w:tbl>
     <w:p>
       <w:pPr>
-        <w:spacing w:before="80" w:after="200" w:line="324" w:lineRule="auto"/>
+        <w:spacing w:before="160" w:after="80" w:line="312" w:lineRule="auto"/>
+        <w:ind w:firstLine="0"/>
         <w:jc w:val="center"/>
       </w:pPr>
       <w:r>
         <w:rPr>
           <w:rFonts w:ascii="Times New Roman" w:hAnsi="Times New Roman"/>
-          <w:b w:val="0"/>
+          <w:b/>
           <w:i/>
           <w:color w:val="000000"/>
           <w:sz w:val="28"/>
@@ -5979,6 +6525,7 @@
     <w:p>
       <w:pPr>
         <w:spacing w:before="280" w:after="160" w:line="312" w:lineRule="auto"/>
+        <w:ind w:firstLine="0"/>
         <w:jc w:val="center"/>
       </w:pPr>
       <w:r>
@@ -6011,10 +6558,20 @@
     </w:p>
     <w:p>
       <w:pPr>
-        <w:spacing w:before="60" w:after="60" w:line="324" w:lineRule="auto"/>
-        <w:ind w:firstLine="720"/>
+        <w:spacing w:before="50" w:after="50" w:line="324" w:lineRule="auto"/>
+        <w:ind w:left="720" w:hanging="283"/>
         <w:jc w:val="both"/>
       </w:pPr>
+      <w:r>
+        <w:rPr>
+          <w:rFonts w:ascii="Times New Roman" w:hAnsi="Times New Roman"/>
+          <w:b/>
+          <w:i w:val="0"/>
+          <w:color w:val="000000"/>
+          <w:sz w:val="28"/>
+        </w:rPr>
+        <w:t xml:space="preserve">1. </w:t>
+      </w:r>
       <w:r>
         <w:rPr>
           <w:rFonts w:ascii="Times New Roman" w:hAnsi="Times New Roman"/>
@@ -6023,15 +6580,25 @@
           <w:color w:val="000000"/>
           <w:sz w:val="28"/>
         </w:rPr>
-        <w:t>1. Xây dựng thành công ứng dụng Web Full-stack động hoàn chỉnh (Node.js/Express, EJS), CSDL MySQL 8.0 chuẩn 3NF, cơ chế chống đặt trùng ghế ACID Transaction (FOR UPDATE) và xuất vé điện tử kèm mã QR Code.</w:t>
+        <w:t>Xây dựng thành công ứng dụng Web Full-stack động hoàn chỉnh (Node.js/Express, EJS), CSDL MySQL 8.0 chuẩn 3NF, cơ chế chống đặt trùng ghế ACID Transaction (FOR UPDATE) và xuất vé điện tử kèm mã QR Code.</w:t>
       </w:r>
     </w:p>
     <w:p>
       <w:pPr>
-        <w:spacing w:before="60" w:after="60" w:line="324" w:lineRule="auto"/>
-        <w:ind w:firstLine="720"/>
+        <w:spacing w:before="50" w:after="50" w:line="324" w:lineRule="auto"/>
+        <w:ind w:left="720" w:hanging="283"/>
         <w:jc w:val="both"/>
       </w:pPr>
+      <w:r>
+        <w:rPr>
+          <w:rFonts w:ascii="Times New Roman" w:hAnsi="Times New Roman"/>
+          <w:b/>
+          <w:i w:val="0"/>
+          <w:color w:val="000000"/>
+          <w:sz w:val="28"/>
+        </w:rPr>
+        <w:t xml:space="preserve">2. </w:t>
+      </w:r>
       <w:r>
         <w:rPr>
           <w:rFonts w:ascii="Times New Roman" w:hAnsi="Times New Roman"/>
@@ -6040,15 +6607,25 @@
           <w:color w:val="000000"/>
           <w:sz w:val="28"/>
         </w:rPr>
-        <w:t>2. Đóng gói hệ thống đồng bộ qua Docker Compose với Nginx Reverse Proxy, cấu hình HTTPS tự ký cổng 443 và các tiêu đề Security Headers chuẩn.</w:t>
+        <w:t>Đóng gói hệ thống đồng bộ qua Docker Compose với Nginx Reverse Proxy, cấu hình HTTPS tự ký cổng 443 và các tiêu đề Security Headers chuẩn.</w:t>
       </w:r>
     </w:p>
     <w:p>
       <w:pPr>
-        <w:spacing w:before="60" w:after="60" w:line="324" w:lineRule="auto"/>
-        <w:ind w:firstLine="720"/>
+        <w:spacing w:before="50" w:after="50" w:line="324" w:lineRule="auto"/>
+        <w:ind w:left="720" w:hanging="283"/>
         <w:jc w:val="both"/>
       </w:pPr>
+      <w:r>
+        <w:rPr>
+          <w:rFonts w:ascii="Times New Roman" w:hAnsi="Times New Roman"/>
+          <w:b/>
+          <w:i w:val="0"/>
+          <w:color w:val="000000"/>
+          <w:sz w:val="28"/>
+        </w:rPr>
+        <w:t xml:space="preserve">3. </w:t>
+      </w:r>
       <w:r>
         <w:rPr>
           <w:rFonts w:ascii="Times New Roman" w:hAnsi="Times New Roman"/>
@@ -6057,15 +6634,25 @@
           <w:color w:val="000000"/>
           <w:sz w:val="28"/>
         </w:rPr>
-        <w:t>3. Tích hợp trọn vẹn cụm giám sát Prometheus + Grafana và hệ thống quản trị log tập trung Loki + Promtail, thực thi chính xác các câu truy vấn LogQL.</w:t>
+        <w:t>Tích hợp trọn vẹn cụm giám sát Prometheus + Grafana và hệ thống quản trị log tập trung Loki + Promtail, thực thi chính xác các câu truy vấn LogQL.</w:t>
       </w:r>
     </w:p>
     <w:p>
       <w:pPr>
-        <w:spacing w:before="60" w:after="60" w:line="324" w:lineRule="auto"/>
-        <w:ind w:firstLine="720"/>
+        <w:spacing w:before="50" w:after="50" w:line="324" w:lineRule="auto"/>
+        <w:ind w:left="720" w:hanging="283"/>
         <w:jc w:val="both"/>
       </w:pPr>
+      <w:r>
+        <w:rPr>
+          <w:rFonts w:ascii="Times New Roman" w:hAnsi="Times New Roman"/>
+          <w:b/>
+          <w:i w:val="0"/>
+          <w:color w:val="000000"/>
+          <w:sz w:val="28"/>
+        </w:rPr>
+        <w:t xml:space="preserve">4. </w:t>
+      </w:r>
       <w:r>
         <w:rPr>
           <w:rFonts w:ascii="Times New Roman" w:hAnsi="Times New Roman"/>
@@ -6074,12 +6661,13 @@
           <w:color w:val="000000"/>
           <w:sz w:val="28"/>
         </w:rPr>
-        <w:t>4. Áp dụng toàn diện 5 giải pháp Hardening an toàn bảo mật và đóng gói kịch bản khởi chạy 1-chạm RUN.bat thông minh với cơ chế Dual-Engine Fallback.</w:t>
+        <w:t>Áp dụng toàn diện 5 giải pháp Hardening an toàn bảo mật và đóng gói kịch bản khởi chạy 1-chạm RUN.bat thông minh với cơ chế Dual-Engine Fallback.</w:t>
       </w:r>
     </w:p>
     <w:p>
       <w:pPr>
         <w:spacing w:before="200" w:after="80" w:line="312" w:lineRule="auto"/>
+        <w:ind w:firstLine="0"/>
         <w:jc w:val="left"/>
       </w:pPr>
       <w:r>
@@ -6095,10 +6683,20 @@
     </w:p>
     <w:p>
       <w:pPr>
-        <w:spacing w:before="60" w:after="60" w:line="324" w:lineRule="auto"/>
-        <w:ind w:firstLine="720"/>
+        <w:spacing w:before="50" w:after="50" w:line="324" w:lineRule="auto"/>
+        <w:ind w:left="720" w:hanging="283"/>
         <w:jc w:val="both"/>
       </w:pPr>
+      <w:r>
+        <w:rPr>
+          <w:rFonts w:ascii="Times New Roman" w:hAnsi="Times New Roman"/>
+          <w:b/>
+          <w:i w:val="0"/>
+          <w:color w:val="000000"/>
+          <w:sz w:val="28"/>
+        </w:rPr>
+        <w:t xml:space="preserve">• </w:t>
+      </w:r>
       <w:r>
         <w:rPr>
           <w:rFonts w:ascii="Times New Roman" w:hAnsi="Times New Roman"/>
@@ -6107,15 +6705,25 @@
           <w:color w:val="000000"/>
           <w:sz w:val="28"/>
         </w:rPr>
-        <w:t>• Tích hợp hệ thống phát hiện xâm nhập thời gian thực (IDS/IPS) như Falco hoặc Snort trực tiếp vào Docker containers.</w:t>
+        <w:t>Tích hợp hệ thống phát hiện xâm nhập thời gian thực (IDS/IPS) như Falco hoặc Snort trực tiếp vào Docker containers.</w:t>
       </w:r>
     </w:p>
     <w:p>
       <w:pPr>
-        <w:spacing w:before="60" w:after="60" w:line="324" w:lineRule="auto"/>
-        <w:ind w:firstLine="720"/>
+        <w:spacing w:before="50" w:after="50" w:line="324" w:lineRule="auto"/>
+        <w:ind w:left="720" w:hanging="283"/>
         <w:jc w:val="both"/>
       </w:pPr>
+      <w:r>
+        <w:rPr>
+          <w:rFonts w:ascii="Times New Roman" w:hAnsi="Times New Roman"/>
+          <w:b/>
+          <w:i w:val="0"/>
+          <w:color w:val="000000"/>
+          <w:sz w:val="28"/>
+        </w:rPr>
+        <w:t xml:space="preserve">• </w:t>
+      </w:r>
       <w:r>
         <w:rPr>
           <w:rFonts w:ascii="Times New Roman" w:hAnsi="Times New Roman"/>
@@ -6124,15 +6732,25 @@
           <w:color w:val="000000"/>
           <w:sz w:val="28"/>
         </w:rPr>
-        <w:t>• Xây dựng quy trình tự động hóa kiểm thử và triển khai liên tục (CI/CD Pipeline) thông qua GitHub Actions.</w:t>
+        <w:t>Xây dựng quy trình tự động hóa kiểm thử và triển khai liên tục (CI/CD Pipeline) thông qua GitHub Actions.</w:t>
       </w:r>
     </w:p>
     <w:p>
       <w:pPr>
-        <w:spacing w:before="60" w:after="60" w:line="324" w:lineRule="auto"/>
-        <w:ind w:firstLine="720"/>
+        <w:spacing w:before="50" w:after="50" w:line="324" w:lineRule="auto"/>
+        <w:ind w:left="720" w:hanging="283"/>
         <w:jc w:val="both"/>
       </w:pPr>
+      <w:r>
+        <w:rPr>
+          <w:rFonts w:ascii="Times New Roman" w:hAnsi="Times New Roman"/>
+          <w:b/>
+          <w:i w:val="0"/>
+          <w:color w:val="000000"/>
+          <w:sz w:val="28"/>
+        </w:rPr>
+        <w:t xml:space="preserve">• </w:t>
+      </w:r>
       <w:r>
         <w:rPr>
           <w:rFonts w:ascii="Times New Roman" w:hAnsi="Times New Roman"/>
@@ -6141,7 +6759,7 @@
           <w:color w:val="000000"/>
           <w:sz w:val="28"/>
         </w:rPr>
-        <w:t>• Nâng cấp kiến trúc lên cụm Kubernetes (K8s) kết hợp hệ thống hàng đợi thông điệp RabbitMQ/Kafka để phục vụ các sự kiện bán vé quy mô lớn hàng chục ngàn người.</w:t>
+        <w:t>Nâng cấp kiến trúc lên cụm Kubernetes (K8s) kết hợp hệ thống hàng đợi thông điệp RabbitMQ/Kafka để phục vụ các sự kiện bán vé quy mô lớn hàng chục ngàn người.</w:t>
       </w:r>
     </w:p>
     <w:p>
@@ -6152,6 +6770,7 @@
     <w:p>
       <w:pPr>
         <w:spacing w:before="280" w:after="160" w:line="312" w:lineRule="auto"/>
+        <w:ind w:firstLine="0"/>
         <w:jc w:val="center"/>
       </w:pPr>
       <w:r>
@@ -6168,6 +6787,7 @@
     <w:p>
       <w:pPr>
         <w:spacing w:before="60" w:after="60" w:line="324" w:lineRule="auto"/>
+        <w:ind w:firstLine="0"/>
         <w:jc w:val="both"/>
       </w:pPr>
       <w:r>
@@ -6184,6 +6804,7 @@
     <w:p>
       <w:pPr>
         <w:spacing w:before="60" w:after="60" w:line="324" w:lineRule="auto"/>
+        <w:ind w:firstLine="0"/>
         <w:jc w:val="both"/>
       </w:pPr>
       <w:r>
@@ -6200,6 +6821,7 @@
     <w:p>
       <w:pPr>
         <w:spacing w:before="60" w:after="60" w:line="324" w:lineRule="auto"/>
+        <w:ind w:firstLine="0"/>
         <w:jc w:val="both"/>
       </w:pPr>
       <w:r>
@@ -6216,6 +6838,7 @@
     <w:p>
       <w:pPr>
         <w:spacing w:before="60" w:after="60" w:line="324" w:lineRule="auto"/>
+        <w:ind w:firstLine="0"/>
         <w:jc w:val="both"/>
       </w:pPr>
       <w:r>
@@ -6232,6 +6855,7 @@
     <w:p>
       <w:pPr>
         <w:spacing w:before="60" w:after="60" w:line="324" w:lineRule="auto"/>
+        <w:ind w:firstLine="0"/>
         <w:jc w:val="both"/>
       </w:pPr>
       <w:r>
@@ -6248,6 +6872,7 @@
     <w:p>
       <w:pPr>
         <w:spacing w:before="60" w:after="60" w:line="324" w:lineRule="auto"/>
+        <w:ind w:firstLine="0"/>
         <w:jc w:val="both"/>
       </w:pPr>
       <w:r>
@@ -6264,6 +6889,7 @@
     <w:p>
       <w:pPr>
         <w:spacing w:before="60" w:after="60" w:line="324" w:lineRule="auto"/>
+        <w:ind w:firstLine="0"/>
         <w:jc w:val="both"/>
       </w:pPr>
       <w:r>
@@ -6285,6 +6911,7 @@
     <w:p>
       <w:pPr>
         <w:spacing w:before="280" w:after="160" w:line="312" w:lineRule="auto"/>
+        <w:ind w:firstLine="0"/>
         <w:jc w:val="center"/>
       </w:pPr>
       <w:r>
@@ -6301,6 +6928,7 @@
     <w:p>
       <w:pPr>
         <w:spacing w:before="200" w:after="80" w:line="312" w:lineRule="auto"/>
+        <w:ind w:firstLine="0"/>
         <w:jc w:val="left"/>
       </w:pPr>
       <w:r>
@@ -6333,10 +6961,20 @@
     </w:p>
     <w:p>
       <w:pPr>
-        <w:spacing w:before="60" w:after="60" w:line="324" w:lineRule="auto"/>
-        <w:ind w:firstLine="720"/>
+        <w:spacing w:before="50" w:after="50" w:line="324" w:lineRule="auto"/>
+        <w:ind w:left="720" w:hanging="283"/>
         <w:jc w:val="both"/>
       </w:pPr>
+      <w:r>
+        <w:rPr>
+          <w:rFonts w:ascii="Times New Roman" w:hAnsi="Times New Roman"/>
+          <w:b/>
+          <w:i w:val="0"/>
+          <w:color w:val="000000"/>
+          <w:sz w:val="28"/>
+        </w:rPr>
+        <w:t xml:space="preserve">1. </w:t>
+      </w:r>
       <w:r>
         <w:rPr>
           <w:rFonts w:ascii="Times New Roman" w:hAnsi="Times New Roman"/>
@@ -6345,15 +6983,25 @@
           <w:color w:val="000000"/>
           <w:sz w:val="28"/>
         </w:rPr>
-        <w:t>1. Nhấp đúp chuột vào tệp RUN.bat.</w:t>
+        <w:t>Nhấp đúp chuột vào tệp RUN.bat.</w:t>
       </w:r>
     </w:p>
     <w:p>
       <w:pPr>
-        <w:spacing w:before="60" w:after="60" w:line="324" w:lineRule="auto"/>
-        <w:ind w:firstLine="720"/>
+        <w:spacing w:before="50" w:after="50" w:line="324" w:lineRule="auto"/>
+        <w:ind w:left="720" w:hanging="283"/>
         <w:jc w:val="both"/>
       </w:pPr>
+      <w:r>
+        <w:rPr>
+          <w:rFonts w:ascii="Times New Roman" w:hAnsi="Times New Roman"/>
+          <w:b/>
+          <w:i w:val="0"/>
+          <w:color w:val="000000"/>
+          <w:sz w:val="28"/>
+        </w:rPr>
+        <w:t xml:space="preserve">2. </w:t>
+      </w:r>
       <w:r>
         <w:rPr>
           <w:rFonts w:ascii="Times New Roman" w:hAnsi="Times New Roman"/>
@@ -6362,15 +7010,25 @@
           <w:color w:val="000000"/>
           <w:sz w:val="28"/>
         </w:rPr>
-        <w:t>2. Kịch bản tự động phát hiện môi trường: Nếu có Docker Desktop, khởi chạy tự động toàn bộ 6 container (Nginx, Node App, MySQL, Prometheus, Grafana, Loki) và tự động mở trình duyệt web tại https://localhost và http://localhost:8080.</w:t>
+        <w:t>Kịch bản tự động phát hiện môi trường: Nếu có Docker Desktop, khởi chạy tự động toàn bộ 6 container (Nginx, Node App, MySQL, Prometheus, Grafana, Loki) và tự động mở trình duyệt web tại https://localhost và http://localhost:8080.</w:t>
       </w:r>
     </w:p>
     <w:p>
       <w:pPr>
-        <w:spacing w:before="60" w:after="60" w:line="324" w:lineRule="auto"/>
-        <w:ind w:firstLine="720"/>
+        <w:spacing w:before="50" w:after="50" w:line="324" w:lineRule="auto"/>
+        <w:ind w:left="720" w:hanging="283"/>
         <w:jc w:val="both"/>
       </w:pPr>
+      <w:r>
+        <w:rPr>
+          <w:rFonts w:ascii="Times New Roman" w:hAnsi="Times New Roman"/>
+          <w:b/>
+          <w:i w:val="0"/>
+          <w:color w:val="000000"/>
+          <w:sz w:val="28"/>
+        </w:rPr>
+        <w:t xml:space="preserve">3. </w:t>
+      </w:r>
       <w:r>
         <w:rPr>
           <w:rFonts w:ascii="Times New Roman" w:hAnsi="Times New Roman"/>
@@ -6379,15 +7037,25 @@
           <w:color w:val="000000"/>
           <w:sz w:val="28"/>
         </w:rPr>
-        <w:t>3. Nếu máy chưa cài Docker, kịch bản tự động chuyển sang chế độ Dual-Engine In-Memory để khởi chạy ứng dụng tức thì tại http://localhost:3000.</w:t>
+        <w:t>Nếu máy chưa cài Docker, kịch bản tự động chuyển sang chế độ Dual-Engine In-Memory để khởi chạy ứng dụng tức thì tại http://localhost:3000.</w:t>
       </w:r>
     </w:p>
     <w:p>
       <w:pPr>
-        <w:spacing w:before="60" w:after="60" w:line="324" w:lineRule="auto"/>
-        <w:ind w:firstLine="720"/>
+        <w:spacing w:before="50" w:after="50" w:line="324" w:lineRule="auto"/>
+        <w:ind w:left="720" w:hanging="283"/>
         <w:jc w:val="both"/>
       </w:pPr>
+      <w:r>
+        <w:rPr>
+          <w:rFonts w:ascii="Times New Roman" w:hAnsi="Times New Roman"/>
+          <w:b/>
+          <w:i w:val="0"/>
+          <w:color w:val="000000"/>
+          <w:sz w:val="28"/>
+        </w:rPr>
+        <w:t xml:space="preserve">4. </w:t>
+      </w:r>
       <w:r>
         <w:rPr>
           <w:rFonts w:ascii="Times New Roman" w:hAnsi="Times New Roman"/>
@@ -6396,12 +7064,13 @@
           <w:color w:val="000000"/>
           <w:sz w:val="28"/>
         </w:rPr>
-        <w:t>4. Khi kết thúc buổi trình chiếu, nhấp đúp vào STOP.bat để dọn dẹp an toàn toàn bộ tiến trình.</w:t>
+        <w:t>Khi kết thúc buổi trình chiếu, nhấp đúp vào STOP.bat để dọn dẹp an toàn toàn bộ tiến trình.</w:t>
       </w:r>
     </w:p>
     <w:p>
       <w:pPr>
         <w:spacing w:before="200" w:after="80" w:line="312" w:lineRule="auto"/>
+        <w:ind w:firstLine="0"/>
         <w:jc w:val="left"/>
       </w:pPr>
       <w:r>
@@ -6434,10 +7103,20 @@
     </w:p>
     <w:p>
       <w:pPr>
-        <w:spacing w:before="60" w:after="60" w:line="324" w:lineRule="auto"/>
-        <w:ind w:firstLine="720"/>
+        <w:spacing w:before="50" w:after="50" w:line="324" w:lineRule="auto"/>
+        <w:ind w:left="720" w:hanging="283"/>
         <w:jc w:val="both"/>
       </w:pPr>
+      <w:r>
+        <w:rPr>
+          <w:rFonts w:ascii="Times New Roman" w:hAnsi="Times New Roman"/>
+          <w:b/>
+          <w:i w:val="0"/>
+          <w:color w:val="000000"/>
+          <w:sz w:val="28"/>
+        </w:rPr>
+        <w:t xml:space="preserve">• </w:t>
+      </w:r>
       <w:r>
         <w:rPr>
           <w:rFonts w:ascii="Times New Roman" w:hAnsi="Times New Roman"/>
@@ -6446,15 +7125,25 @@
           <w:color w:val="000000"/>
           <w:sz w:val="28"/>
         </w:rPr>
-        <w:t>• Commit 1 (Ngày 1): feat: initialize fullstack ticket booking app, mysql, phpmyadmin, and nginx reverse proxy with ssl</w:t>
+        <w:t>Commit 1 (Ngày 1): feat: initialize fullstack ticket booking app, mysql, phpmyadmin, and nginx reverse proxy with ssl</w:t>
       </w:r>
     </w:p>
     <w:p>
       <w:pPr>
-        <w:spacing w:before="60" w:after="60" w:line="324" w:lineRule="auto"/>
-        <w:ind w:firstLine="720"/>
+        <w:spacing w:before="50" w:after="50" w:line="324" w:lineRule="auto"/>
+        <w:ind w:left="720" w:hanging="283"/>
         <w:jc w:val="both"/>
       </w:pPr>
+      <w:r>
+        <w:rPr>
+          <w:rFonts w:ascii="Times New Roman" w:hAnsi="Times New Roman"/>
+          <w:b/>
+          <w:i w:val="0"/>
+          <w:color w:val="000000"/>
+          <w:sz w:val="28"/>
+        </w:rPr>
+        <w:t xml:space="preserve">• </w:t>
+      </w:r>
       <w:r>
         <w:rPr>
           <w:rFonts w:ascii="Times New Roman" w:hAnsi="Times New Roman"/>
@@ -6463,15 +7152,25 @@
           <w:color w:val="000000"/>
           <w:sz w:val="28"/>
         </w:rPr>
-        <w:t>• Commit 2 (Ngày 2): feat: integrate prometheus and grafana monitoring stack with cadvisor and database metrics</w:t>
+        <w:t>Commit 2 (Ngày 2): feat: integrate prometheus and grafana monitoring stack with cadvisor and database metrics</w:t>
       </w:r>
     </w:p>
     <w:p>
       <w:pPr>
-        <w:spacing w:before="60" w:after="60" w:line="324" w:lineRule="auto"/>
-        <w:ind w:firstLine="720"/>
+        <w:spacing w:before="50" w:after="50" w:line="324" w:lineRule="auto"/>
+        <w:ind w:left="720" w:hanging="283"/>
         <w:jc w:val="both"/>
       </w:pPr>
+      <w:r>
+        <w:rPr>
+          <w:rFonts w:ascii="Times New Roman" w:hAnsi="Times New Roman"/>
+          <w:b/>
+          <w:i w:val="0"/>
+          <w:color w:val="000000"/>
+          <w:sz w:val="28"/>
+        </w:rPr>
+        <w:t xml:space="preserve">• </w:t>
+      </w:r>
       <w:r>
         <w:rPr>
           <w:rFonts w:ascii="Times New Roman" w:hAnsi="Times New Roman"/>
@@ -6480,7 +7179,7 @@
           <w:color w:val="000000"/>
           <w:sz w:val="28"/>
         </w:rPr>
-        <w:t>• Commit 3 (Ngày 3): feat: implement centralized logging with loki, promtail and apply system hardening</w:t>
+        <w:t>Commit 3 (Ngày 3): feat: implement centralized logging with loki, promtail and apply system hardening</w:t>
       </w:r>
     </w:p>
     <w:sectPr>

</xml_diff>